<commit_message>
Update Relatório da Pesquisa.docx
</commit_message>
<xml_diff>
--- a/resultados/Relatório da Pesquisa.docx
+++ b/resultados/Relatório da Pesquisa.docx
@@ -515,7 +515,6 @@
           <w:docPartUnique/>
         </w:docPartObj>
       </w:sdtPr>
-      <w:sdtEndPr/>
       <w:sdtContent>
         <w:p>
           <w:pPr>
@@ -3944,8 +3943,8 @@
         <w:t>EFERENCIAL TEÓRICO</w:t>
       </w:r>
       <w:bookmarkStart w:id="11" w:name="_vvo1l2a27t" w:colFirst="0" w:colLast="0"/>
+      <w:bookmarkEnd w:id="10"/>
       <w:bookmarkEnd w:id="11"/>
-      <w:bookmarkEnd w:id="10"/>
     </w:p>
     <w:p>
       <w:pPr>
@@ -4704,23 +4703,7 @@
           <w:rFonts w:eastAsia="Times New Roman" w:cs="Times New Roman"/>
           <w:szCs w:val="24"/>
         </w:rPr>
-        <w:t xml:space="preserve">Adolescente (14-17), Jovem (18-24) </w:t>
-      </w:r>
-      <w:proofErr w:type="gramStart"/>
-      <w:r>
-        <w:rPr>
-          <w:rFonts w:eastAsia="Times New Roman" w:cs="Times New Roman"/>
-          <w:szCs w:val="24"/>
-        </w:rPr>
-        <w:t>e Jovem</w:t>
-      </w:r>
-      <w:proofErr w:type="gramEnd"/>
-      <w:r>
-        <w:rPr>
-          <w:rFonts w:eastAsia="Times New Roman" w:cs="Times New Roman"/>
-          <w:szCs w:val="24"/>
-        </w:rPr>
-        <w:t xml:space="preserve"> adulto (25-29).</w:t>
+        <w:t>Adolescente (14-17), Jovem (18-24) e Jovem adulto (25-29).</w:t>
       </w:r>
     </w:p>
     <w:p>
@@ -4980,15 +4963,7 @@
       </w:r>
       <w:proofErr w:type="spellEnd"/>
       <w:r>
-        <w:t xml:space="preserve">-pandemia (2019), </w:t>
-      </w:r>
-      <w:proofErr w:type="gramStart"/>
-      <w:r>
-        <w:t>Durante</w:t>
-      </w:r>
-      <w:proofErr w:type="gramEnd"/>
-      <w:r>
-        <w:t xml:space="preserve"> pandemia (2020-2021) e Pós-pandemia (202</w:t>
+        <w:t>-pandemia (2019), Durante pandemia (2020-2021) e Pós-pandemia (202</w:t>
       </w:r>
       <w:r>
         <w:t>2).</w:t>
@@ -5442,15 +5417,7 @@
         </m:sSub>
       </m:oMath>
       <w:r>
-        <w:t xml:space="preserve">: vetor de características individuais (sexo, cor ou raça, </w:t>
-      </w:r>
-      <w:proofErr w:type="gramStart"/>
-      <w:r>
-        <w:t>escolaridade, etc.</w:t>
-      </w:r>
-      <w:proofErr w:type="gramEnd"/>
-      <w:r>
-        <w:t xml:space="preserve">) no tempo </w:t>
+        <w:t xml:space="preserve">: vetor de características individuais (sexo, cor ou raça, escolaridade, etc.) no tempo </w:t>
       </w:r>
       <w:r>
         <w:rPr>
@@ -5625,13 +5592,7 @@
             <w:rPr>
               <w:rFonts w:ascii="Cambria Math" w:hAnsi="Cambria Math"/>
             </w:rPr>
-            <m:t>=</m:t>
-          </m:r>
-          <m:r>
-            <w:rPr>
-              <w:rFonts w:ascii="Cambria Math" w:hAnsi="Cambria Math"/>
-            </w:rPr>
-            <m:t>periodo</m:t>
+            <m:t>=periodo</m:t>
           </m:r>
           <m:r>
             <m:rPr>
@@ -8127,13 +8088,7 @@
                 <w:rPr>
                   <w:rFonts w:ascii="Cambria Math" w:hAnsi="Cambria Math"/>
                 </w:rPr>
-                <m:t>1-</m:t>
-              </m:r>
-              <m:r>
-                <w:rPr>
-                  <w:rFonts w:ascii="Cambria Math" w:hAnsi="Cambria Math"/>
-                </w:rPr>
-                <m:t>α</m:t>
+                <m:t>1-α</m:t>
               </m:r>
             </m:sup>
           </m:sSup>
@@ -8144,16 +8099,7 @@
             <w:rPr>
               <w:rFonts w:ascii="Cambria Math" w:hAnsi="Cambria Math"/>
             </w:rPr>
-            <m:t xml:space="preserve"> </m:t>
-          </m:r>
-          <m:r>
-            <m:rPr>
-              <m:sty m:val="p"/>
-            </m:rPr>
-            <w:rPr>
-              <w:rFonts w:ascii="Cambria Math" w:hAnsi="Cambria Math"/>
-            </w:rPr>
-            <m:t>→</m:t>
+            <m:t xml:space="preserve"> →</m:t>
           </m:r>
           <m:r>
             <w:rPr>
@@ -8221,13 +8167,7 @@
                 <w:rPr>
                   <w:rFonts w:ascii="Cambria Math" w:hAnsi="Cambria Math"/>
                 </w:rPr>
-                <m:t>1-</m:t>
-              </m:r>
-              <m:r>
-                <w:rPr>
-                  <w:rFonts w:ascii="Cambria Math" w:hAnsi="Cambria Math"/>
-                </w:rPr>
-                <m:t>α</m:t>
+                <m:t>1-α</m:t>
               </m:r>
             </m:sup>
           </m:sSup>
@@ -9281,12 +9221,6 @@
     <w:p>
       <w:pPr>
         <w:pStyle w:val="PargrafodaLista"/>
-        <w:numPr>
-          <w:ilvl w:val="0"/>
-          <w:numId w:val="40"/>
-        </w:numPr>
-        <w:spacing w:line="360" w:lineRule="auto"/>
-        <w:jc w:val="both"/>
         <w:rPr>
           <w:rFonts w:eastAsia="Times New Roman" w:cs="Times New Roman"/>
           <w:szCs w:val="24"/>
@@ -9935,7 +9869,6 @@
                     <w:bottom w:val="single" w:sz="12" w:space="0" w:color="auto"/>
                     <w:right w:val="nil"/>
                   </w:tcBorders>
-                  <w:shd w:val="clear" w:color="auto" w:fill="auto"/>
                   <w:noWrap/>
                   <w:vAlign w:val="bottom"/>
                   <w:hideMark/>
@@ -10003,7 +9936,6 @@
                     <w:bottom w:val="nil"/>
                     <w:right w:val="nil"/>
                   </w:tcBorders>
-                  <w:shd w:val="clear" w:color="auto" w:fill="auto"/>
                   <w:noWrap/>
                   <w:vAlign w:val="bottom"/>
                   <w:hideMark/>
@@ -10042,7 +9974,6 @@
                     <w:bottom w:val="double" w:sz="6" w:space="0" w:color="auto"/>
                     <w:right w:val="nil"/>
                   </w:tcBorders>
-                  <w:shd w:val="clear" w:color="auto" w:fill="auto"/>
                   <w:noWrap/>
                   <w:vAlign w:val="bottom"/>
                   <w:hideMark/>
@@ -10094,7 +10025,6 @@
                     <w:bottom w:val="double" w:sz="6" w:space="0" w:color="auto"/>
                     <w:right w:val="nil"/>
                   </w:tcBorders>
-                  <w:shd w:val="clear" w:color="auto" w:fill="auto"/>
                   <w:noWrap/>
                   <w:vAlign w:val="bottom"/>
                   <w:hideMark/>
@@ -10146,7 +10076,6 @@
                     <w:bottom w:val="double" w:sz="6" w:space="0" w:color="auto"/>
                     <w:right w:val="nil"/>
                   </w:tcBorders>
-                  <w:shd w:val="clear" w:color="auto" w:fill="auto"/>
                   <w:noWrap/>
                   <w:vAlign w:val="bottom"/>
                   <w:hideMark/>
@@ -10198,7 +10127,6 @@
                     <w:bottom w:val="nil"/>
                     <w:right w:val="nil"/>
                   </w:tcBorders>
-                  <w:shd w:val="clear" w:color="auto" w:fill="auto"/>
                   <w:noWrap/>
                   <w:vAlign w:val="bottom"/>
                   <w:hideMark/>
@@ -10237,7 +10165,6 @@
                     <w:bottom w:val="nil"/>
                     <w:right w:val="nil"/>
                   </w:tcBorders>
-                  <w:shd w:val="clear" w:color="auto" w:fill="auto"/>
                   <w:noWrap/>
                   <w:vAlign w:val="bottom"/>
                   <w:hideMark/>
@@ -10281,7 +10208,6 @@
                     <w:bottom w:val="nil"/>
                     <w:right w:val="nil"/>
                   </w:tcBorders>
-                  <w:shd w:val="clear" w:color="auto" w:fill="auto"/>
                   <w:noWrap/>
                   <w:vAlign w:val="bottom"/>
                   <w:hideMark/>
@@ -10316,7 +10242,6 @@
                     <w:bottom w:val="nil"/>
                     <w:right w:val="nil"/>
                   </w:tcBorders>
-                  <w:shd w:val="clear" w:color="auto" w:fill="auto"/>
                   <w:noWrap/>
                   <w:vAlign w:val="bottom"/>
                   <w:hideMark/>
@@ -10352,7 +10277,6 @@
                     <w:bottom w:val="nil"/>
                     <w:right w:val="nil"/>
                   </w:tcBorders>
-                  <w:shd w:val="clear" w:color="auto" w:fill="auto"/>
                   <w:noWrap/>
                   <w:vAlign w:val="bottom"/>
                   <w:hideMark/>
@@ -10388,7 +10312,6 @@
                     <w:bottom w:val="nil"/>
                     <w:right w:val="nil"/>
                   </w:tcBorders>
-                  <w:shd w:val="clear" w:color="auto" w:fill="auto"/>
                   <w:noWrap/>
                   <w:vAlign w:val="bottom"/>
                   <w:hideMark/>
@@ -10424,7 +10347,6 @@
                     <w:bottom w:val="nil"/>
                     <w:right w:val="nil"/>
                   </w:tcBorders>
-                  <w:shd w:val="clear" w:color="auto" w:fill="auto"/>
                   <w:noWrap/>
                   <w:vAlign w:val="bottom"/>
                   <w:hideMark/>
@@ -10460,7 +10382,6 @@
                     <w:bottom w:val="nil"/>
                     <w:right w:val="nil"/>
                   </w:tcBorders>
-                  <w:shd w:val="clear" w:color="auto" w:fill="auto"/>
                   <w:noWrap/>
                   <w:vAlign w:val="bottom"/>
                   <w:hideMark/>
@@ -10501,7 +10422,6 @@
                     <w:bottom w:val="nil"/>
                     <w:right w:val="nil"/>
                   </w:tcBorders>
-                  <w:shd w:val="clear" w:color="auto" w:fill="auto"/>
                   <w:noWrap/>
                   <w:vAlign w:val="bottom"/>
                   <w:hideMark/>
@@ -10536,7 +10456,6 @@
                     <w:bottom w:val="nil"/>
                     <w:right w:val="nil"/>
                   </w:tcBorders>
-                  <w:shd w:val="clear" w:color="auto" w:fill="auto"/>
                   <w:noWrap/>
                   <w:vAlign w:val="bottom"/>
                   <w:hideMark/>
@@ -10572,7 +10491,6 @@
                     <w:bottom w:val="nil"/>
                     <w:right w:val="nil"/>
                   </w:tcBorders>
-                  <w:shd w:val="clear" w:color="auto" w:fill="auto"/>
                   <w:noWrap/>
                   <w:vAlign w:val="bottom"/>
                   <w:hideMark/>
@@ -10608,7 +10526,6 @@
                     <w:bottom w:val="nil"/>
                     <w:right w:val="nil"/>
                   </w:tcBorders>
-                  <w:shd w:val="clear" w:color="auto" w:fill="auto"/>
                   <w:noWrap/>
                   <w:vAlign w:val="bottom"/>
                   <w:hideMark/>
@@ -10644,7 +10561,6 @@
                     <w:bottom w:val="nil"/>
                     <w:right w:val="nil"/>
                   </w:tcBorders>
-                  <w:shd w:val="clear" w:color="auto" w:fill="auto"/>
                   <w:noWrap/>
                   <w:vAlign w:val="bottom"/>
                   <w:hideMark/>
@@ -10680,7 +10596,6 @@
                     <w:bottom w:val="nil"/>
                     <w:right w:val="nil"/>
                   </w:tcBorders>
-                  <w:shd w:val="clear" w:color="auto" w:fill="auto"/>
                   <w:noWrap/>
                   <w:vAlign w:val="bottom"/>
                   <w:hideMark/>
@@ -10721,7 +10636,6 @@
                     <w:bottom w:val="nil"/>
                     <w:right w:val="nil"/>
                   </w:tcBorders>
-                  <w:shd w:val="clear" w:color="auto" w:fill="auto"/>
                   <w:noWrap/>
                   <w:vAlign w:val="bottom"/>
                   <w:hideMark/>
@@ -10756,7 +10670,6 @@
                     <w:bottom w:val="nil"/>
                     <w:right w:val="nil"/>
                   </w:tcBorders>
-                  <w:shd w:val="clear" w:color="auto" w:fill="auto"/>
                   <w:noWrap/>
                   <w:vAlign w:val="bottom"/>
                   <w:hideMark/>
@@ -10792,7 +10705,6 @@
                     <w:bottom w:val="nil"/>
                     <w:right w:val="nil"/>
                   </w:tcBorders>
-                  <w:shd w:val="clear" w:color="auto" w:fill="auto"/>
                   <w:noWrap/>
                   <w:vAlign w:val="bottom"/>
                   <w:hideMark/>
@@ -10828,7 +10740,6 @@
                     <w:bottom w:val="nil"/>
                     <w:right w:val="nil"/>
                   </w:tcBorders>
-                  <w:shd w:val="clear" w:color="auto" w:fill="auto"/>
                   <w:noWrap/>
                   <w:vAlign w:val="bottom"/>
                   <w:hideMark/>
@@ -10864,7 +10775,6 @@
                     <w:bottom w:val="nil"/>
                     <w:right w:val="nil"/>
                   </w:tcBorders>
-                  <w:shd w:val="clear" w:color="auto" w:fill="auto"/>
                   <w:noWrap/>
                   <w:vAlign w:val="bottom"/>
                   <w:hideMark/>
@@ -10900,7 +10810,6 @@
                     <w:bottom w:val="nil"/>
                     <w:right w:val="nil"/>
                   </w:tcBorders>
-                  <w:shd w:val="clear" w:color="auto" w:fill="auto"/>
                   <w:noWrap/>
                   <w:vAlign w:val="bottom"/>
                   <w:hideMark/>
@@ -10941,7 +10850,6 @@
                     <w:bottom w:val="nil"/>
                     <w:right w:val="nil"/>
                   </w:tcBorders>
-                  <w:shd w:val="clear" w:color="auto" w:fill="auto"/>
                   <w:noWrap/>
                   <w:vAlign w:val="bottom"/>
                   <w:hideMark/>
@@ -10976,7 +10884,6 @@
                     <w:bottom w:val="nil"/>
                     <w:right w:val="nil"/>
                   </w:tcBorders>
-                  <w:shd w:val="clear" w:color="auto" w:fill="auto"/>
                   <w:noWrap/>
                   <w:vAlign w:val="bottom"/>
                   <w:hideMark/>
@@ -11012,7 +10919,6 @@
                     <w:bottom w:val="nil"/>
                     <w:right w:val="nil"/>
                   </w:tcBorders>
-                  <w:shd w:val="clear" w:color="auto" w:fill="auto"/>
                   <w:noWrap/>
                   <w:vAlign w:val="bottom"/>
                   <w:hideMark/>
@@ -11048,7 +10954,6 @@
                     <w:bottom w:val="nil"/>
                     <w:right w:val="nil"/>
                   </w:tcBorders>
-                  <w:shd w:val="clear" w:color="auto" w:fill="auto"/>
                   <w:noWrap/>
                   <w:vAlign w:val="bottom"/>
                   <w:hideMark/>
@@ -11084,7 +10989,6 @@
                     <w:bottom w:val="nil"/>
                     <w:right w:val="nil"/>
                   </w:tcBorders>
-                  <w:shd w:val="clear" w:color="auto" w:fill="auto"/>
                   <w:noWrap/>
                   <w:vAlign w:val="bottom"/>
                   <w:hideMark/>
@@ -11120,7 +11024,6 @@
                     <w:bottom w:val="nil"/>
                     <w:right w:val="nil"/>
                   </w:tcBorders>
-                  <w:shd w:val="clear" w:color="auto" w:fill="auto"/>
                   <w:noWrap/>
                   <w:vAlign w:val="bottom"/>
                   <w:hideMark/>
@@ -11161,7 +11064,6 @@
                     <w:bottom w:val="nil"/>
                     <w:right w:val="nil"/>
                   </w:tcBorders>
-                  <w:shd w:val="clear" w:color="auto" w:fill="auto"/>
                   <w:noWrap/>
                   <w:vAlign w:val="bottom"/>
                   <w:hideMark/>
@@ -11196,7 +11098,6 @@
                     <w:bottom w:val="nil"/>
                     <w:right w:val="nil"/>
                   </w:tcBorders>
-                  <w:shd w:val="clear" w:color="auto" w:fill="auto"/>
                   <w:noWrap/>
                   <w:vAlign w:val="bottom"/>
                   <w:hideMark/>
@@ -11232,7 +11133,6 @@
                     <w:bottom w:val="nil"/>
                     <w:right w:val="nil"/>
                   </w:tcBorders>
-                  <w:shd w:val="clear" w:color="auto" w:fill="auto"/>
                   <w:noWrap/>
                   <w:vAlign w:val="bottom"/>
                   <w:hideMark/>
@@ -11268,7 +11168,6 @@
                     <w:bottom w:val="nil"/>
                     <w:right w:val="nil"/>
                   </w:tcBorders>
-                  <w:shd w:val="clear" w:color="auto" w:fill="auto"/>
                   <w:noWrap/>
                   <w:vAlign w:val="bottom"/>
                   <w:hideMark/>
@@ -11304,7 +11203,6 @@
                     <w:bottom w:val="nil"/>
                     <w:right w:val="nil"/>
                   </w:tcBorders>
-                  <w:shd w:val="clear" w:color="auto" w:fill="auto"/>
                   <w:noWrap/>
                   <w:vAlign w:val="bottom"/>
                   <w:hideMark/>
@@ -11340,7 +11238,6 @@
                     <w:bottom w:val="nil"/>
                     <w:right w:val="nil"/>
                   </w:tcBorders>
-                  <w:shd w:val="clear" w:color="auto" w:fill="auto"/>
                   <w:noWrap/>
                   <w:vAlign w:val="bottom"/>
                   <w:hideMark/>
@@ -11381,7 +11278,6 @@
                     <w:bottom w:val="nil"/>
                     <w:right w:val="nil"/>
                   </w:tcBorders>
-                  <w:shd w:val="clear" w:color="auto" w:fill="auto"/>
                   <w:noWrap/>
                   <w:vAlign w:val="bottom"/>
                   <w:hideMark/>
@@ -11416,7 +11312,6 @@
                     <w:bottom w:val="nil"/>
                     <w:right w:val="nil"/>
                   </w:tcBorders>
-                  <w:shd w:val="clear" w:color="auto" w:fill="auto"/>
                   <w:noWrap/>
                   <w:vAlign w:val="bottom"/>
                   <w:hideMark/>
@@ -11452,7 +11347,6 @@
                     <w:bottom w:val="nil"/>
                     <w:right w:val="nil"/>
                   </w:tcBorders>
-                  <w:shd w:val="clear" w:color="auto" w:fill="auto"/>
                   <w:noWrap/>
                   <w:vAlign w:val="bottom"/>
                   <w:hideMark/>
@@ -11488,7 +11382,6 @@
                     <w:bottom w:val="nil"/>
                     <w:right w:val="nil"/>
                   </w:tcBorders>
-                  <w:shd w:val="clear" w:color="auto" w:fill="auto"/>
                   <w:noWrap/>
                   <w:vAlign w:val="bottom"/>
                   <w:hideMark/>
@@ -11524,7 +11417,6 @@
                     <w:bottom w:val="nil"/>
                     <w:right w:val="nil"/>
                   </w:tcBorders>
-                  <w:shd w:val="clear" w:color="auto" w:fill="auto"/>
                   <w:noWrap/>
                   <w:vAlign w:val="bottom"/>
                   <w:hideMark/>
@@ -11560,7 +11452,6 @@
                     <w:bottom w:val="nil"/>
                     <w:right w:val="nil"/>
                   </w:tcBorders>
-                  <w:shd w:val="clear" w:color="auto" w:fill="auto"/>
                   <w:noWrap/>
                   <w:vAlign w:val="bottom"/>
                   <w:hideMark/>
@@ -11601,7 +11492,6 @@
                     <w:bottom w:val="nil"/>
                     <w:right w:val="nil"/>
                   </w:tcBorders>
-                  <w:shd w:val="clear" w:color="auto" w:fill="auto"/>
                   <w:noWrap/>
                   <w:vAlign w:val="bottom"/>
                   <w:hideMark/>
@@ -11636,7 +11526,6 @@
                     <w:bottom w:val="nil"/>
                     <w:right w:val="nil"/>
                   </w:tcBorders>
-                  <w:shd w:val="clear" w:color="auto" w:fill="auto"/>
                   <w:noWrap/>
                   <w:vAlign w:val="bottom"/>
                   <w:hideMark/>
@@ -11672,7 +11561,6 @@
                     <w:bottom w:val="nil"/>
                     <w:right w:val="nil"/>
                   </w:tcBorders>
-                  <w:shd w:val="clear" w:color="auto" w:fill="auto"/>
                   <w:noWrap/>
                   <w:vAlign w:val="bottom"/>
                   <w:hideMark/>
@@ -11708,7 +11596,6 @@
                     <w:bottom w:val="nil"/>
                     <w:right w:val="nil"/>
                   </w:tcBorders>
-                  <w:shd w:val="clear" w:color="auto" w:fill="auto"/>
                   <w:noWrap/>
                   <w:vAlign w:val="bottom"/>
                   <w:hideMark/>
@@ -11744,7 +11631,6 @@
                     <w:bottom w:val="nil"/>
                     <w:right w:val="nil"/>
                   </w:tcBorders>
-                  <w:shd w:val="clear" w:color="auto" w:fill="auto"/>
                   <w:noWrap/>
                   <w:vAlign w:val="bottom"/>
                   <w:hideMark/>
@@ -11780,7 +11666,6 @@
                     <w:bottom w:val="nil"/>
                     <w:right w:val="nil"/>
                   </w:tcBorders>
-                  <w:shd w:val="clear" w:color="auto" w:fill="auto"/>
                   <w:noWrap/>
                   <w:vAlign w:val="bottom"/>
                   <w:hideMark/>
@@ -11821,7 +11706,6 @@
                     <w:bottom w:val="nil"/>
                     <w:right w:val="nil"/>
                   </w:tcBorders>
-                  <w:shd w:val="clear" w:color="auto" w:fill="auto"/>
                   <w:noWrap/>
                   <w:vAlign w:val="bottom"/>
                   <w:hideMark/>
@@ -11856,7 +11740,6 @@
                     <w:bottom w:val="nil"/>
                     <w:right w:val="nil"/>
                   </w:tcBorders>
-                  <w:shd w:val="clear" w:color="auto" w:fill="auto"/>
                   <w:noWrap/>
                   <w:vAlign w:val="bottom"/>
                   <w:hideMark/>
@@ -11892,7 +11775,6 @@
                     <w:bottom w:val="nil"/>
                     <w:right w:val="nil"/>
                   </w:tcBorders>
-                  <w:shd w:val="clear" w:color="auto" w:fill="auto"/>
                   <w:noWrap/>
                   <w:vAlign w:val="bottom"/>
                   <w:hideMark/>
@@ -11928,7 +11810,6 @@
                     <w:bottom w:val="nil"/>
                     <w:right w:val="nil"/>
                   </w:tcBorders>
-                  <w:shd w:val="clear" w:color="auto" w:fill="auto"/>
                   <w:noWrap/>
                   <w:vAlign w:val="bottom"/>
                   <w:hideMark/>
@@ -11964,7 +11845,6 @@
                     <w:bottom w:val="nil"/>
                     <w:right w:val="nil"/>
                   </w:tcBorders>
-                  <w:shd w:val="clear" w:color="auto" w:fill="auto"/>
                   <w:noWrap/>
                   <w:vAlign w:val="bottom"/>
                   <w:hideMark/>
@@ -12000,7 +11880,6 @@
                     <w:bottom w:val="nil"/>
                     <w:right w:val="nil"/>
                   </w:tcBorders>
-                  <w:shd w:val="clear" w:color="auto" w:fill="auto"/>
                   <w:noWrap/>
                   <w:vAlign w:val="bottom"/>
                   <w:hideMark/>
@@ -12041,7 +11920,6 @@
                     <w:bottom w:val="nil"/>
                     <w:right w:val="nil"/>
                   </w:tcBorders>
-                  <w:shd w:val="clear" w:color="auto" w:fill="auto"/>
                   <w:noWrap/>
                   <w:vAlign w:val="bottom"/>
                   <w:hideMark/>
@@ -12076,7 +11954,6 @@
                     <w:bottom w:val="nil"/>
                     <w:right w:val="nil"/>
                   </w:tcBorders>
-                  <w:shd w:val="clear" w:color="auto" w:fill="auto"/>
                   <w:noWrap/>
                   <w:vAlign w:val="bottom"/>
                   <w:hideMark/>
@@ -12112,7 +11989,6 @@
                     <w:bottom w:val="nil"/>
                     <w:right w:val="nil"/>
                   </w:tcBorders>
-                  <w:shd w:val="clear" w:color="auto" w:fill="auto"/>
                   <w:noWrap/>
                   <w:vAlign w:val="bottom"/>
                   <w:hideMark/>
@@ -12148,7 +12024,6 @@
                     <w:bottom w:val="nil"/>
                     <w:right w:val="nil"/>
                   </w:tcBorders>
-                  <w:shd w:val="clear" w:color="auto" w:fill="auto"/>
                   <w:noWrap/>
                   <w:vAlign w:val="bottom"/>
                   <w:hideMark/>
@@ -12184,7 +12059,6 @@
                     <w:bottom w:val="nil"/>
                     <w:right w:val="nil"/>
                   </w:tcBorders>
-                  <w:shd w:val="clear" w:color="auto" w:fill="auto"/>
                   <w:noWrap/>
                   <w:vAlign w:val="bottom"/>
                   <w:hideMark/>
@@ -12220,7 +12094,6 @@
                     <w:bottom w:val="nil"/>
                     <w:right w:val="nil"/>
                   </w:tcBorders>
-                  <w:shd w:val="clear" w:color="auto" w:fill="auto"/>
                   <w:noWrap/>
                   <w:vAlign w:val="bottom"/>
                   <w:hideMark/>
@@ -12261,7 +12134,6 @@
                     <w:bottom w:val="nil"/>
                     <w:right w:val="nil"/>
                   </w:tcBorders>
-                  <w:shd w:val="clear" w:color="auto" w:fill="auto"/>
                   <w:noWrap/>
                   <w:vAlign w:val="bottom"/>
                   <w:hideMark/>
@@ -12296,7 +12168,6 @@
                     <w:bottom w:val="nil"/>
                     <w:right w:val="nil"/>
                   </w:tcBorders>
-                  <w:shd w:val="clear" w:color="auto" w:fill="auto"/>
                   <w:noWrap/>
                   <w:vAlign w:val="bottom"/>
                   <w:hideMark/>
@@ -12332,7 +12203,6 @@
                     <w:bottom w:val="nil"/>
                     <w:right w:val="nil"/>
                   </w:tcBorders>
-                  <w:shd w:val="clear" w:color="auto" w:fill="auto"/>
                   <w:noWrap/>
                   <w:vAlign w:val="bottom"/>
                   <w:hideMark/>
@@ -12368,7 +12238,6 @@
                     <w:bottom w:val="nil"/>
                     <w:right w:val="nil"/>
                   </w:tcBorders>
-                  <w:shd w:val="clear" w:color="auto" w:fill="auto"/>
                   <w:noWrap/>
                   <w:vAlign w:val="bottom"/>
                   <w:hideMark/>
@@ -12404,7 +12273,6 @@
                     <w:bottom w:val="nil"/>
                     <w:right w:val="nil"/>
                   </w:tcBorders>
-                  <w:shd w:val="clear" w:color="auto" w:fill="auto"/>
                   <w:noWrap/>
                   <w:vAlign w:val="bottom"/>
                   <w:hideMark/>
@@ -12440,7 +12308,6 @@
                     <w:bottom w:val="nil"/>
                     <w:right w:val="nil"/>
                   </w:tcBorders>
-                  <w:shd w:val="clear" w:color="auto" w:fill="auto"/>
                   <w:noWrap/>
                   <w:vAlign w:val="bottom"/>
                   <w:hideMark/>
@@ -12481,7 +12348,6 @@
                     <w:bottom w:val="nil"/>
                     <w:right w:val="nil"/>
                   </w:tcBorders>
-                  <w:shd w:val="clear" w:color="auto" w:fill="auto"/>
                   <w:noWrap/>
                   <w:vAlign w:val="bottom"/>
                   <w:hideMark/>
@@ -12516,7 +12382,6 @@
                     <w:bottom w:val="nil"/>
                     <w:right w:val="nil"/>
                   </w:tcBorders>
-                  <w:shd w:val="clear" w:color="auto" w:fill="auto"/>
                   <w:noWrap/>
                   <w:vAlign w:val="bottom"/>
                   <w:hideMark/>
@@ -12552,7 +12417,6 @@
                     <w:bottom w:val="nil"/>
                     <w:right w:val="nil"/>
                   </w:tcBorders>
-                  <w:shd w:val="clear" w:color="auto" w:fill="auto"/>
                   <w:noWrap/>
                   <w:vAlign w:val="bottom"/>
                   <w:hideMark/>
@@ -12588,7 +12452,6 @@
                     <w:bottom w:val="nil"/>
                     <w:right w:val="nil"/>
                   </w:tcBorders>
-                  <w:shd w:val="clear" w:color="auto" w:fill="auto"/>
                   <w:noWrap/>
                   <w:vAlign w:val="bottom"/>
                   <w:hideMark/>
@@ -12624,7 +12487,6 @@
                     <w:bottom w:val="nil"/>
                     <w:right w:val="nil"/>
                   </w:tcBorders>
-                  <w:shd w:val="clear" w:color="auto" w:fill="auto"/>
                   <w:noWrap/>
                   <w:vAlign w:val="bottom"/>
                   <w:hideMark/>
@@ -12660,7 +12522,6 @@
                     <w:bottom w:val="nil"/>
                     <w:right w:val="nil"/>
                   </w:tcBorders>
-                  <w:shd w:val="clear" w:color="auto" w:fill="auto"/>
                   <w:noWrap/>
                   <w:vAlign w:val="bottom"/>
                   <w:hideMark/>
@@ -12701,7 +12562,6 @@
                     <w:bottom w:val="double" w:sz="6" w:space="0" w:color="auto"/>
                     <w:right w:val="nil"/>
                   </w:tcBorders>
-                  <w:shd w:val="clear" w:color="auto" w:fill="auto"/>
                   <w:noWrap/>
                   <w:vAlign w:val="bottom"/>
                   <w:hideMark/>
@@ -12736,7 +12596,6 @@
                     <w:bottom w:val="double" w:sz="6" w:space="0" w:color="auto"/>
                     <w:right w:val="nil"/>
                   </w:tcBorders>
-                  <w:shd w:val="clear" w:color="auto" w:fill="auto"/>
                   <w:noWrap/>
                   <w:vAlign w:val="bottom"/>
                   <w:hideMark/>
@@ -12772,7 +12631,6 @@
                     <w:bottom w:val="double" w:sz="6" w:space="0" w:color="auto"/>
                     <w:right w:val="nil"/>
                   </w:tcBorders>
-                  <w:shd w:val="clear" w:color="auto" w:fill="auto"/>
                   <w:noWrap/>
                   <w:vAlign w:val="bottom"/>
                   <w:hideMark/>
@@ -12808,7 +12666,6 @@
                     <w:bottom w:val="double" w:sz="6" w:space="0" w:color="auto"/>
                     <w:right w:val="nil"/>
                   </w:tcBorders>
-                  <w:shd w:val="clear" w:color="auto" w:fill="auto"/>
                   <w:noWrap/>
                   <w:vAlign w:val="bottom"/>
                   <w:hideMark/>
@@ -12844,7 +12701,6 @@
                     <w:bottom w:val="double" w:sz="6" w:space="0" w:color="auto"/>
                     <w:right w:val="nil"/>
                   </w:tcBorders>
-                  <w:shd w:val="clear" w:color="auto" w:fill="auto"/>
                   <w:noWrap/>
                   <w:vAlign w:val="bottom"/>
                   <w:hideMark/>
@@ -12880,7 +12736,6 @@
                     <w:bottom w:val="double" w:sz="6" w:space="0" w:color="auto"/>
                     <w:right w:val="nil"/>
                   </w:tcBorders>
-                  <w:shd w:val="clear" w:color="auto" w:fill="auto"/>
                   <w:noWrap/>
                   <w:vAlign w:val="bottom"/>
                   <w:hideMark/>
@@ -12921,7 +12776,6 @@
                     <w:bottom w:val="nil"/>
                     <w:right w:val="nil"/>
                   </w:tcBorders>
-                  <w:shd w:val="clear" w:color="auto" w:fill="auto"/>
                   <w:noWrap/>
                   <w:vAlign w:val="bottom"/>
                   <w:hideMark/>
@@ -12960,7 +12814,6 @@
                     <w:bottom w:val="nil"/>
                     <w:right w:val="nil"/>
                   </w:tcBorders>
-                  <w:shd w:val="clear" w:color="auto" w:fill="auto"/>
                   <w:noWrap/>
                   <w:vAlign w:val="bottom"/>
                   <w:hideMark/>
@@ -12996,7 +12849,6 @@
                     <w:bottom w:val="nil"/>
                     <w:right w:val="nil"/>
                   </w:tcBorders>
-                  <w:shd w:val="clear" w:color="auto" w:fill="auto"/>
                   <w:noWrap/>
                   <w:vAlign w:val="bottom"/>
                   <w:hideMark/>
@@ -13023,7 +12875,6 @@
                     <w:bottom w:val="nil"/>
                     <w:right w:val="nil"/>
                   </w:tcBorders>
-                  <w:shd w:val="clear" w:color="auto" w:fill="auto"/>
                   <w:noWrap/>
                   <w:vAlign w:val="bottom"/>
                   <w:hideMark/>
@@ -13048,7 +12899,6 @@
                     <w:bottom w:val="nil"/>
                     <w:right w:val="nil"/>
                   </w:tcBorders>
-                  <w:shd w:val="clear" w:color="auto" w:fill="auto"/>
                   <w:noWrap/>
                   <w:vAlign w:val="bottom"/>
                   <w:hideMark/>
@@ -13073,7 +12923,6 @@
                     <w:bottom w:val="nil"/>
                     <w:right w:val="nil"/>
                   </w:tcBorders>
-                  <w:shd w:val="clear" w:color="auto" w:fill="auto"/>
                   <w:noWrap/>
                   <w:vAlign w:val="bottom"/>
                   <w:hideMark/>
@@ -13102,7 +12951,6 @@
                     <w:left w:val="nil"/>
                     <w:right w:val="nil"/>
                   </w:tcBorders>
-                  <w:shd w:val="clear" w:color="auto" w:fill="auto"/>
                   <w:noWrap/>
                   <w:vAlign w:val="bottom"/>
                   <w:hideMark/>
@@ -13140,7 +12988,6 @@
                     <w:left w:val="nil"/>
                     <w:right w:val="nil"/>
                   </w:tcBorders>
-                  <w:shd w:val="clear" w:color="auto" w:fill="auto"/>
                   <w:noWrap/>
                   <w:vAlign w:val="bottom"/>
                   <w:hideMark/>
@@ -13175,7 +13022,6 @@
                     <w:left w:val="nil"/>
                     <w:right w:val="nil"/>
                   </w:tcBorders>
-                  <w:shd w:val="clear" w:color="auto" w:fill="auto"/>
                   <w:noWrap/>
                   <w:vAlign w:val="bottom"/>
                   <w:hideMark/>
@@ -13201,7 +13047,6 @@
                     <w:left w:val="nil"/>
                     <w:right w:val="nil"/>
                   </w:tcBorders>
-                  <w:shd w:val="clear" w:color="auto" w:fill="auto"/>
                   <w:noWrap/>
                   <w:vAlign w:val="bottom"/>
                   <w:hideMark/>
@@ -13225,7 +13070,6 @@
                     <w:left w:val="nil"/>
                     <w:right w:val="nil"/>
                   </w:tcBorders>
-                  <w:shd w:val="clear" w:color="auto" w:fill="auto"/>
                   <w:noWrap/>
                   <w:vAlign w:val="bottom"/>
                   <w:hideMark/>
@@ -13249,7 +13093,6 @@
                     <w:left w:val="nil"/>
                     <w:right w:val="nil"/>
                   </w:tcBorders>
-                  <w:shd w:val="clear" w:color="auto" w:fill="auto"/>
                   <w:noWrap/>
                   <w:vAlign w:val="bottom"/>
                   <w:hideMark/>
@@ -13279,7 +13122,6 @@
                     <w:bottom w:val="single" w:sz="18" w:space="0" w:color="auto"/>
                     <w:right w:val="nil"/>
                   </w:tcBorders>
-                  <w:shd w:val="clear" w:color="auto" w:fill="auto"/>
                   <w:noWrap/>
                   <w:vAlign w:val="bottom"/>
                   <w:hideMark/>
@@ -13331,7 +13173,6 @@
                     <w:bottom w:val="single" w:sz="18" w:space="0" w:color="auto"/>
                     <w:right w:val="nil"/>
                   </w:tcBorders>
-                  <w:shd w:val="clear" w:color="auto" w:fill="auto"/>
                   <w:noWrap/>
                   <w:vAlign w:val="bottom"/>
                   <w:hideMark/>
@@ -13367,7 +13208,6 @@
                     <w:bottom w:val="single" w:sz="18" w:space="0" w:color="auto"/>
                     <w:right w:val="nil"/>
                   </w:tcBorders>
-                  <w:shd w:val="clear" w:color="auto" w:fill="auto"/>
                   <w:noWrap/>
                   <w:vAlign w:val="bottom"/>
                   <w:hideMark/>
@@ -13402,7 +13242,6 @@
                     <w:bottom w:val="single" w:sz="18" w:space="0" w:color="auto"/>
                     <w:right w:val="nil"/>
                   </w:tcBorders>
-                  <w:shd w:val="clear" w:color="auto" w:fill="auto"/>
                   <w:noWrap/>
                   <w:vAlign w:val="bottom"/>
                   <w:hideMark/>
@@ -13428,7 +13267,6 @@
                     <w:bottom w:val="single" w:sz="18" w:space="0" w:color="auto"/>
                     <w:right w:val="nil"/>
                   </w:tcBorders>
-                  <w:shd w:val="clear" w:color="auto" w:fill="auto"/>
                   <w:noWrap/>
                   <w:vAlign w:val="bottom"/>
                   <w:hideMark/>
@@ -13453,7 +13291,6 @@
                     <w:bottom w:val="single" w:sz="18" w:space="0" w:color="auto"/>
                     <w:right w:val="nil"/>
                   </w:tcBorders>
-                  <w:shd w:val="clear" w:color="auto" w:fill="auto"/>
                   <w:noWrap/>
                   <w:vAlign w:val="bottom"/>
                   <w:hideMark/>
@@ -13821,7 +13658,6 @@
                     <w:bottom w:val="single" w:sz="12" w:space="0" w:color="auto"/>
                     <w:right w:val="nil"/>
                   </w:tcBorders>
-                  <w:shd w:val="clear" w:color="auto" w:fill="auto"/>
                   <w:noWrap/>
                   <w:vAlign w:val="bottom"/>
                   <w:hideMark/>
@@ -13903,7 +13739,6 @@
                     <w:bottom w:val="nil"/>
                     <w:right w:val="nil"/>
                   </w:tcBorders>
-                  <w:shd w:val="clear" w:color="auto" w:fill="auto"/>
                   <w:noWrap/>
                   <w:vAlign w:val="bottom"/>
                   <w:hideMark/>
@@ -13943,7 +13778,6 @@
                     <w:bottom w:val="double" w:sz="6" w:space="0" w:color="auto"/>
                     <w:right w:val="nil"/>
                   </w:tcBorders>
-                  <w:shd w:val="clear" w:color="auto" w:fill="auto"/>
                   <w:noWrap/>
                   <w:vAlign w:val="bottom"/>
                   <w:hideMark/>
@@ -13995,7 +13829,6 @@
                     <w:bottom w:val="double" w:sz="6" w:space="0" w:color="auto"/>
                     <w:right w:val="nil"/>
                   </w:tcBorders>
-                  <w:shd w:val="clear" w:color="auto" w:fill="auto"/>
                   <w:noWrap/>
                   <w:vAlign w:val="bottom"/>
                   <w:hideMark/>
@@ -14047,7 +13880,6 @@
                     <w:bottom w:val="double" w:sz="6" w:space="0" w:color="auto"/>
                     <w:right w:val="nil"/>
                   </w:tcBorders>
-                  <w:shd w:val="clear" w:color="auto" w:fill="auto"/>
                   <w:noWrap/>
                   <w:vAlign w:val="bottom"/>
                   <w:hideMark/>
@@ -14099,7 +13931,6 @@
                     <w:bottom w:val="nil"/>
                     <w:right w:val="nil"/>
                   </w:tcBorders>
-                  <w:shd w:val="clear" w:color="auto" w:fill="auto"/>
                   <w:noWrap/>
                   <w:vAlign w:val="bottom"/>
                   <w:hideMark/>
@@ -14138,7 +13969,6 @@
                     <w:bottom w:val="nil"/>
                     <w:right w:val="nil"/>
                   </w:tcBorders>
-                  <w:shd w:val="clear" w:color="auto" w:fill="auto"/>
                   <w:noWrap/>
                   <w:vAlign w:val="bottom"/>
                   <w:hideMark/>
@@ -14182,7 +14012,6 @@
                     <w:bottom w:val="nil"/>
                     <w:right w:val="single" w:sz="4" w:space="0" w:color="auto"/>
                   </w:tcBorders>
-                  <w:shd w:val="clear" w:color="auto" w:fill="auto"/>
                   <w:noWrap/>
                   <w:vAlign w:val="bottom"/>
                   <w:hideMark/>
@@ -14217,7 +14046,6 @@
                     <w:bottom w:val="nil"/>
                     <w:right w:val="single" w:sz="4" w:space="0" w:color="auto"/>
                   </w:tcBorders>
-                  <w:shd w:val="clear" w:color="auto" w:fill="auto"/>
                   <w:noWrap/>
                   <w:vAlign w:val="bottom"/>
                   <w:hideMark/>
@@ -14254,7 +14082,6 @@
                     <w:bottom w:val="nil"/>
                     <w:right w:val="single" w:sz="4" w:space="0" w:color="auto"/>
                   </w:tcBorders>
-                  <w:shd w:val="clear" w:color="auto" w:fill="auto"/>
                   <w:noWrap/>
                   <w:vAlign w:val="bottom"/>
                   <w:hideMark/>
@@ -14290,7 +14117,6 @@
                     <w:bottom w:val="nil"/>
                     <w:right w:val="single" w:sz="4" w:space="0" w:color="auto"/>
                   </w:tcBorders>
-                  <w:shd w:val="clear" w:color="auto" w:fill="auto"/>
                   <w:noWrap/>
                   <w:vAlign w:val="bottom"/>
                   <w:hideMark/>
@@ -14326,7 +14152,6 @@
                     <w:bottom w:val="nil"/>
                     <w:right w:val="single" w:sz="4" w:space="0" w:color="auto"/>
                   </w:tcBorders>
-                  <w:shd w:val="clear" w:color="auto" w:fill="auto"/>
                   <w:noWrap/>
                   <w:vAlign w:val="bottom"/>
                   <w:hideMark/>
@@ -14362,7 +14187,6 @@
                     <w:bottom w:val="nil"/>
                     <w:right w:val="nil"/>
                   </w:tcBorders>
-                  <w:shd w:val="clear" w:color="auto" w:fill="auto"/>
                   <w:noWrap/>
                   <w:vAlign w:val="bottom"/>
                   <w:hideMark/>
@@ -14403,7 +14227,6 @@
                     <w:bottom w:val="nil"/>
                     <w:right w:val="single" w:sz="4" w:space="0" w:color="auto"/>
                   </w:tcBorders>
-                  <w:shd w:val="clear" w:color="auto" w:fill="auto"/>
                   <w:noWrap/>
                   <w:vAlign w:val="bottom"/>
                   <w:hideMark/>
@@ -14438,7 +14261,6 @@
                     <w:bottom w:val="nil"/>
                     <w:right w:val="single" w:sz="4" w:space="0" w:color="auto"/>
                   </w:tcBorders>
-                  <w:shd w:val="clear" w:color="auto" w:fill="auto"/>
                   <w:noWrap/>
                   <w:vAlign w:val="bottom"/>
                   <w:hideMark/>
@@ -14475,7 +14297,6 @@
                     <w:bottom w:val="nil"/>
                     <w:right w:val="single" w:sz="4" w:space="0" w:color="auto"/>
                   </w:tcBorders>
-                  <w:shd w:val="clear" w:color="auto" w:fill="auto"/>
                   <w:noWrap/>
                   <w:vAlign w:val="bottom"/>
                   <w:hideMark/>
@@ -14511,7 +14332,6 @@
                     <w:bottom w:val="nil"/>
                     <w:right w:val="single" w:sz="4" w:space="0" w:color="auto"/>
                   </w:tcBorders>
-                  <w:shd w:val="clear" w:color="auto" w:fill="auto"/>
                   <w:noWrap/>
                   <w:vAlign w:val="bottom"/>
                   <w:hideMark/>
@@ -14547,7 +14367,6 @@
                     <w:bottom w:val="nil"/>
                     <w:right w:val="single" w:sz="4" w:space="0" w:color="auto"/>
                   </w:tcBorders>
-                  <w:shd w:val="clear" w:color="auto" w:fill="auto"/>
                   <w:noWrap/>
                   <w:vAlign w:val="bottom"/>
                   <w:hideMark/>
@@ -14583,7 +14402,6 @@
                     <w:bottom w:val="nil"/>
                     <w:right w:val="nil"/>
                   </w:tcBorders>
-                  <w:shd w:val="clear" w:color="auto" w:fill="auto"/>
                   <w:noWrap/>
                   <w:vAlign w:val="bottom"/>
                   <w:hideMark/>
@@ -14624,7 +14442,6 @@
                     <w:bottom w:val="nil"/>
                     <w:right w:val="single" w:sz="4" w:space="0" w:color="auto"/>
                   </w:tcBorders>
-                  <w:shd w:val="clear" w:color="auto" w:fill="auto"/>
                   <w:noWrap/>
                   <w:vAlign w:val="bottom"/>
                   <w:hideMark/>
@@ -14659,7 +14476,6 @@
                     <w:bottom w:val="nil"/>
                     <w:right w:val="single" w:sz="4" w:space="0" w:color="auto"/>
                   </w:tcBorders>
-                  <w:shd w:val="clear" w:color="auto" w:fill="auto"/>
                   <w:noWrap/>
                   <w:vAlign w:val="bottom"/>
                   <w:hideMark/>
@@ -14696,7 +14512,6 @@
                     <w:bottom w:val="nil"/>
                     <w:right w:val="single" w:sz="4" w:space="0" w:color="auto"/>
                   </w:tcBorders>
-                  <w:shd w:val="clear" w:color="auto" w:fill="auto"/>
                   <w:noWrap/>
                   <w:vAlign w:val="bottom"/>
                   <w:hideMark/>
@@ -14732,7 +14547,6 @@
                     <w:bottom w:val="nil"/>
                     <w:right w:val="single" w:sz="4" w:space="0" w:color="auto"/>
                   </w:tcBorders>
-                  <w:shd w:val="clear" w:color="auto" w:fill="auto"/>
                   <w:noWrap/>
                   <w:vAlign w:val="bottom"/>
                   <w:hideMark/>
@@ -14768,7 +14582,6 @@
                     <w:bottom w:val="nil"/>
                     <w:right w:val="single" w:sz="4" w:space="0" w:color="auto"/>
                   </w:tcBorders>
-                  <w:shd w:val="clear" w:color="auto" w:fill="auto"/>
                   <w:noWrap/>
                   <w:vAlign w:val="bottom"/>
                   <w:hideMark/>
@@ -14804,7 +14617,6 @@
                     <w:bottom w:val="nil"/>
                     <w:right w:val="nil"/>
                   </w:tcBorders>
-                  <w:shd w:val="clear" w:color="auto" w:fill="auto"/>
                   <w:noWrap/>
                   <w:vAlign w:val="bottom"/>
                   <w:hideMark/>
@@ -14845,7 +14657,6 @@
                     <w:bottom w:val="nil"/>
                     <w:right w:val="single" w:sz="4" w:space="0" w:color="auto"/>
                   </w:tcBorders>
-                  <w:shd w:val="clear" w:color="auto" w:fill="auto"/>
                   <w:noWrap/>
                   <w:vAlign w:val="bottom"/>
                   <w:hideMark/>
@@ -14880,7 +14691,6 @@
                     <w:bottom w:val="nil"/>
                     <w:right w:val="single" w:sz="4" w:space="0" w:color="auto"/>
                   </w:tcBorders>
-                  <w:shd w:val="clear" w:color="auto" w:fill="auto"/>
                   <w:noWrap/>
                   <w:vAlign w:val="bottom"/>
                   <w:hideMark/>
@@ -14917,7 +14727,6 @@
                     <w:bottom w:val="nil"/>
                     <w:right w:val="single" w:sz="4" w:space="0" w:color="auto"/>
                   </w:tcBorders>
-                  <w:shd w:val="clear" w:color="auto" w:fill="auto"/>
                   <w:noWrap/>
                   <w:vAlign w:val="bottom"/>
                   <w:hideMark/>
@@ -14953,7 +14762,6 @@
                     <w:bottom w:val="nil"/>
                     <w:right w:val="single" w:sz="4" w:space="0" w:color="auto"/>
                   </w:tcBorders>
-                  <w:shd w:val="clear" w:color="auto" w:fill="auto"/>
                   <w:noWrap/>
                   <w:vAlign w:val="bottom"/>
                   <w:hideMark/>
@@ -14989,7 +14797,6 @@
                     <w:bottom w:val="nil"/>
                     <w:right w:val="single" w:sz="4" w:space="0" w:color="auto"/>
                   </w:tcBorders>
-                  <w:shd w:val="clear" w:color="auto" w:fill="auto"/>
                   <w:noWrap/>
                   <w:vAlign w:val="bottom"/>
                   <w:hideMark/>
@@ -15025,7 +14832,6 @@
                     <w:bottom w:val="nil"/>
                     <w:right w:val="nil"/>
                   </w:tcBorders>
-                  <w:shd w:val="clear" w:color="auto" w:fill="auto"/>
                   <w:noWrap/>
                   <w:vAlign w:val="bottom"/>
                   <w:hideMark/>
@@ -15066,7 +14872,6 @@
                     <w:bottom w:val="nil"/>
                     <w:right w:val="single" w:sz="4" w:space="0" w:color="auto"/>
                   </w:tcBorders>
-                  <w:shd w:val="clear" w:color="auto" w:fill="auto"/>
                   <w:noWrap/>
                   <w:vAlign w:val="bottom"/>
                   <w:hideMark/>
@@ -15101,7 +14906,6 @@
                     <w:bottom w:val="nil"/>
                     <w:right w:val="single" w:sz="4" w:space="0" w:color="auto"/>
                   </w:tcBorders>
-                  <w:shd w:val="clear" w:color="auto" w:fill="auto"/>
                   <w:noWrap/>
                   <w:vAlign w:val="bottom"/>
                   <w:hideMark/>
@@ -15138,7 +14942,6 @@
                     <w:bottom w:val="nil"/>
                     <w:right w:val="single" w:sz="4" w:space="0" w:color="auto"/>
                   </w:tcBorders>
-                  <w:shd w:val="clear" w:color="auto" w:fill="auto"/>
                   <w:noWrap/>
                   <w:vAlign w:val="bottom"/>
                   <w:hideMark/>
@@ -15174,7 +14977,6 @@
                     <w:bottom w:val="nil"/>
                     <w:right w:val="single" w:sz="4" w:space="0" w:color="auto"/>
                   </w:tcBorders>
-                  <w:shd w:val="clear" w:color="auto" w:fill="auto"/>
                   <w:noWrap/>
                   <w:vAlign w:val="bottom"/>
                   <w:hideMark/>
@@ -15210,7 +15012,6 @@
                     <w:bottom w:val="nil"/>
                     <w:right w:val="single" w:sz="4" w:space="0" w:color="auto"/>
                   </w:tcBorders>
-                  <w:shd w:val="clear" w:color="auto" w:fill="auto"/>
                   <w:noWrap/>
                   <w:vAlign w:val="bottom"/>
                   <w:hideMark/>
@@ -15246,7 +15047,6 @@
                     <w:bottom w:val="nil"/>
                     <w:right w:val="nil"/>
                   </w:tcBorders>
-                  <w:shd w:val="clear" w:color="auto" w:fill="auto"/>
                   <w:noWrap/>
                   <w:vAlign w:val="bottom"/>
                   <w:hideMark/>
@@ -15287,7 +15087,6 @@
                     <w:bottom w:val="nil"/>
                     <w:right w:val="single" w:sz="4" w:space="0" w:color="auto"/>
                   </w:tcBorders>
-                  <w:shd w:val="clear" w:color="auto" w:fill="auto"/>
                   <w:noWrap/>
                   <w:vAlign w:val="bottom"/>
                   <w:hideMark/>
@@ -15322,7 +15121,6 @@
                     <w:bottom w:val="nil"/>
                     <w:right w:val="single" w:sz="4" w:space="0" w:color="auto"/>
                   </w:tcBorders>
-                  <w:shd w:val="clear" w:color="auto" w:fill="auto"/>
                   <w:noWrap/>
                   <w:vAlign w:val="bottom"/>
                   <w:hideMark/>
@@ -15359,7 +15157,6 @@
                     <w:bottom w:val="nil"/>
                     <w:right w:val="single" w:sz="4" w:space="0" w:color="auto"/>
                   </w:tcBorders>
-                  <w:shd w:val="clear" w:color="auto" w:fill="auto"/>
                   <w:noWrap/>
                   <w:vAlign w:val="bottom"/>
                   <w:hideMark/>
@@ -15395,7 +15192,6 @@
                     <w:bottom w:val="nil"/>
                     <w:right w:val="single" w:sz="4" w:space="0" w:color="auto"/>
                   </w:tcBorders>
-                  <w:shd w:val="clear" w:color="auto" w:fill="auto"/>
                   <w:noWrap/>
                   <w:vAlign w:val="bottom"/>
                   <w:hideMark/>
@@ -15431,7 +15227,6 @@
                     <w:bottom w:val="nil"/>
                     <w:right w:val="single" w:sz="4" w:space="0" w:color="auto"/>
                   </w:tcBorders>
-                  <w:shd w:val="clear" w:color="auto" w:fill="auto"/>
                   <w:noWrap/>
                   <w:vAlign w:val="bottom"/>
                   <w:hideMark/>
@@ -15467,7 +15262,6 @@
                     <w:bottom w:val="nil"/>
                     <w:right w:val="nil"/>
                   </w:tcBorders>
-                  <w:shd w:val="clear" w:color="auto" w:fill="auto"/>
                   <w:noWrap/>
                   <w:vAlign w:val="bottom"/>
                   <w:hideMark/>
@@ -15508,7 +15302,6 @@
                     <w:bottom w:val="nil"/>
                     <w:right w:val="single" w:sz="4" w:space="0" w:color="auto"/>
                   </w:tcBorders>
-                  <w:shd w:val="clear" w:color="auto" w:fill="auto"/>
                   <w:noWrap/>
                   <w:vAlign w:val="bottom"/>
                   <w:hideMark/>
@@ -15543,7 +15336,6 @@
                     <w:bottom w:val="nil"/>
                     <w:right w:val="single" w:sz="4" w:space="0" w:color="auto"/>
                   </w:tcBorders>
-                  <w:shd w:val="clear" w:color="auto" w:fill="auto"/>
                   <w:noWrap/>
                   <w:vAlign w:val="bottom"/>
                   <w:hideMark/>
@@ -15580,7 +15372,6 @@
                     <w:bottom w:val="nil"/>
                     <w:right w:val="single" w:sz="4" w:space="0" w:color="auto"/>
                   </w:tcBorders>
-                  <w:shd w:val="clear" w:color="auto" w:fill="auto"/>
                   <w:noWrap/>
                   <w:vAlign w:val="bottom"/>
                   <w:hideMark/>
@@ -15616,7 +15407,6 @@
                     <w:bottom w:val="nil"/>
                     <w:right w:val="single" w:sz="4" w:space="0" w:color="auto"/>
                   </w:tcBorders>
-                  <w:shd w:val="clear" w:color="auto" w:fill="auto"/>
                   <w:noWrap/>
                   <w:vAlign w:val="bottom"/>
                   <w:hideMark/>
@@ -15652,7 +15442,6 @@
                     <w:bottom w:val="nil"/>
                     <w:right w:val="single" w:sz="4" w:space="0" w:color="auto"/>
                   </w:tcBorders>
-                  <w:shd w:val="clear" w:color="auto" w:fill="auto"/>
                   <w:noWrap/>
                   <w:vAlign w:val="bottom"/>
                   <w:hideMark/>
@@ -15688,7 +15477,6 @@
                     <w:bottom w:val="nil"/>
                     <w:right w:val="nil"/>
                   </w:tcBorders>
-                  <w:shd w:val="clear" w:color="auto" w:fill="auto"/>
                   <w:noWrap/>
                   <w:vAlign w:val="bottom"/>
                   <w:hideMark/>
@@ -15729,7 +15517,6 @@
                     <w:bottom w:val="nil"/>
                     <w:right w:val="single" w:sz="4" w:space="0" w:color="auto"/>
                   </w:tcBorders>
-                  <w:shd w:val="clear" w:color="auto" w:fill="auto"/>
                   <w:noWrap/>
                   <w:vAlign w:val="bottom"/>
                   <w:hideMark/>
@@ -15764,7 +15551,6 @@
                     <w:bottom w:val="nil"/>
                     <w:right w:val="single" w:sz="4" w:space="0" w:color="auto"/>
                   </w:tcBorders>
-                  <w:shd w:val="clear" w:color="auto" w:fill="auto"/>
                   <w:noWrap/>
                   <w:vAlign w:val="bottom"/>
                   <w:hideMark/>
@@ -15801,7 +15587,6 @@
                     <w:bottom w:val="nil"/>
                     <w:right w:val="single" w:sz="4" w:space="0" w:color="auto"/>
                   </w:tcBorders>
-                  <w:shd w:val="clear" w:color="auto" w:fill="auto"/>
                   <w:noWrap/>
                   <w:vAlign w:val="bottom"/>
                   <w:hideMark/>
@@ -15837,7 +15622,6 @@
                     <w:bottom w:val="nil"/>
                     <w:right w:val="single" w:sz="4" w:space="0" w:color="auto"/>
                   </w:tcBorders>
-                  <w:shd w:val="clear" w:color="auto" w:fill="auto"/>
                   <w:noWrap/>
                   <w:vAlign w:val="bottom"/>
                   <w:hideMark/>
@@ -15873,7 +15657,6 @@
                     <w:bottom w:val="nil"/>
                     <w:right w:val="single" w:sz="4" w:space="0" w:color="auto"/>
                   </w:tcBorders>
-                  <w:shd w:val="clear" w:color="auto" w:fill="auto"/>
                   <w:noWrap/>
                   <w:vAlign w:val="bottom"/>
                   <w:hideMark/>
@@ -15909,7 +15692,6 @@
                     <w:bottom w:val="nil"/>
                     <w:right w:val="nil"/>
                   </w:tcBorders>
-                  <w:shd w:val="clear" w:color="auto" w:fill="auto"/>
                   <w:noWrap/>
                   <w:vAlign w:val="bottom"/>
                   <w:hideMark/>
@@ -15950,7 +15732,6 @@
                     <w:bottom w:val="nil"/>
                     <w:right w:val="single" w:sz="4" w:space="0" w:color="auto"/>
                   </w:tcBorders>
-                  <w:shd w:val="clear" w:color="auto" w:fill="auto"/>
                   <w:noWrap/>
                   <w:vAlign w:val="bottom"/>
                   <w:hideMark/>
@@ -15986,7 +15767,6 @@
                     <w:bottom w:val="nil"/>
                     <w:right w:val="single" w:sz="4" w:space="0" w:color="auto"/>
                   </w:tcBorders>
-                  <w:shd w:val="clear" w:color="auto" w:fill="auto"/>
                   <w:noWrap/>
                   <w:vAlign w:val="bottom"/>
                   <w:hideMark/>
@@ -16023,7 +15803,6 @@
                     <w:bottom w:val="nil"/>
                     <w:right w:val="single" w:sz="4" w:space="0" w:color="auto"/>
                   </w:tcBorders>
-                  <w:shd w:val="clear" w:color="auto" w:fill="auto"/>
                   <w:noWrap/>
                   <w:vAlign w:val="bottom"/>
                   <w:hideMark/>
@@ -16059,7 +15838,6 @@
                     <w:bottom w:val="nil"/>
                     <w:right w:val="single" w:sz="4" w:space="0" w:color="auto"/>
                   </w:tcBorders>
-                  <w:shd w:val="clear" w:color="auto" w:fill="auto"/>
                   <w:noWrap/>
                   <w:vAlign w:val="bottom"/>
                   <w:hideMark/>
@@ -16095,7 +15873,6 @@
                     <w:bottom w:val="nil"/>
                     <w:right w:val="single" w:sz="4" w:space="0" w:color="auto"/>
                   </w:tcBorders>
-                  <w:shd w:val="clear" w:color="auto" w:fill="auto"/>
                   <w:noWrap/>
                   <w:vAlign w:val="bottom"/>
                   <w:hideMark/>
@@ -16131,7 +15908,6 @@
                     <w:bottom w:val="nil"/>
                     <w:right w:val="nil"/>
                   </w:tcBorders>
-                  <w:shd w:val="clear" w:color="auto" w:fill="auto"/>
                   <w:noWrap/>
                   <w:vAlign w:val="bottom"/>
                   <w:hideMark/>
@@ -16172,7 +15948,6 @@
                     <w:bottom w:val="nil"/>
                     <w:right w:val="single" w:sz="4" w:space="0" w:color="auto"/>
                   </w:tcBorders>
-                  <w:shd w:val="clear" w:color="auto" w:fill="auto"/>
                   <w:noWrap/>
                   <w:vAlign w:val="bottom"/>
                   <w:hideMark/>
@@ -16207,7 +15982,6 @@
                     <w:bottom w:val="nil"/>
                     <w:right w:val="single" w:sz="4" w:space="0" w:color="auto"/>
                   </w:tcBorders>
-                  <w:shd w:val="clear" w:color="auto" w:fill="auto"/>
                   <w:noWrap/>
                   <w:vAlign w:val="bottom"/>
                   <w:hideMark/>
@@ -16244,7 +16018,6 @@
                     <w:bottom w:val="nil"/>
                     <w:right w:val="single" w:sz="4" w:space="0" w:color="auto"/>
                   </w:tcBorders>
-                  <w:shd w:val="clear" w:color="auto" w:fill="auto"/>
                   <w:noWrap/>
                   <w:vAlign w:val="bottom"/>
                   <w:hideMark/>
@@ -16280,7 +16053,6 @@
                     <w:bottom w:val="nil"/>
                     <w:right w:val="single" w:sz="4" w:space="0" w:color="auto"/>
                   </w:tcBorders>
-                  <w:shd w:val="clear" w:color="auto" w:fill="auto"/>
                   <w:noWrap/>
                   <w:vAlign w:val="bottom"/>
                   <w:hideMark/>
@@ -16316,7 +16088,6 @@
                     <w:bottom w:val="nil"/>
                     <w:right w:val="single" w:sz="4" w:space="0" w:color="auto"/>
                   </w:tcBorders>
-                  <w:shd w:val="clear" w:color="auto" w:fill="auto"/>
                   <w:noWrap/>
                   <w:vAlign w:val="bottom"/>
                   <w:hideMark/>
@@ -16352,7 +16123,6 @@
                     <w:bottom w:val="nil"/>
                     <w:right w:val="nil"/>
                   </w:tcBorders>
-                  <w:shd w:val="clear" w:color="auto" w:fill="auto"/>
                   <w:noWrap/>
                   <w:vAlign w:val="bottom"/>
                   <w:hideMark/>
@@ -16393,7 +16163,6 @@
                     <w:bottom w:val="nil"/>
                     <w:right w:val="single" w:sz="4" w:space="0" w:color="auto"/>
                   </w:tcBorders>
-                  <w:shd w:val="clear" w:color="auto" w:fill="auto"/>
                   <w:noWrap/>
                   <w:vAlign w:val="bottom"/>
                   <w:hideMark/>
@@ -16428,7 +16197,6 @@
                     <w:bottom w:val="nil"/>
                     <w:right w:val="single" w:sz="4" w:space="0" w:color="auto"/>
                   </w:tcBorders>
-                  <w:shd w:val="clear" w:color="auto" w:fill="auto"/>
                   <w:noWrap/>
                   <w:vAlign w:val="bottom"/>
                   <w:hideMark/>
@@ -16465,7 +16233,6 @@
                     <w:bottom w:val="nil"/>
                     <w:right w:val="single" w:sz="4" w:space="0" w:color="auto"/>
                   </w:tcBorders>
-                  <w:shd w:val="clear" w:color="auto" w:fill="auto"/>
                   <w:noWrap/>
                   <w:vAlign w:val="bottom"/>
                   <w:hideMark/>
@@ -16501,7 +16268,6 @@
                     <w:bottom w:val="nil"/>
                     <w:right w:val="single" w:sz="4" w:space="0" w:color="auto"/>
                   </w:tcBorders>
-                  <w:shd w:val="clear" w:color="auto" w:fill="auto"/>
                   <w:noWrap/>
                   <w:vAlign w:val="bottom"/>
                   <w:hideMark/>
@@ -16537,7 +16303,6 @@
                     <w:bottom w:val="nil"/>
                     <w:right w:val="single" w:sz="4" w:space="0" w:color="auto"/>
                   </w:tcBorders>
-                  <w:shd w:val="clear" w:color="auto" w:fill="auto"/>
                   <w:noWrap/>
                   <w:vAlign w:val="bottom"/>
                   <w:hideMark/>
@@ -16573,7 +16338,6 @@
                     <w:bottom w:val="nil"/>
                     <w:right w:val="nil"/>
                   </w:tcBorders>
-                  <w:shd w:val="clear" w:color="auto" w:fill="auto"/>
                   <w:noWrap/>
                   <w:vAlign w:val="bottom"/>
                   <w:hideMark/>
@@ -16614,7 +16378,6 @@
                     <w:bottom w:val="nil"/>
                     <w:right w:val="single" w:sz="4" w:space="0" w:color="auto"/>
                   </w:tcBorders>
-                  <w:shd w:val="clear" w:color="auto" w:fill="auto"/>
                   <w:noWrap/>
                   <w:vAlign w:val="bottom"/>
                   <w:hideMark/>
@@ -16649,7 +16412,6 @@
                     <w:bottom w:val="nil"/>
                     <w:right w:val="single" w:sz="4" w:space="0" w:color="auto"/>
                   </w:tcBorders>
-                  <w:shd w:val="clear" w:color="auto" w:fill="auto"/>
                   <w:noWrap/>
                   <w:vAlign w:val="bottom"/>
                   <w:hideMark/>
@@ -16686,7 +16448,6 @@
                     <w:bottom w:val="nil"/>
                     <w:right w:val="single" w:sz="4" w:space="0" w:color="auto"/>
                   </w:tcBorders>
-                  <w:shd w:val="clear" w:color="auto" w:fill="auto"/>
                   <w:noWrap/>
                   <w:vAlign w:val="bottom"/>
                   <w:hideMark/>
@@ -16722,7 +16483,6 @@
                     <w:bottom w:val="nil"/>
                     <w:right w:val="single" w:sz="4" w:space="0" w:color="auto"/>
                   </w:tcBorders>
-                  <w:shd w:val="clear" w:color="auto" w:fill="auto"/>
                   <w:noWrap/>
                   <w:vAlign w:val="bottom"/>
                   <w:hideMark/>
@@ -16758,7 +16518,6 @@
                     <w:bottom w:val="nil"/>
                     <w:right w:val="single" w:sz="4" w:space="0" w:color="auto"/>
                   </w:tcBorders>
-                  <w:shd w:val="clear" w:color="auto" w:fill="auto"/>
                   <w:noWrap/>
                   <w:vAlign w:val="bottom"/>
                   <w:hideMark/>
@@ -16794,7 +16553,6 @@
                     <w:bottom w:val="nil"/>
                     <w:right w:val="nil"/>
                   </w:tcBorders>
-                  <w:shd w:val="clear" w:color="auto" w:fill="auto"/>
                   <w:noWrap/>
                   <w:vAlign w:val="bottom"/>
                   <w:hideMark/>
@@ -16835,7 +16593,6 @@
                     <w:bottom w:val="nil"/>
                     <w:right w:val="single" w:sz="4" w:space="0" w:color="auto"/>
                   </w:tcBorders>
-                  <w:shd w:val="clear" w:color="auto" w:fill="auto"/>
                   <w:noWrap/>
                   <w:vAlign w:val="bottom"/>
                   <w:hideMark/>
@@ -16857,27 +16614,7 @@
                       <w:sz w:val="18"/>
                       <w:szCs w:val="18"/>
                     </w:rPr>
-                    <w:t xml:space="preserve">Mulher </w:t>
-                  </w:r>
-                  <w:proofErr w:type="gramStart"/>
-                  <w:r>
-                    <w:rPr>
-                      <w:rFonts w:ascii="Aptos Narrow" w:eastAsia="Times New Roman" w:hAnsi="Aptos Narrow" w:cs="Times New Roman"/>
-                      <w:color w:val="000000"/>
-                      <w:sz w:val="18"/>
-                      <w:szCs w:val="18"/>
-                    </w:rPr>
-                    <w:t>x Durante</w:t>
-                  </w:r>
-                  <w:proofErr w:type="gramEnd"/>
-                  <w:r>
-                    <w:rPr>
-                      <w:rFonts w:ascii="Aptos Narrow" w:eastAsia="Times New Roman" w:hAnsi="Aptos Narrow" w:cs="Times New Roman"/>
-                      <w:color w:val="000000"/>
-                      <w:sz w:val="18"/>
-                      <w:szCs w:val="18"/>
-                    </w:rPr>
-                    <w:t xml:space="preserve"> pandemia</w:t>
+                    <w:t>Mulher x Durante pandemia</w:t>
                   </w:r>
                 </w:p>
               </w:tc>
@@ -16890,7 +16627,6 @@
                     <w:bottom w:val="nil"/>
                     <w:right w:val="single" w:sz="4" w:space="0" w:color="auto"/>
                   </w:tcBorders>
-                  <w:shd w:val="clear" w:color="auto" w:fill="auto"/>
                   <w:noWrap/>
                   <w:vAlign w:val="bottom"/>
                   <w:hideMark/>
@@ -16927,7 +16663,6 @@
                     <w:bottom w:val="nil"/>
                     <w:right w:val="single" w:sz="4" w:space="0" w:color="auto"/>
                   </w:tcBorders>
-                  <w:shd w:val="clear" w:color="auto" w:fill="auto"/>
                   <w:noWrap/>
                   <w:vAlign w:val="bottom"/>
                   <w:hideMark/>
@@ -16963,7 +16698,6 @@
                     <w:bottom w:val="nil"/>
                     <w:right w:val="single" w:sz="4" w:space="0" w:color="auto"/>
                   </w:tcBorders>
-                  <w:shd w:val="clear" w:color="auto" w:fill="auto"/>
                   <w:noWrap/>
                   <w:vAlign w:val="bottom"/>
                   <w:hideMark/>
@@ -16999,7 +16733,6 @@
                     <w:bottom w:val="nil"/>
                     <w:right w:val="single" w:sz="4" w:space="0" w:color="auto"/>
                   </w:tcBorders>
-                  <w:shd w:val="clear" w:color="auto" w:fill="auto"/>
                   <w:noWrap/>
                   <w:vAlign w:val="bottom"/>
                   <w:hideMark/>
@@ -17035,7 +16768,6 @@
                     <w:bottom w:val="nil"/>
                     <w:right w:val="nil"/>
                   </w:tcBorders>
-                  <w:shd w:val="clear" w:color="auto" w:fill="auto"/>
                   <w:noWrap/>
                   <w:vAlign w:val="bottom"/>
                   <w:hideMark/>
@@ -17076,7 +16808,6 @@
                     <w:bottom w:val="nil"/>
                     <w:right w:val="single" w:sz="4" w:space="0" w:color="auto"/>
                   </w:tcBorders>
-                  <w:shd w:val="clear" w:color="auto" w:fill="auto"/>
                   <w:noWrap/>
                   <w:vAlign w:val="bottom"/>
                   <w:hideMark/>
@@ -17111,7 +16842,6 @@
                     <w:bottom w:val="nil"/>
                     <w:right w:val="single" w:sz="4" w:space="0" w:color="auto"/>
                   </w:tcBorders>
-                  <w:shd w:val="clear" w:color="auto" w:fill="auto"/>
                   <w:noWrap/>
                   <w:vAlign w:val="bottom"/>
                   <w:hideMark/>
@@ -17148,7 +16878,6 @@
                     <w:bottom w:val="nil"/>
                     <w:right w:val="single" w:sz="4" w:space="0" w:color="auto"/>
                   </w:tcBorders>
-                  <w:shd w:val="clear" w:color="auto" w:fill="auto"/>
                   <w:noWrap/>
                   <w:vAlign w:val="bottom"/>
                   <w:hideMark/>
@@ -17184,7 +16913,6 @@
                     <w:bottom w:val="nil"/>
                     <w:right w:val="single" w:sz="4" w:space="0" w:color="auto"/>
                   </w:tcBorders>
-                  <w:shd w:val="clear" w:color="auto" w:fill="auto"/>
                   <w:noWrap/>
                   <w:vAlign w:val="bottom"/>
                   <w:hideMark/>
@@ -17220,7 +16948,6 @@
                     <w:bottom w:val="nil"/>
                     <w:right w:val="single" w:sz="4" w:space="0" w:color="auto"/>
                   </w:tcBorders>
-                  <w:shd w:val="clear" w:color="auto" w:fill="auto"/>
                   <w:noWrap/>
                   <w:vAlign w:val="bottom"/>
                   <w:hideMark/>
@@ -17256,7 +16983,6 @@
                     <w:bottom w:val="nil"/>
                     <w:right w:val="nil"/>
                   </w:tcBorders>
-                  <w:shd w:val="clear" w:color="auto" w:fill="auto"/>
                   <w:noWrap/>
                   <w:vAlign w:val="bottom"/>
                   <w:hideMark/>
@@ -17297,7 +17023,6 @@
                     <w:bottom w:val="nil"/>
                     <w:right w:val="single" w:sz="4" w:space="0" w:color="auto"/>
                   </w:tcBorders>
-                  <w:shd w:val="clear" w:color="auto" w:fill="auto"/>
                   <w:noWrap/>
                   <w:vAlign w:val="bottom"/>
                   <w:hideMark/>
@@ -17332,7 +17057,6 @@
                     <w:bottom w:val="nil"/>
                     <w:right w:val="single" w:sz="4" w:space="0" w:color="auto"/>
                   </w:tcBorders>
-                  <w:shd w:val="clear" w:color="auto" w:fill="auto"/>
                   <w:noWrap/>
                   <w:vAlign w:val="bottom"/>
                   <w:hideMark/>
@@ -17369,7 +17093,6 @@
                     <w:bottom w:val="nil"/>
                     <w:right w:val="single" w:sz="4" w:space="0" w:color="auto"/>
                   </w:tcBorders>
-                  <w:shd w:val="clear" w:color="auto" w:fill="auto"/>
                   <w:noWrap/>
                   <w:vAlign w:val="bottom"/>
                   <w:hideMark/>
@@ -17405,7 +17128,6 @@
                     <w:bottom w:val="nil"/>
                     <w:right w:val="single" w:sz="4" w:space="0" w:color="auto"/>
                   </w:tcBorders>
-                  <w:shd w:val="clear" w:color="auto" w:fill="auto"/>
                   <w:noWrap/>
                   <w:vAlign w:val="bottom"/>
                   <w:hideMark/>
@@ -17441,7 +17163,6 @@
                     <w:bottom w:val="nil"/>
                     <w:right w:val="single" w:sz="4" w:space="0" w:color="auto"/>
                   </w:tcBorders>
-                  <w:shd w:val="clear" w:color="auto" w:fill="auto"/>
                   <w:noWrap/>
                   <w:vAlign w:val="bottom"/>
                   <w:hideMark/>
@@ -17477,7 +17198,6 @@
                     <w:bottom w:val="nil"/>
                     <w:right w:val="nil"/>
                   </w:tcBorders>
-                  <w:shd w:val="clear" w:color="auto" w:fill="auto"/>
                   <w:noWrap/>
                   <w:vAlign w:val="bottom"/>
                   <w:hideMark/>
@@ -17518,7 +17238,6 @@
                     <w:bottom w:val="nil"/>
                     <w:right w:val="single" w:sz="4" w:space="0" w:color="auto"/>
                   </w:tcBorders>
-                  <w:shd w:val="clear" w:color="auto" w:fill="auto"/>
                   <w:noWrap/>
                   <w:vAlign w:val="bottom"/>
                   <w:hideMark/>
@@ -17553,7 +17272,6 @@
                     <w:bottom w:val="nil"/>
                     <w:right w:val="single" w:sz="4" w:space="0" w:color="auto"/>
                   </w:tcBorders>
-                  <w:shd w:val="clear" w:color="auto" w:fill="auto"/>
                   <w:noWrap/>
                   <w:vAlign w:val="bottom"/>
                   <w:hideMark/>
@@ -17590,7 +17308,6 @@
                     <w:bottom w:val="nil"/>
                     <w:right w:val="single" w:sz="4" w:space="0" w:color="auto"/>
                   </w:tcBorders>
-                  <w:shd w:val="clear" w:color="auto" w:fill="auto"/>
                   <w:noWrap/>
                   <w:vAlign w:val="bottom"/>
                   <w:hideMark/>
@@ -17626,7 +17343,6 @@
                     <w:bottom w:val="nil"/>
                     <w:right w:val="single" w:sz="4" w:space="0" w:color="auto"/>
                   </w:tcBorders>
-                  <w:shd w:val="clear" w:color="auto" w:fill="auto"/>
                   <w:noWrap/>
                   <w:vAlign w:val="bottom"/>
                   <w:hideMark/>
@@ -17662,7 +17378,6 @@
                     <w:bottom w:val="nil"/>
                     <w:right w:val="single" w:sz="4" w:space="0" w:color="auto"/>
                   </w:tcBorders>
-                  <w:shd w:val="clear" w:color="auto" w:fill="auto"/>
                   <w:noWrap/>
                   <w:vAlign w:val="bottom"/>
                   <w:hideMark/>
@@ -17698,7 +17413,6 @@
                     <w:bottom w:val="nil"/>
                     <w:right w:val="nil"/>
                   </w:tcBorders>
-                  <w:shd w:val="clear" w:color="auto" w:fill="auto"/>
                   <w:noWrap/>
                   <w:vAlign w:val="bottom"/>
                   <w:hideMark/>
@@ -17739,7 +17453,6 @@
                     <w:bottom w:val="nil"/>
                     <w:right w:val="single" w:sz="4" w:space="0" w:color="auto"/>
                   </w:tcBorders>
-                  <w:shd w:val="clear" w:color="auto" w:fill="auto"/>
                   <w:noWrap/>
                   <w:vAlign w:val="bottom"/>
                   <w:hideMark/>
@@ -17774,7 +17487,6 @@
                     <w:bottom w:val="nil"/>
                     <w:right w:val="single" w:sz="4" w:space="0" w:color="auto"/>
                   </w:tcBorders>
-                  <w:shd w:val="clear" w:color="auto" w:fill="auto"/>
                   <w:noWrap/>
                   <w:vAlign w:val="bottom"/>
                   <w:hideMark/>
@@ -17811,7 +17523,6 @@
                     <w:bottom w:val="nil"/>
                     <w:right w:val="single" w:sz="4" w:space="0" w:color="auto"/>
                   </w:tcBorders>
-                  <w:shd w:val="clear" w:color="auto" w:fill="auto"/>
                   <w:noWrap/>
                   <w:vAlign w:val="bottom"/>
                   <w:hideMark/>
@@ -17847,7 +17558,6 @@
                     <w:bottom w:val="nil"/>
                     <w:right w:val="single" w:sz="4" w:space="0" w:color="auto"/>
                   </w:tcBorders>
-                  <w:shd w:val="clear" w:color="auto" w:fill="auto"/>
                   <w:noWrap/>
                   <w:vAlign w:val="bottom"/>
                   <w:hideMark/>
@@ -17883,7 +17593,6 @@
                     <w:bottom w:val="nil"/>
                     <w:right w:val="single" w:sz="4" w:space="0" w:color="auto"/>
                   </w:tcBorders>
-                  <w:shd w:val="clear" w:color="auto" w:fill="auto"/>
                   <w:noWrap/>
                   <w:vAlign w:val="bottom"/>
                   <w:hideMark/>
@@ -17919,7 +17628,6 @@
                     <w:bottom w:val="nil"/>
                     <w:right w:val="nil"/>
                   </w:tcBorders>
-                  <w:shd w:val="clear" w:color="auto" w:fill="auto"/>
                   <w:noWrap/>
                   <w:vAlign w:val="bottom"/>
                   <w:hideMark/>
@@ -17960,7 +17668,6 @@
                     <w:bottom w:val="nil"/>
                     <w:right w:val="single" w:sz="4" w:space="0" w:color="auto"/>
                   </w:tcBorders>
-                  <w:shd w:val="clear" w:color="auto" w:fill="auto"/>
                   <w:noWrap/>
                   <w:vAlign w:val="bottom"/>
                   <w:hideMark/>
@@ -17995,7 +17702,6 @@
                     <w:bottom w:val="nil"/>
                     <w:right w:val="single" w:sz="4" w:space="0" w:color="auto"/>
                   </w:tcBorders>
-                  <w:shd w:val="clear" w:color="auto" w:fill="auto"/>
                   <w:noWrap/>
                   <w:vAlign w:val="bottom"/>
                   <w:hideMark/>
@@ -18032,7 +17738,6 @@
                     <w:bottom w:val="nil"/>
                     <w:right w:val="single" w:sz="4" w:space="0" w:color="auto"/>
                   </w:tcBorders>
-                  <w:shd w:val="clear" w:color="auto" w:fill="auto"/>
                   <w:noWrap/>
                   <w:vAlign w:val="bottom"/>
                   <w:hideMark/>
@@ -18068,7 +17773,6 @@
                     <w:bottom w:val="nil"/>
                     <w:right w:val="single" w:sz="4" w:space="0" w:color="auto"/>
                   </w:tcBorders>
-                  <w:shd w:val="clear" w:color="auto" w:fill="auto"/>
                   <w:noWrap/>
                   <w:vAlign w:val="bottom"/>
                   <w:hideMark/>
@@ -18104,7 +17808,6 @@
                     <w:bottom w:val="nil"/>
                     <w:right w:val="single" w:sz="4" w:space="0" w:color="auto"/>
                   </w:tcBorders>
-                  <w:shd w:val="clear" w:color="auto" w:fill="auto"/>
                   <w:noWrap/>
                   <w:vAlign w:val="bottom"/>
                   <w:hideMark/>
@@ -18140,7 +17843,6 @@
                     <w:bottom w:val="nil"/>
                     <w:right w:val="nil"/>
                   </w:tcBorders>
-                  <w:shd w:val="clear" w:color="auto" w:fill="auto"/>
                   <w:noWrap/>
                   <w:vAlign w:val="bottom"/>
                   <w:hideMark/>
@@ -18181,7 +17883,6 @@
                     <w:bottom w:val="nil"/>
                     <w:right w:val="single" w:sz="4" w:space="0" w:color="auto"/>
                   </w:tcBorders>
-                  <w:shd w:val="clear" w:color="auto" w:fill="auto"/>
                   <w:noWrap/>
                   <w:vAlign w:val="bottom"/>
                   <w:hideMark/>
@@ -18216,7 +17917,6 @@
                     <w:bottom w:val="nil"/>
                     <w:right w:val="single" w:sz="4" w:space="0" w:color="auto"/>
                   </w:tcBorders>
-                  <w:shd w:val="clear" w:color="auto" w:fill="auto"/>
                   <w:noWrap/>
                   <w:vAlign w:val="bottom"/>
                   <w:hideMark/>
@@ -18253,7 +17953,6 @@
                     <w:bottom w:val="nil"/>
                     <w:right w:val="single" w:sz="4" w:space="0" w:color="auto"/>
                   </w:tcBorders>
-                  <w:shd w:val="clear" w:color="auto" w:fill="auto"/>
                   <w:noWrap/>
                   <w:vAlign w:val="bottom"/>
                   <w:hideMark/>
@@ -18289,7 +17988,6 @@
                     <w:bottom w:val="nil"/>
                     <w:right w:val="single" w:sz="4" w:space="0" w:color="auto"/>
                   </w:tcBorders>
-                  <w:shd w:val="clear" w:color="auto" w:fill="auto"/>
                   <w:noWrap/>
                   <w:vAlign w:val="bottom"/>
                   <w:hideMark/>
@@ -18325,7 +18023,6 @@
                     <w:bottom w:val="nil"/>
                     <w:right w:val="single" w:sz="4" w:space="0" w:color="auto"/>
                   </w:tcBorders>
-                  <w:shd w:val="clear" w:color="auto" w:fill="auto"/>
                   <w:noWrap/>
                   <w:vAlign w:val="bottom"/>
                   <w:hideMark/>
@@ -18361,7 +18058,6 @@
                     <w:bottom w:val="nil"/>
                     <w:right w:val="nil"/>
                   </w:tcBorders>
-                  <w:shd w:val="clear" w:color="auto" w:fill="auto"/>
                   <w:noWrap/>
                   <w:vAlign w:val="bottom"/>
                   <w:hideMark/>
@@ -18402,7 +18098,6 @@
                     <w:bottom w:val="nil"/>
                     <w:right w:val="single" w:sz="4" w:space="0" w:color="auto"/>
                   </w:tcBorders>
-                  <w:shd w:val="clear" w:color="auto" w:fill="auto"/>
                   <w:noWrap/>
                   <w:vAlign w:val="bottom"/>
                   <w:hideMark/>
@@ -18437,7 +18132,6 @@
                     <w:bottom w:val="nil"/>
                     <w:right w:val="single" w:sz="4" w:space="0" w:color="auto"/>
                   </w:tcBorders>
-                  <w:shd w:val="clear" w:color="auto" w:fill="auto"/>
                   <w:noWrap/>
                   <w:vAlign w:val="bottom"/>
                   <w:hideMark/>
@@ -18474,7 +18168,6 @@
                     <w:bottom w:val="nil"/>
                     <w:right w:val="single" w:sz="4" w:space="0" w:color="auto"/>
                   </w:tcBorders>
-                  <w:shd w:val="clear" w:color="auto" w:fill="auto"/>
                   <w:noWrap/>
                   <w:vAlign w:val="bottom"/>
                   <w:hideMark/>
@@ -18510,7 +18203,6 @@
                     <w:bottom w:val="nil"/>
                     <w:right w:val="single" w:sz="4" w:space="0" w:color="auto"/>
                   </w:tcBorders>
-                  <w:shd w:val="clear" w:color="auto" w:fill="auto"/>
                   <w:noWrap/>
                   <w:vAlign w:val="bottom"/>
                   <w:hideMark/>
@@ -18546,7 +18238,6 @@
                     <w:bottom w:val="nil"/>
                     <w:right w:val="single" w:sz="4" w:space="0" w:color="auto"/>
                   </w:tcBorders>
-                  <w:shd w:val="clear" w:color="auto" w:fill="auto"/>
                   <w:noWrap/>
                   <w:vAlign w:val="bottom"/>
                   <w:hideMark/>
@@ -18582,7 +18273,6 @@
                     <w:bottom w:val="nil"/>
                     <w:right w:val="nil"/>
                   </w:tcBorders>
-                  <w:shd w:val="clear" w:color="auto" w:fill="auto"/>
                   <w:noWrap/>
                   <w:vAlign w:val="bottom"/>
                   <w:hideMark/>
@@ -18623,7 +18313,6 @@
                     <w:bottom w:val="nil"/>
                     <w:right w:val="single" w:sz="4" w:space="0" w:color="auto"/>
                   </w:tcBorders>
-                  <w:shd w:val="clear" w:color="auto" w:fill="auto"/>
                   <w:noWrap/>
                   <w:vAlign w:val="bottom"/>
                   <w:hideMark/>
@@ -18658,7 +18347,6 @@
                     <w:bottom w:val="nil"/>
                     <w:right w:val="single" w:sz="4" w:space="0" w:color="auto"/>
                   </w:tcBorders>
-                  <w:shd w:val="clear" w:color="auto" w:fill="auto"/>
                   <w:noWrap/>
                   <w:vAlign w:val="bottom"/>
                   <w:hideMark/>
@@ -18695,7 +18383,6 @@
                     <w:bottom w:val="nil"/>
                     <w:right w:val="single" w:sz="4" w:space="0" w:color="auto"/>
                   </w:tcBorders>
-                  <w:shd w:val="clear" w:color="auto" w:fill="auto"/>
                   <w:noWrap/>
                   <w:vAlign w:val="bottom"/>
                   <w:hideMark/>
@@ -18731,7 +18418,6 @@
                     <w:bottom w:val="nil"/>
                     <w:right w:val="single" w:sz="4" w:space="0" w:color="auto"/>
                   </w:tcBorders>
-                  <w:shd w:val="clear" w:color="auto" w:fill="auto"/>
                   <w:noWrap/>
                   <w:vAlign w:val="bottom"/>
                   <w:hideMark/>
@@ -18767,7 +18453,6 @@
                     <w:bottom w:val="nil"/>
                     <w:right w:val="single" w:sz="4" w:space="0" w:color="auto"/>
                   </w:tcBorders>
-                  <w:shd w:val="clear" w:color="auto" w:fill="auto"/>
                   <w:noWrap/>
                   <w:vAlign w:val="bottom"/>
                   <w:hideMark/>
@@ -18803,7 +18488,6 @@
                     <w:bottom w:val="nil"/>
                     <w:right w:val="nil"/>
                   </w:tcBorders>
-                  <w:shd w:val="clear" w:color="auto" w:fill="auto"/>
                   <w:noWrap/>
                   <w:vAlign w:val="bottom"/>
                   <w:hideMark/>
@@ -18844,7 +18528,6 @@
                     <w:bottom w:val="nil"/>
                     <w:right w:val="single" w:sz="4" w:space="0" w:color="auto"/>
                   </w:tcBorders>
-                  <w:shd w:val="clear" w:color="auto" w:fill="auto"/>
                   <w:noWrap/>
                   <w:vAlign w:val="bottom"/>
                   <w:hideMark/>
@@ -18879,7 +18562,6 @@
                     <w:bottom w:val="nil"/>
                     <w:right w:val="single" w:sz="4" w:space="0" w:color="auto"/>
                   </w:tcBorders>
-                  <w:shd w:val="clear" w:color="auto" w:fill="auto"/>
                   <w:noWrap/>
                   <w:vAlign w:val="bottom"/>
                   <w:hideMark/>
@@ -18916,7 +18598,6 @@
                     <w:bottom w:val="nil"/>
                     <w:right w:val="single" w:sz="4" w:space="0" w:color="auto"/>
                   </w:tcBorders>
-                  <w:shd w:val="clear" w:color="auto" w:fill="auto"/>
                   <w:noWrap/>
                   <w:vAlign w:val="bottom"/>
                   <w:hideMark/>
@@ -18952,7 +18633,6 @@
                     <w:bottom w:val="nil"/>
                     <w:right w:val="single" w:sz="4" w:space="0" w:color="auto"/>
                   </w:tcBorders>
-                  <w:shd w:val="clear" w:color="auto" w:fill="auto"/>
                   <w:noWrap/>
                   <w:vAlign w:val="bottom"/>
                   <w:hideMark/>
@@ -18988,7 +18668,6 @@
                     <w:bottom w:val="nil"/>
                     <w:right w:val="single" w:sz="4" w:space="0" w:color="auto"/>
                   </w:tcBorders>
-                  <w:shd w:val="clear" w:color="auto" w:fill="auto"/>
                   <w:noWrap/>
                   <w:vAlign w:val="bottom"/>
                   <w:hideMark/>
@@ -19024,7 +18703,6 @@
                     <w:bottom w:val="nil"/>
                     <w:right w:val="nil"/>
                   </w:tcBorders>
-                  <w:shd w:val="clear" w:color="auto" w:fill="auto"/>
                   <w:noWrap/>
                   <w:vAlign w:val="bottom"/>
                   <w:hideMark/>
@@ -19065,7 +18743,6 @@
                     <w:bottom w:val="nil"/>
                     <w:right w:val="single" w:sz="4" w:space="0" w:color="auto"/>
                   </w:tcBorders>
-                  <w:shd w:val="clear" w:color="auto" w:fill="auto"/>
                   <w:noWrap/>
                   <w:vAlign w:val="bottom"/>
                   <w:hideMark/>
@@ -19100,7 +18777,6 @@
                     <w:bottom w:val="nil"/>
                     <w:right w:val="single" w:sz="4" w:space="0" w:color="auto"/>
                   </w:tcBorders>
-                  <w:shd w:val="clear" w:color="auto" w:fill="auto"/>
                   <w:noWrap/>
                   <w:vAlign w:val="bottom"/>
                   <w:hideMark/>
@@ -19137,7 +18813,6 @@
                     <w:bottom w:val="nil"/>
                     <w:right w:val="single" w:sz="4" w:space="0" w:color="auto"/>
                   </w:tcBorders>
-                  <w:shd w:val="clear" w:color="auto" w:fill="auto"/>
                   <w:noWrap/>
                   <w:vAlign w:val="bottom"/>
                   <w:hideMark/>
@@ -19173,7 +18848,6 @@
                     <w:bottom w:val="nil"/>
                     <w:right w:val="single" w:sz="4" w:space="0" w:color="auto"/>
                   </w:tcBorders>
-                  <w:shd w:val="clear" w:color="auto" w:fill="auto"/>
                   <w:noWrap/>
                   <w:vAlign w:val="bottom"/>
                   <w:hideMark/>
@@ -19209,7 +18883,6 @@
                     <w:bottom w:val="nil"/>
                     <w:right w:val="single" w:sz="4" w:space="0" w:color="auto"/>
                   </w:tcBorders>
-                  <w:shd w:val="clear" w:color="auto" w:fill="auto"/>
                   <w:noWrap/>
                   <w:vAlign w:val="bottom"/>
                   <w:hideMark/>
@@ -19245,7 +18918,6 @@
                     <w:bottom w:val="nil"/>
                     <w:right w:val="nil"/>
                   </w:tcBorders>
-                  <w:shd w:val="clear" w:color="auto" w:fill="auto"/>
                   <w:noWrap/>
                   <w:vAlign w:val="bottom"/>
                   <w:hideMark/>
@@ -19286,7 +18958,6 @@
                     <w:bottom w:val="nil"/>
                     <w:right w:val="single" w:sz="4" w:space="0" w:color="auto"/>
                   </w:tcBorders>
-                  <w:shd w:val="clear" w:color="auto" w:fill="auto"/>
                   <w:noWrap/>
                   <w:vAlign w:val="bottom"/>
                   <w:hideMark/>
@@ -19321,7 +18992,6 @@
                     <w:bottom w:val="nil"/>
                     <w:right w:val="single" w:sz="4" w:space="0" w:color="auto"/>
                   </w:tcBorders>
-                  <w:shd w:val="clear" w:color="auto" w:fill="auto"/>
                   <w:noWrap/>
                   <w:vAlign w:val="bottom"/>
                   <w:hideMark/>
@@ -19358,7 +19028,6 @@
                     <w:bottom w:val="nil"/>
                     <w:right w:val="single" w:sz="4" w:space="0" w:color="auto"/>
                   </w:tcBorders>
-                  <w:shd w:val="clear" w:color="auto" w:fill="auto"/>
                   <w:noWrap/>
                   <w:vAlign w:val="bottom"/>
                   <w:hideMark/>
@@ -19394,7 +19063,6 @@
                     <w:bottom w:val="nil"/>
                     <w:right w:val="single" w:sz="4" w:space="0" w:color="auto"/>
                   </w:tcBorders>
-                  <w:shd w:val="clear" w:color="auto" w:fill="auto"/>
                   <w:noWrap/>
                   <w:vAlign w:val="bottom"/>
                   <w:hideMark/>
@@ -19430,7 +19098,6 @@
                     <w:bottom w:val="nil"/>
                     <w:right w:val="single" w:sz="4" w:space="0" w:color="auto"/>
                   </w:tcBorders>
-                  <w:shd w:val="clear" w:color="auto" w:fill="auto"/>
                   <w:noWrap/>
                   <w:vAlign w:val="bottom"/>
                   <w:hideMark/>
@@ -19466,7 +19133,6 @@
                     <w:bottom w:val="nil"/>
                     <w:right w:val="nil"/>
                   </w:tcBorders>
-                  <w:shd w:val="clear" w:color="auto" w:fill="auto"/>
                   <w:noWrap/>
                   <w:vAlign w:val="bottom"/>
                   <w:hideMark/>
@@ -19507,7 +19173,6 @@
                     <w:bottom w:val="nil"/>
                     <w:right w:val="single" w:sz="4" w:space="0" w:color="auto"/>
                   </w:tcBorders>
-                  <w:shd w:val="clear" w:color="auto" w:fill="auto"/>
                   <w:noWrap/>
                   <w:vAlign w:val="bottom"/>
                   <w:hideMark/>
@@ -19529,27 +19194,7 @@
                       <w:sz w:val="18"/>
                       <w:szCs w:val="18"/>
                     </w:rPr>
-                    <w:t xml:space="preserve">Urbana </w:t>
-                  </w:r>
-                  <w:proofErr w:type="gramStart"/>
-                  <w:r>
-                    <w:rPr>
-                      <w:rFonts w:ascii="Aptos Narrow" w:eastAsia="Times New Roman" w:hAnsi="Aptos Narrow" w:cs="Times New Roman"/>
-                      <w:color w:val="000000"/>
-                      <w:sz w:val="18"/>
-                      <w:szCs w:val="18"/>
-                    </w:rPr>
-                    <w:t>x Durante</w:t>
-                  </w:r>
-                  <w:proofErr w:type="gramEnd"/>
-                  <w:r>
-                    <w:rPr>
-                      <w:rFonts w:ascii="Aptos Narrow" w:eastAsia="Times New Roman" w:hAnsi="Aptos Narrow" w:cs="Times New Roman"/>
-                      <w:color w:val="000000"/>
-                      <w:sz w:val="18"/>
-                      <w:szCs w:val="18"/>
-                    </w:rPr>
-                    <w:t xml:space="preserve"> pandemia</w:t>
+                    <w:t>Urbana x Durante pandemia</w:t>
                   </w:r>
                 </w:p>
               </w:tc>
@@ -19562,7 +19207,6 @@
                     <w:bottom w:val="nil"/>
                     <w:right w:val="single" w:sz="4" w:space="0" w:color="auto"/>
                   </w:tcBorders>
-                  <w:shd w:val="clear" w:color="auto" w:fill="auto"/>
                   <w:noWrap/>
                   <w:vAlign w:val="bottom"/>
                   <w:hideMark/>
@@ -19599,7 +19243,6 @@
                     <w:bottom w:val="nil"/>
                     <w:right w:val="single" w:sz="4" w:space="0" w:color="auto"/>
                   </w:tcBorders>
-                  <w:shd w:val="clear" w:color="auto" w:fill="auto"/>
                   <w:noWrap/>
                   <w:vAlign w:val="bottom"/>
                   <w:hideMark/>
@@ -19635,7 +19278,6 @@
                     <w:bottom w:val="nil"/>
                     <w:right w:val="single" w:sz="4" w:space="0" w:color="auto"/>
                   </w:tcBorders>
-                  <w:shd w:val="clear" w:color="auto" w:fill="auto"/>
                   <w:noWrap/>
                   <w:vAlign w:val="bottom"/>
                   <w:hideMark/>
@@ -19671,7 +19313,6 @@
                     <w:bottom w:val="nil"/>
                     <w:right w:val="single" w:sz="4" w:space="0" w:color="auto"/>
                   </w:tcBorders>
-                  <w:shd w:val="clear" w:color="auto" w:fill="auto"/>
                   <w:noWrap/>
                   <w:vAlign w:val="bottom"/>
                   <w:hideMark/>
@@ -19707,7 +19348,6 @@
                     <w:bottom w:val="nil"/>
                     <w:right w:val="nil"/>
                   </w:tcBorders>
-                  <w:shd w:val="clear" w:color="auto" w:fill="auto"/>
                   <w:noWrap/>
                   <w:vAlign w:val="bottom"/>
                   <w:hideMark/>
@@ -19748,7 +19388,6 @@
                     <w:bottom w:val="nil"/>
                     <w:right w:val="single" w:sz="4" w:space="0" w:color="auto"/>
                   </w:tcBorders>
-                  <w:shd w:val="clear" w:color="auto" w:fill="auto"/>
                   <w:noWrap/>
                   <w:vAlign w:val="bottom"/>
                   <w:hideMark/>
@@ -19783,7 +19422,6 @@
                     <w:bottom w:val="nil"/>
                     <w:right w:val="single" w:sz="4" w:space="0" w:color="auto"/>
                   </w:tcBorders>
-                  <w:shd w:val="clear" w:color="auto" w:fill="auto"/>
                   <w:noWrap/>
                   <w:vAlign w:val="bottom"/>
                   <w:hideMark/>
@@ -19820,7 +19458,6 @@
                     <w:bottom w:val="nil"/>
                     <w:right w:val="single" w:sz="4" w:space="0" w:color="auto"/>
                   </w:tcBorders>
-                  <w:shd w:val="clear" w:color="auto" w:fill="auto"/>
                   <w:noWrap/>
                   <w:vAlign w:val="bottom"/>
                   <w:hideMark/>
@@ -19856,7 +19493,6 @@
                     <w:bottom w:val="nil"/>
                     <w:right w:val="single" w:sz="4" w:space="0" w:color="auto"/>
                   </w:tcBorders>
-                  <w:shd w:val="clear" w:color="auto" w:fill="auto"/>
                   <w:noWrap/>
                   <w:vAlign w:val="bottom"/>
                   <w:hideMark/>
@@ -19892,7 +19528,6 @@
                     <w:bottom w:val="nil"/>
                     <w:right w:val="single" w:sz="4" w:space="0" w:color="auto"/>
                   </w:tcBorders>
-                  <w:shd w:val="clear" w:color="auto" w:fill="auto"/>
                   <w:noWrap/>
                   <w:vAlign w:val="bottom"/>
                   <w:hideMark/>
@@ -19928,7 +19563,6 @@
                     <w:bottom w:val="nil"/>
                     <w:right w:val="nil"/>
                   </w:tcBorders>
-                  <w:shd w:val="clear" w:color="auto" w:fill="auto"/>
                   <w:noWrap/>
                   <w:vAlign w:val="bottom"/>
                   <w:hideMark/>
@@ -19969,7 +19603,6 @@
                     <w:bottom w:val="nil"/>
                     <w:right w:val="single" w:sz="4" w:space="0" w:color="auto"/>
                   </w:tcBorders>
-                  <w:shd w:val="clear" w:color="auto" w:fill="auto"/>
                   <w:noWrap/>
                   <w:vAlign w:val="bottom"/>
                   <w:hideMark/>
@@ -19991,27 +19624,7 @@
                       <w:sz w:val="18"/>
                       <w:szCs w:val="18"/>
                     </w:rPr>
-                    <w:t xml:space="preserve">Jovem (18-24) </w:t>
-                  </w:r>
-                  <w:proofErr w:type="gramStart"/>
-                  <w:r>
-                    <w:rPr>
-                      <w:rFonts w:ascii="Aptos Narrow" w:eastAsia="Times New Roman" w:hAnsi="Aptos Narrow" w:cs="Times New Roman"/>
-                      <w:color w:val="000000"/>
-                      <w:sz w:val="18"/>
-                      <w:szCs w:val="18"/>
-                    </w:rPr>
-                    <w:t>x Durante</w:t>
-                  </w:r>
-                  <w:proofErr w:type="gramEnd"/>
-                  <w:r>
-                    <w:rPr>
-                      <w:rFonts w:ascii="Aptos Narrow" w:eastAsia="Times New Roman" w:hAnsi="Aptos Narrow" w:cs="Times New Roman"/>
-                      <w:color w:val="000000"/>
-                      <w:sz w:val="18"/>
-                      <w:szCs w:val="18"/>
-                    </w:rPr>
-                    <w:t xml:space="preserve"> pandemia</w:t>
+                    <w:t>Jovem (18-24) x Durante pandemia</w:t>
                   </w:r>
                 </w:p>
               </w:tc>
@@ -20024,7 +19637,6 @@
                     <w:bottom w:val="nil"/>
                     <w:right w:val="single" w:sz="4" w:space="0" w:color="auto"/>
                   </w:tcBorders>
-                  <w:shd w:val="clear" w:color="auto" w:fill="auto"/>
                   <w:noWrap/>
                   <w:vAlign w:val="bottom"/>
                   <w:hideMark/>
@@ -20061,7 +19673,6 @@
                     <w:bottom w:val="nil"/>
                     <w:right w:val="single" w:sz="4" w:space="0" w:color="auto"/>
                   </w:tcBorders>
-                  <w:shd w:val="clear" w:color="auto" w:fill="auto"/>
                   <w:noWrap/>
                   <w:vAlign w:val="bottom"/>
                   <w:hideMark/>
@@ -20097,7 +19708,6 @@
                     <w:bottom w:val="nil"/>
                     <w:right w:val="single" w:sz="4" w:space="0" w:color="auto"/>
                   </w:tcBorders>
-                  <w:shd w:val="clear" w:color="auto" w:fill="auto"/>
                   <w:noWrap/>
                   <w:vAlign w:val="bottom"/>
                   <w:hideMark/>
@@ -20133,7 +19743,6 @@
                     <w:bottom w:val="nil"/>
                     <w:right w:val="single" w:sz="4" w:space="0" w:color="auto"/>
                   </w:tcBorders>
-                  <w:shd w:val="clear" w:color="auto" w:fill="auto"/>
                   <w:noWrap/>
                   <w:vAlign w:val="bottom"/>
                   <w:hideMark/>
@@ -20169,7 +19778,6 @@
                     <w:bottom w:val="nil"/>
                     <w:right w:val="nil"/>
                   </w:tcBorders>
-                  <w:shd w:val="clear" w:color="auto" w:fill="auto"/>
                   <w:noWrap/>
                   <w:vAlign w:val="bottom"/>
                   <w:hideMark/>
@@ -20210,7 +19818,6 @@
                     <w:bottom w:val="nil"/>
                     <w:right w:val="single" w:sz="4" w:space="0" w:color="auto"/>
                   </w:tcBorders>
-                  <w:shd w:val="clear" w:color="auto" w:fill="auto"/>
                   <w:noWrap/>
                   <w:vAlign w:val="bottom"/>
                   <w:hideMark/>
@@ -20245,7 +19852,6 @@
                     <w:bottom w:val="nil"/>
                     <w:right w:val="single" w:sz="4" w:space="0" w:color="auto"/>
                   </w:tcBorders>
-                  <w:shd w:val="clear" w:color="auto" w:fill="auto"/>
                   <w:noWrap/>
                   <w:vAlign w:val="bottom"/>
                   <w:hideMark/>
@@ -20282,7 +19888,6 @@
                     <w:bottom w:val="nil"/>
                     <w:right w:val="single" w:sz="4" w:space="0" w:color="auto"/>
                   </w:tcBorders>
-                  <w:shd w:val="clear" w:color="auto" w:fill="auto"/>
                   <w:noWrap/>
                   <w:vAlign w:val="bottom"/>
                   <w:hideMark/>
@@ -20318,7 +19923,6 @@
                     <w:bottom w:val="nil"/>
                     <w:right w:val="single" w:sz="4" w:space="0" w:color="auto"/>
                   </w:tcBorders>
-                  <w:shd w:val="clear" w:color="auto" w:fill="auto"/>
                   <w:noWrap/>
                   <w:vAlign w:val="bottom"/>
                   <w:hideMark/>
@@ -20354,7 +19958,6 @@
                     <w:bottom w:val="nil"/>
                     <w:right w:val="single" w:sz="4" w:space="0" w:color="auto"/>
                   </w:tcBorders>
-                  <w:shd w:val="clear" w:color="auto" w:fill="auto"/>
                   <w:noWrap/>
                   <w:vAlign w:val="bottom"/>
                   <w:hideMark/>
@@ -20390,7 +19993,6 @@
                     <w:bottom w:val="nil"/>
                     <w:right w:val="nil"/>
                   </w:tcBorders>
-                  <w:shd w:val="clear" w:color="auto" w:fill="auto"/>
                   <w:noWrap/>
                   <w:vAlign w:val="bottom"/>
                   <w:hideMark/>
@@ -20430,7 +20032,6 @@
                     <w:left w:val="nil"/>
                     <w:right w:val="single" w:sz="4" w:space="0" w:color="auto"/>
                   </w:tcBorders>
-                  <w:shd w:val="clear" w:color="auto" w:fill="auto"/>
                   <w:noWrap/>
                   <w:vAlign w:val="bottom"/>
                   <w:hideMark/>
@@ -20452,27 +20053,7 @@
                       <w:sz w:val="18"/>
                       <w:szCs w:val="18"/>
                     </w:rPr>
-                    <w:t xml:space="preserve">Jovem adulto (19-24) </w:t>
-                  </w:r>
-                  <w:proofErr w:type="gramStart"/>
-                  <w:r>
-                    <w:rPr>
-                      <w:rFonts w:ascii="Aptos Narrow" w:eastAsia="Times New Roman" w:hAnsi="Aptos Narrow" w:cs="Times New Roman"/>
-                      <w:color w:val="000000"/>
-                      <w:sz w:val="18"/>
-                      <w:szCs w:val="18"/>
-                    </w:rPr>
-                    <w:t>x Durante</w:t>
-                  </w:r>
-                  <w:proofErr w:type="gramEnd"/>
-                  <w:r>
-                    <w:rPr>
-                      <w:rFonts w:ascii="Aptos Narrow" w:eastAsia="Times New Roman" w:hAnsi="Aptos Narrow" w:cs="Times New Roman"/>
-                      <w:color w:val="000000"/>
-                      <w:sz w:val="18"/>
-                      <w:szCs w:val="18"/>
-                    </w:rPr>
-                    <w:t xml:space="preserve"> pandemia</w:t>
+                    <w:t>Jovem adulto (19-24) x Durante pandemia</w:t>
                   </w:r>
                 </w:p>
               </w:tc>
@@ -20484,7 +20065,6 @@
                     <w:left w:val="single" w:sz="4" w:space="0" w:color="auto"/>
                     <w:right w:val="single" w:sz="4" w:space="0" w:color="auto"/>
                   </w:tcBorders>
-                  <w:shd w:val="clear" w:color="auto" w:fill="auto"/>
                   <w:noWrap/>
                   <w:vAlign w:val="bottom"/>
                   <w:hideMark/>
@@ -20520,7 +20100,6 @@
                     <w:left w:val="single" w:sz="4" w:space="0" w:color="auto"/>
                     <w:right w:val="single" w:sz="4" w:space="0" w:color="auto"/>
                   </w:tcBorders>
-                  <w:shd w:val="clear" w:color="auto" w:fill="auto"/>
                   <w:noWrap/>
                   <w:vAlign w:val="bottom"/>
                   <w:hideMark/>
@@ -20555,7 +20134,6 @@
                     <w:left w:val="single" w:sz="4" w:space="0" w:color="auto"/>
                     <w:right w:val="single" w:sz="4" w:space="0" w:color="auto"/>
                   </w:tcBorders>
-                  <w:shd w:val="clear" w:color="auto" w:fill="auto"/>
                   <w:noWrap/>
                   <w:vAlign w:val="bottom"/>
                   <w:hideMark/>
@@ -20590,7 +20168,6 @@
                     <w:left w:val="single" w:sz="4" w:space="0" w:color="auto"/>
                     <w:right w:val="single" w:sz="4" w:space="0" w:color="auto"/>
                   </w:tcBorders>
-                  <w:shd w:val="clear" w:color="auto" w:fill="auto"/>
                   <w:noWrap/>
                   <w:vAlign w:val="bottom"/>
                   <w:hideMark/>
@@ -20625,7 +20202,6 @@
                     <w:left w:val="single" w:sz="4" w:space="0" w:color="auto"/>
                     <w:right w:val="nil"/>
                   </w:tcBorders>
-                  <w:shd w:val="clear" w:color="auto" w:fill="auto"/>
                   <w:noWrap/>
                   <w:vAlign w:val="bottom"/>
                   <w:hideMark/>
@@ -20666,7 +20242,6 @@
                     <w:bottom w:val="single" w:sz="4" w:space="0" w:color="auto"/>
                     <w:right w:val="single" w:sz="4" w:space="0" w:color="auto"/>
                   </w:tcBorders>
-                  <w:shd w:val="clear" w:color="auto" w:fill="auto"/>
                   <w:noWrap/>
                   <w:vAlign w:val="bottom"/>
                   <w:hideMark/>
@@ -20701,7 +20276,6 @@
                     <w:bottom w:val="single" w:sz="4" w:space="0" w:color="auto"/>
                     <w:right w:val="single" w:sz="4" w:space="0" w:color="auto"/>
                   </w:tcBorders>
-                  <w:shd w:val="clear" w:color="auto" w:fill="auto"/>
                   <w:noWrap/>
                   <w:vAlign w:val="bottom"/>
                   <w:hideMark/>
@@ -20738,7 +20312,6 @@
                     <w:bottom w:val="single" w:sz="4" w:space="0" w:color="auto"/>
                     <w:right w:val="single" w:sz="4" w:space="0" w:color="auto"/>
                   </w:tcBorders>
-                  <w:shd w:val="clear" w:color="auto" w:fill="auto"/>
                   <w:noWrap/>
                   <w:vAlign w:val="bottom"/>
                   <w:hideMark/>
@@ -20774,7 +20347,6 @@
                     <w:bottom w:val="single" w:sz="4" w:space="0" w:color="auto"/>
                     <w:right w:val="single" w:sz="4" w:space="0" w:color="auto"/>
                   </w:tcBorders>
-                  <w:shd w:val="clear" w:color="auto" w:fill="auto"/>
                   <w:noWrap/>
                   <w:vAlign w:val="bottom"/>
                   <w:hideMark/>
@@ -20810,7 +20382,6 @@
                     <w:bottom w:val="single" w:sz="4" w:space="0" w:color="auto"/>
                     <w:right w:val="single" w:sz="4" w:space="0" w:color="auto"/>
                   </w:tcBorders>
-                  <w:shd w:val="clear" w:color="auto" w:fill="auto"/>
                   <w:noWrap/>
                   <w:vAlign w:val="bottom"/>
                   <w:hideMark/>
@@ -20846,7 +20417,6 @@
                     <w:bottom w:val="single" w:sz="4" w:space="0" w:color="auto"/>
                     <w:right w:val="nil"/>
                   </w:tcBorders>
-                  <w:shd w:val="clear" w:color="auto" w:fill="auto"/>
                   <w:noWrap/>
                   <w:vAlign w:val="bottom"/>
                   <w:hideMark/>
@@ -20887,7 +20457,6 @@
                     <w:bottom w:val="nil"/>
                     <w:right w:val="single" w:sz="4" w:space="0" w:color="auto"/>
                   </w:tcBorders>
-                  <w:shd w:val="clear" w:color="auto" w:fill="auto"/>
                   <w:noWrap/>
                   <w:vAlign w:val="bottom"/>
                   <w:hideMark/>
@@ -20926,7 +20495,6 @@
                     <w:bottom w:val="nil"/>
                     <w:right w:val="nil"/>
                   </w:tcBorders>
-                  <w:shd w:val="clear" w:color="auto" w:fill="auto"/>
                   <w:noWrap/>
                   <w:vAlign w:val="bottom"/>
                   <w:hideMark/>
@@ -20963,7 +20531,6 @@
                     <w:bottom w:val="nil"/>
                     <w:right w:val="nil"/>
                   </w:tcBorders>
-                  <w:shd w:val="clear" w:color="auto" w:fill="auto"/>
                   <w:noWrap/>
                   <w:vAlign w:val="bottom"/>
                   <w:hideMark/>
@@ -20990,7 +20557,6 @@
                     <w:bottom w:val="nil"/>
                     <w:right w:val="nil"/>
                   </w:tcBorders>
-                  <w:shd w:val="clear" w:color="auto" w:fill="auto"/>
                   <w:noWrap/>
                   <w:vAlign w:val="bottom"/>
                   <w:hideMark/>
@@ -21015,7 +20581,6 @@
                     <w:bottom w:val="nil"/>
                     <w:right w:val="nil"/>
                   </w:tcBorders>
-                  <w:shd w:val="clear" w:color="auto" w:fill="auto"/>
                   <w:noWrap/>
                   <w:vAlign w:val="bottom"/>
                   <w:hideMark/>
@@ -21040,7 +20605,6 @@
                     <w:bottom w:val="nil"/>
                     <w:right w:val="nil"/>
                   </w:tcBorders>
-                  <w:shd w:val="clear" w:color="auto" w:fill="auto"/>
                   <w:noWrap/>
                   <w:vAlign w:val="bottom"/>
                   <w:hideMark/>
@@ -21070,7 +20634,6 @@
                     <w:bottom w:val="nil"/>
                     <w:right w:val="single" w:sz="4" w:space="0" w:color="auto"/>
                   </w:tcBorders>
-                  <w:shd w:val="clear" w:color="auto" w:fill="auto"/>
                   <w:noWrap/>
                   <w:vAlign w:val="bottom"/>
                   <w:hideMark/>
@@ -21109,7 +20672,6 @@
                     <w:bottom w:val="nil"/>
                     <w:right w:val="nil"/>
                   </w:tcBorders>
-                  <w:shd w:val="clear" w:color="auto" w:fill="auto"/>
                   <w:noWrap/>
                   <w:vAlign w:val="bottom"/>
                   <w:hideMark/>
@@ -21146,7 +20708,6 @@
                     <w:bottom w:val="nil"/>
                     <w:right w:val="nil"/>
                   </w:tcBorders>
-                  <w:shd w:val="clear" w:color="auto" w:fill="auto"/>
                   <w:noWrap/>
                   <w:vAlign w:val="bottom"/>
                   <w:hideMark/>
@@ -21173,7 +20734,6 @@
                     <w:bottom w:val="nil"/>
                     <w:right w:val="nil"/>
                   </w:tcBorders>
-                  <w:shd w:val="clear" w:color="auto" w:fill="auto"/>
                   <w:noWrap/>
                   <w:vAlign w:val="bottom"/>
                   <w:hideMark/>
@@ -21198,7 +20758,6 @@
                     <w:bottom w:val="nil"/>
                     <w:right w:val="nil"/>
                   </w:tcBorders>
-                  <w:shd w:val="clear" w:color="auto" w:fill="auto"/>
                   <w:noWrap/>
                   <w:vAlign w:val="bottom"/>
                   <w:hideMark/>
@@ -21223,7 +20782,6 @@
                     <w:bottom w:val="nil"/>
                     <w:right w:val="nil"/>
                   </w:tcBorders>
-                  <w:shd w:val="clear" w:color="auto" w:fill="auto"/>
                   <w:noWrap/>
                   <w:vAlign w:val="bottom"/>
                   <w:hideMark/>
@@ -21253,7 +20811,6 @@
                     <w:bottom w:val="nil"/>
                     <w:right w:val="single" w:sz="4" w:space="0" w:color="auto"/>
                   </w:tcBorders>
-                  <w:shd w:val="clear" w:color="auto" w:fill="auto"/>
                   <w:noWrap/>
                   <w:vAlign w:val="bottom"/>
                   <w:hideMark/>
@@ -21292,7 +20849,6 @@
                     <w:bottom w:val="nil"/>
                     <w:right w:val="nil"/>
                   </w:tcBorders>
-                  <w:shd w:val="clear" w:color="auto" w:fill="auto"/>
                   <w:noWrap/>
                   <w:vAlign w:val="bottom"/>
                   <w:hideMark/>
@@ -21329,7 +20885,6 @@
                     <w:bottom w:val="nil"/>
                     <w:right w:val="nil"/>
                   </w:tcBorders>
-                  <w:shd w:val="clear" w:color="auto" w:fill="auto"/>
                   <w:noWrap/>
                   <w:vAlign w:val="bottom"/>
                   <w:hideMark/>
@@ -21356,7 +20911,6 @@
                     <w:bottom w:val="nil"/>
                     <w:right w:val="nil"/>
                   </w:tcBorders>
-                  <w:shd w:val="clear" w:color="auto" w:fill="auto"/>
                   <w:noWrap/>
                   <w:vAlign w:val="bottom"/>
                   <w:hideMark/>
@@ -21381,7 +20935,6 @@
                     <w:bottom w:val="single" w:sz="12" w:space="0" w:color="auto"/>
                     <w:right w:val="nil"/>
                   </w:tcBorders>
-                  <w:shd w:val="clear" w:color="auto" w:fill="auto"/>
                   <w:noWrap/>
                   <w:vAlign w:val="bottom"/>
                   <w:hideMark/>
@@ -21416,7 +20969,6 @@
                     <w:bottom w:val="nil"/>
                     <w:right w:val="nil"/>
                   </w:tcBorders>
-                  <w:shd w:val="clear" w:color="auto" w:fill="auto"/>
                   <w:noWrap/>
                   <w:vAlign w:val="bottom"/>
                   <w:hideMark/>
@@ -21840,25 +21392,7 @@
           <w:color w:val="000000"/>
           <w:szCs w:val="24"/>
         </w:rPr>
-        <w:t xml:space="preserve">O modelo DIF-in-DIF mostrou que a pandemia penalizou de forma desproporcional os pardos e, em menor medida, pretos e mulheres, mas apenas as mulheres apresentaram recuperação total </w:t>
-      </w:r>
-      <w:proofErr w:type="gramStart"/>
-      <w:r>
-        <w:rPr>
-          <w:rFonts w:eastAsia="Times New Roman" w:cs="Times New Roman"/>
-          <w:color w:val="000000"/>
-          <w:szCs w:val="24"/>
-        </w:rPr>
-        <w:t>no pós</w:t>
-      </w:r>
-      <w:proofErr w:type="gramEnd"/>
-      <w:r>
-        <w:rPr>
-          <w:rFonts w:eastAsia="Times New Roman" w:cs="Times New Roman"/>
-          <w:color w:val="000000"/>
-          <w:szCs w:val="24"/>
-        </w:rPr>
-        <w:t>.</w:t>
+        <w:t>O modelo DIF-in-DIF mostrou que a pandemia penalizou de forma desproporcional os pardos e, em menor medida, pretos e mulheres, mas apenas as mulheres apresentaram recuperação total no pós.</w:t>
       </w:r>
       <w:r>
         <w:rPr>
@@ -21899,7 +21433,6 @@
         <w:tc>
           <w:tcPr>
             <w:tcW w:w="1540" w:type="dxa"/>
-            <w:shd w:val="clear" w:color="auto" w:fill="auto"/>
             <w:vAlign w:val="center"/>
             <w:hideMark/>
           </w:tcPr>
@@ -21930,7 +21463,6 @@
         <w:tc>
           <w:tcPr>
             <w:tcW w:w="3640" w:type="dxa"/>
-            <w:shd w:val="clear" w:color="auto" w:fill="auto"/>
             <w:vAlign w:val="center"/>
             <w:hideMark/>
           </w:tcPr>
@@ -21961,7 +21493,6 @@
         <w:tc>
           <w:tcPr>
             <w:tcW w:w="3368" w:type="dxa"/>
-            <w:shd w:val="clear" w:color="auto" w:fill="auto"/>
             <w:vAlign w:val="center"/>
             <w:hideMark/>
           </w:tcPr>
@@ -21997,7 +21528,6 @@
         <w:tc>
           <w:tcPr>
             <w:tcW w:w="1540" w:type="dxa"/>
-            <w:shd w:val="clear" w:color="auto" w:fill="auto"/>
             <w:vAlign w:val="center"/>
             <w:hideMark/>
           </w:tcPr>
@@ -22027,7 +21557,6 @@
         <w:tc>
           <w:tcPr>
             <w:tcW w:w="3640" w:type="dxa"/>
-            <w:shd w:val="clear" w:color="auto" w:fill="auto"/>
             <w:vAlign w:val="center"/>
             <w:hideMark/>
           </w:tcPr>
@@ -22053,7 +21582,6 @@
         <w:tc>
           <w:tcPr>
             <w:tcW w:w="3368" w:type="dxa"/>
-            <w:shd w:val="clear" w:color="auto" w:fill="auto"/>
             <w:vAlign w:val="center"/>
             <w:hideMark/>
           </w:tcPr>
@@ -22072,25 +21600,7 @@
                 <w:color w:val="000000"/>
                 <w:sz w:val="22"/>
               </w:rPr>
-              <w:t xml:space="preserve">Recuperadas (sem efeito </w:t>
-            </w:r>
-            <w:proofErr w:type="gramStart"/>
-            <w:r>
-              <w:rPr>
-                <w:rFonts w:ascii="Aptos Narrow" w:eastAsia="Times New Roman" w:hAnsi="Aptos Narrow" w:cs="Times New Roman"/>
-                <w:color w:val="000000"/>
-                <w:sz w:val="22"/>
-              </w:rPr>
-              <w:t>no pós</w:t>
-            </w:r>
-            <w:proofErr w:type="gramEnd"/>
-            <w:r>
-              <w:rPr>
-                <w:rFonts w:ascii="Aptos Narrow" w:eastAsia="Times New Roman" w:hAnsi="Aptos Narrow" w:cs="Times New Roman"/>
-                <w:color w:val="000000"/>
-                <w:sz w:val="22"/>
-              </w:rPr>
-              <w:t>)</w:t>
+              <w:t>Recuperadas (sem efeito no pós)</w:t>
             </w:r>
           </w:p>
         </w:tc>
@@ -22102,7 +21612,6 @@
         <w:tc>
           <w:tcPr>
             <w:tcW w:w="1540" w:type="dxa"/>
-            <w:shd w:val="clear" w:color="auto" w:fill="auto"/>
             <w:vAlign w:val="center"/>
             <w:hideMark/>
           </w:tcPr>
@@ -22132,7 +21641,6 @@
         <w:tc>
           <w:tcPr>
             <w:tcW w:w="3640" w:type="dxa"/>
-            <w:shd w:val="clear" w:color="auto" w:fill="auto"/>
             <w:vAlign w:val="center"/>
             <w:hideMark/>
           </w:tcPr>
@@ -22158,7 +21666,6 @@
         <w:tc>
           <w:tcPr>
             <w:tcW w:w="3368" w:type="dxa"/>
-            <w:shd w:val="clear" w:color="auto" w:fill="auto"/>
             <w:vAlign w:val="center"/>
             <w:hideMark/>
           </w:tcPr>
@@ -22189,7 +21696,6 @@
         <w:tc>
           <w:tcPr>
             <w:tcW w:w="1540" w:type="dxa"/>
-            <w:shd w:val="clear" w:color="auto" w:fill="auto"/>
             <w:vAlign w:val="center"/>
             <w:hideMark/>
           </w:tcPr>
@@ -22219,7 +21725,6 @@
         <w:tc>
           <w:tcPr>
             <w:tcW w:w="3640" w:type="dxa"/>
-            <w:shd w:val="clear" w:color="auto" w:fill="auto"/>
             <w:vAlign w:val="center"/>
             <w:hideMark/>
           </w:tcPr>
@@ -22245,7 +21750,6 @@
         <w:tc>
           <w:tcPr>
             <w:tcW w:w="3368" w:type="dxa"/>
-            <w:shd w:val="clear" w:color="auto" w:fill="auto"/>
             <w:vAlign w:val="center"/>
             <w:hideMark/>
           </w:tcPr>
@@ -22264,18 +21768,8 @@
                 <w:color w:val="000000"/>
                 <w:sz w:val="22"/>
               </w:rPr>
-              <w:t xml:space="preserve">Recuperação </w:t>
+              <w:t>Recuperação no pós</w:t>
             </w:r>
-            <w:proofErr w:type="gramStart"/>
-            <w:r>
-              <w:rPr>
-                <w:rFonts w:ascii="Aptos Narrow" w:eastAsia="Times New Roman" w:hAnsi="Aptos Narrow" w:cs="Times New Roman"/>
-                <w:color w:val="000000"/>
-                <w:sz w:val="22"/>
-              </w:rPr>
-              <w:t>no pós</w:t>
-            </w:r>
-            <w:proofErr w:type="gramEnd"/>
           </w:p>
         </w:tc>
       </w:tr>
@@ -22286,7 +21780,6 @@
         <w:tc>
           <w:tcPr>
             <w:tcW w:w="1540" w:type="dxa"/>
-            <w:shd w:val="clear" w:color="auto" w:fill="auto"/>
             <w:vAlign w:val="center"/>
             <w:hideMark/>
           </w:tcPr>
@@ -22317,7 +21810,6 @@
         <w:tc>
           <w:tcPr>
             <w:tcW w:w="3640" w:type="dxa"/>
-            <w:shd w:val="clear" w:color="auto" w:fill="auto"/>
             <w:vAlign w:val="center"/>
             <w:hideMark/>
           </w:tcPr>
@@ -22343,7 +21835,6 @@
         <w:tc>
           <w:tcPr>
             <w:tcW w:w="3368" w:type="dxa"/>
-            <w:shd w:val="clear" w:color="auto" w:fill="auto"/>
             <w:vAlign w:val="center"/>
             <w:hideMark/>
           </w:tcPr>
@@ -22374,7 +21865,6 @@
         <w:tc>
           <w:tcPr>
             <w:tcW w:w="1540" w:type="dxa"/>
-            <w:shd w:val="clear" w:color="auto" w:fill="auto"/>
             <w:vAlign w:val="center"/>
             <w:hideMark/>
           </w:tcPr>
@@ -22404,7 +21894,6 @@
         <w:tc>
           <w:tcPr>
             <w:tcW w:w="3640" w:type="dxa"/>
-            <w:shd w:val="clear" w:color="auto" w:fill="auto"/>
             <w:vAlign w:val="center"/>
             <w:hideMark/>
           </w:tcPr>
@@ -22430,7 +21919,6 @@
         <w:tc>
           <w:tcPr>
             <w:tcW w:w="3368" w:type="dxa"/>
-            <w:shd w:val="clear" w:color="auto" w:fill="auto"/>
             <w:vAlign w:val="center"/>
             <w:hideMark/>
           </w:tcPr>
@@ -22461,7 +21949,6 @@
         <w:tc>
           <w:tcPr>
             <w:tcW w:w="1540" w:type="dxa"/>
-            <w:shd w:val="clear" w:color="auto" w:fill="auto"/>
             <w:vAlign w:val="center"/>
             <w:hideMark/>
           </w:tcPr>
@@ -22491,7 +21978,6 @@
         <w:tc>
           <w:tcPr>
             <w:tcW w:w="3640" w:type="dxa"/>
-            <w:shd w:val="clear" w:color="auto" w:fill="auto"/>
             <w:vAlign w:val="center"/>
             <w:hideMark/>
           </w:tcPr>
@@ -22517,7 +22003,6 @@
         <w:tc>
           <w:tcPr>
             <w:tcW w:w="3368" w:type="dxa"/>
-            <w:shd w:val="clear" w:color="auto" w:fill="auto"/>
             <w:vAlign w:val="center"/>
             <w:hideMark/>
           </w:tcPr>
@@ -22548,7 +22033,6 @@
         <w:tc>
           <w:tcPr>
             <w:tcW w:w="1540" w:type="dxa"/>
-            <w:shd w:val="clear" w:color="auto" w:fill="auto"/>
             <w:vAlign w:val="center"/>
             <w:hideMark/>
           </w:tcPr>
@@ -22578,7 +22062,6 @@
         <w:tc>
           <w:tcPr>
             <w:tcW w:w="3640" w:type="dxa"/>
-            <w:shd w:val="clear" w:color="auto" w:fill="auto"/>
             <w:vAlign w:val="center"/>
             <w:hideMark/>
           </w:tcPr>
@@ -22604,7 +22087,6 @@
         <w:tc>
           <w:tcPr>
             <w:tcW w:w="3368" w:type="dxa"/>
-            <w:shd w:val="clear" w:color="auto" w:fill="auto"/>
             <w:vAlign w:val="center"/>
             <w:hideMark/>
           </w:tcPr>
@@ -25618,15 +25100,16 @@
     <w:p>
       <w:pPr>
         <w:spacing w:line="360" w:lineRule="auto"/>
-        <w:rPr>
-          <w:szCs w:val="24"/>
-        </w:rPr>
-      </w:pPr>
-      <w:r>
-        <w:rPr>
-          <w:szCs w:val="24"/>
-        </w:rPr>
-        <w:t xml:space="preserve">CASTELO BRANCO, P. M.; COMARU, F. D. A.; DA SILVA, S. J. Uberização e Covid-19: esgarçando as contradições do trabalho no século XXI. </w:t>
+        <w:ind w:firstLine="720"/>
+        <w:rPr>
+          <w:szCs w:val="24"/>
+        </w:rPr>
+      </w:pPr>
+      <w:r>
+        <w:rPr>
+          <w:szCs w:val="24"/>
+        </w:rPr>
+        <w:t xml:space="preserve">, F. D. A.; DA SILVA, S. J. Uberização e Covid-19: esgarçando as contradições do trabalho no século XXI. </w:t>
       </w:r>
       <w:r>
         <w:rPr>
@@ -25743,7 +25226,6 @@
         <w:rPr>
           <w:szCs w:val="24"/>
         </w:rPr>
-        <w:lastRenderedPageBreak/>
         <w:t xml:space="preserve">CORSEUIL, C. H. L.; FRANCA, M. P.; POLOPONSKY, K. A INSERÇÃO DOS JOVENS BRASILEIROS NO MERCADO DE TRABALHO NUM CONTEXTO DE RECESSÃO. </w:t>
       </w:r>
       <w:r>
@@ -25772,6 +25254,7 @@
         <w:rPr>
           <w:szCs w:val="24"/>
         </w:rPr>
+        <w:lastRenderedPageBreak/>
         <w:t xml:space="preserve">DA SILVA FILHO, L. A.; FERREIRA DA SILVA, F. J.; NUNES DE QUEIROZ, S. </w:t>
       </w:r>
       <w:proofErr w:type="spellStart"/>
@@ -26388,7 +25871,6 @@
           <w:szCs w:val="24"/>
           <w:lang w:val="en-US"/>
         </w:rPr>
-        <w:lastRenderedPageBreak/>
         <w:t xml:space="preserve">PINHEIRO, D.; RIBEIRO, E.; PEREGRINO, M. School and work: elements to discuss youth in Brazil. </w:t>
       </w:r>
       <w:r>
@@ -26421,6 +25903,7 @@
           <w:szCs w:val="24"/>
           <w:lang w:val="en-US"/>
         </w:rPr>
+        <w:lastRenderedPageBreak/>
         <w:t xml:space="preserve">PISSARIDES, C. A. </w:t>
       </w:r>
       <w:r>
@@ -26665,7 +26148,6 @@
         <w:tc>
           <w:tcPr>
             <w:tcW w:w="1419" w:type="dxa"/>
-            <w:shd w:val="clear" w:color="auto" w:fill="auto"/>
             <w:tcMar>
               <w:top w:w="100" w:type="dxa"/>
               <w:left w:w="100" w:type="dxa"/>
@@ -26698,7 +26180,6 @@
         <w:tc>
           <w:tcPr>
             <w:tcW w:w="1134" w:type="dxa"/>
-            <w:shd w:val="clear" w:color="auto" w:fill="auto"/>
             <w:tcMar>
               <w:top w:w="100" w:type="dxa"/>
               <w:left w:w="100" w:type="dxa"/>
@@ -26768,7 +26249,6 @@
         <w:tc>
           <w:tcPr>
             <w:tcW w:w="1417" w:type="dxa"/>
-            <w:shd w:val="clear" w:color="auto" w:fill="auto"/>
             <w:tcMar>
               <w:top w:w="100" w:type="dxa"/>
               <w:left w:w="100" w:type="dxa"/>
@@ -26820,7 +26300,6 @@
         <w:tc>
           <w:tcPr>
             <w:tcW w:w="1701" w:type="dxa"/>
-            <w:shd w:val="clear" w:color="auto" w:fill="auto"/>
             <w:tcMar>
               <w:top w:w="100" w:type="dxa"/>
               <w:left w:w="100" w:type="dxa"/>
@@ -26861,7 +26340,6 @@
         <w:tc>
           <w:tcPr>
             <w:tcW w:w="1134" w:type="dxa"/>
-            <w:shd w:val="clear" w:color="auto" w:fill="auto"/>
             <w:tcMar>
               <w:top w:w="100" w:type="dxa"/>
               <w:left w:w="100" w:type="dxa"/>
@@ -26931,7 +26409,6 @@
         <w:tc>
           <w:tcPr>
             <w:tcW w:w="992" w:type="dxa"/>
-            <w:shd w:val="clear" w:color="auto" w:fill="auto"/>
             <w:tcMar>
               <w:top w:w="100" w:type="dxa"/>
               <w:left w:w="100" w:type="dxa"/>
@@ -27093,7 +26570,6 @@
         <w:tc>
           <w:tcPr>
             <w:tcW w:w="1419" w:type="dxa"/>
-            <w:shd w:val="clear" w:color="auto" w:fill="auto"/>
             <w:tcMar>
               <w:top w:w="100" w:type="dxa"/>
               <w:left w:w="100" w:type="dxa"/>
@@ -27132,7 +26608,6 @@
         <w:tc>
           <w:tcPr>
             <w:tcW w:w="1134" w:type="dxa"/>
-            <w:shd w:val="clear" w:color="auto" w:fill="auto"/>
             <w:tcMar>
               <w:top w:w="100" w:type="dxa"/>
               <w:left w:w="100" w:type="dxa"/>
@@ -27181,7 +26656,6 @@
         <w:tc>
           <w:tcPr>
             <w:tcW w:w="1417" w:type="dxa"/>
-            <w:shd w:val="clear" w:color="auto" w:fill="auto"/>
             <w:tcMar>
               <w:top w:w="100" w:type="dxa"/>
               <w:left w:w="100" w:type="dxa"/>
@@ -27266,7 +26740,6 @@
         <w:tc>
           <w:tcPr>
             <w:tcW w:w="1701" w:type="dxa"/>
-            <w:shd w:val="clear" w:color="auto" w:fill="auto"/>
             <w:tcMar>
               <w:top w:w="100" w:type="dxa"/>
               <w:left w:w="100" w:type="dxa"/>
@@ -27305,7 +26778,6 @@
         <w:tc>
           <w:tcPr>
             <w:tcW w:w="1134" w:type="dxa"/>
-            <w:shd w:val="clear" w:color="auto" w:fill="auto"/>
             <w:tcMar>
               <w:top w:w="100" w:type="dxa"/>
               <w:left w:w="100" w:type="dxa"/>
@@ -27344,7 +26816,6 @@
         <w:tc>
           <w:tcPr>
             <w:tcW w:w="992" w:type="dxa"/>
-            <w:shd w:val="clear" w:color="auto" w:fill="auto"/>
             <w:tcMar>
               <w:top w:w="100" w:type="dxa"/>
               <w:left w:w="100" w:type="dxa"/>
@@ -27449,7 +26920,6 @@
         <w:tc>
           <w:tcPr>
             <w:tcW w:w="1419" w:type="dxa"/>
-            <w:shd w:val="clear" w:color="auto" w:fill="auto"/>
             <w:tcMar>
               <w:top w:w="100" w:type="dxa"/>
               <w:left w:w="100" w:type="dxa"/>
@@ -27488,7 +26958,6 @@
         <w:tc>
           <w:tcPr>
             <w:tcW w:w="1134" w:type="dxa"/>
-            <w:shd w:val="clear" w:color="auto" w:fill="auto"/>
             <w:tcMar>
               <w:top w:w="100" w:type="dxa"/>
               <w:left w:w="100" w:type="dxa"/>
@@ -27527,7 +26996,6 @@
         <w:tc>
           <w:tcPr>
             <w:tcW w:w="1417" w:type="dxa"/>
-            <w:shd w:val="clear" w:color="auto" w:fill="auto"/>
             <w:tcMar>
               <w:top w:w="100" w:type="dxa"/>
               <w:left w:w="100" w:type="dxa"/>
@@ -27594,7 +27062,6 @@
         <w:tc>
           <w:tcPr>
             <w:tcW w:w="1701" w:type="dxa"/>
-            <w:shd w:val="clear" w:color="auto" w:fill="auto"/>
             <w:tcMar>
               <w:top w:w="100" w:type="dxa"/>
               <w:left w:w="100" w:type="dxa"/>
@@ -27645,7 +27112,6 @@
         <w:tc>
           <w:tcPr>
             <w:tcW w:w="1134" w:type="dxa"/>
-            <w:shd w:val="clear" w:color="auto" w:fill="auto"/>
             <w:tcMar>
               <w:top w:w="100" w:type="dxa"/>
               <w:left w:w="100" w:type="dxa"/>
@@ -27684,7 +27150,6 @@
         <w:tc>
           <w:tcPr>
             <w:tcW w:w="992" w:type="dxa"/>
-            <w:shd w:val="clear" w:color="auto" w:fill="auto"/>
             <w:tcMar>
               <w:top w:w="100" w:type="dxa"/>
               <w:left w:w="100" w:type="dxa"/>
@@ -27789,7 +27254,6 @@
         <w:tc>
           <w:tcPr>
             <w:tcW w:w="1419" w:type="dxa"/>
-            <w:shd w:val="clear" w:color="auto" w:fill="auto"/>
             <w:tcMar>
               <w:top w:w="100" w:type="dxa"/>
               <w:left w:w="100" w:type="dxa"/>
@@ -27828,7 +27292,6 @@
         <w:tc>
           <w:tcPr>
             <w:tcW w:w="1134" w:type="dxa"/>
-            <w:shd w:val="clear" w:color="auto" w:fill="auto"/>
             <w:tcMar>
               <w:top w:w="100" w:type="dxa"/>
               <w:left w:w="100" w:type="dxa"/>
@@ -27867,7 +27330,6 @@
         <w:tc>
           <w:tcPr>
             <w:tcW w:w="1417" w:type="dxa"/>
-            <w:shd w:val="clear" w:color="auto" w:fill="auto"/>
             <w:tcMar>
               <w:top w:w="100" w:type="dxa"/>
               <w:left w:w="100" w:type="dxa"/>
@@ -27917,7 +27379,6 @@
         <w:tc>
           <w:tcPr>
             <w:tcW w:w="1701" w:type="dxa"/>
-            <w:shd w:val="clear" w:color="auto" w:fill="auto"/>
             <w:tcMar>
               <w:top w:w="100" w:type="dxa"/>
               <w:left w:w="100" w:type="dxa"/>
@@ -27967,7 +27428,6 @@
         <w:tc>
           <w:tcPr>
             <w:tcW w:w="1134" w:type="dxa"/>
-            <w:shd w:val="clear" w:color="auto" w:fill="auto"/>
             <w:tcMar>
               <w:top w:w="100" w:type="dxa"/>
               <w:left w:w="100" w:type="dxa"/>
@@ -28006,7 +27466,6 @@
         <w:tc>
           <w:tcPr>
             <w:tcW w:w="992" w:type="dxa"/>
-            <w:shd w:val="clear" w:color="auto" w:fill="auto"/>
             <w:tcMar>
               <w:top w:w="100" w:type="dxa"/>
               <w:left w:w="100" w:type="dxa"/>
@@ -28121,7 +27580,6 @@
         <w:tc>
           <w:tcPr>
             <w:tcW w:w="1419" w:type="dxa"/>
-            <w:shd w:val="clear" w:color="auto" w:fill="auto"/>
             <w:tcMar>
               <w:top w:w="100" w:type="dxa"/>
               <w:left w:w="100" w:type="dxa"/>
@@ -28161,7 +27619,6 @@
         <w:tc>
           <w:tcPr>
             <w:tcW w:w="1134" w:type="dxa"/>
-            <w:shd w:val="clear" w:color="auto" w:fill="auto"/>
             <w:tcMar>
               <w:top w:w="100" w:type="dxa"/>
               <w:left w:w="100" w:type="dxa"/>
@@ -28200,7 +27657,6 @@
         <w:tc>
           <w:tcPr>
             <w:tcW w:w="1417" w:type="dxa"/>
-            <w:shd w:val="clear" w:color="auto" w:fill="auto"/>
             <w:tcMar>
               <w:top w:w="100" w:type="dxa"/>
               <w:left w:w="100" w:type="dxa"/>
@@ -28239,7 +27695,6 @@
         <w:tc>
           <w:tcPr>
             <w:tcW w:w="1701" w:type="dxa"/>
-            <w:shd w:val="clear" w:color="auto" w:fill="auto"/>
             <w:tcMar>
               <w:top w:w="100" w:type="dxa"/>
               <w:left w:w="100" w:type="dxa"/>
@@ -28324,7 +27779,6 @@
         <w:tc>
           <w:tcPr>
             <w:tcW w:w="1134" w:type="dxa"/>
-            <w:shd w:val="clear" w:color="auto" w:fill="auto"/>
             <w:tcMar>
               <w:top w:w="100" w:type="dxa"/>
               <w:left w:w="100" w:type="dxa"/>
@@ -28363,7 +27817,6 @@
         <w:tc>
           <w:tcPr>
             <w:tcW w:w="992" w:type="dxa"/>
-            <w:shd w:val="clear" w:color="auto" w:fill="auto"/>
             <w:tcMar>
               <w:top w:w="100" w:type="dxa"/>
               <w:left w:w="100" w:type="dxa"/>
@@ -28510,7 +27963,6 @@
         <w:tc>
           <w:tcPr>
             <w:tcW w:w="1145" w:type="dxa"/>
-            <w:shd w:val="clear" w:color="auto" w:fill="auto"/>
             <w:tcMar>
               <w:top w:w="100" w:type="dxa"/>
               <w:left w:w="100" w:type="dxa"/>
@@ -28543,7 +27995,6 @@
         <w:tc>
           <w:tcPr>
             <w:tcW w:w="2967" w:type="dxa"/>
-            <w:shd w:val="clear" w:color="auto" w:fill="auto"/>
             <w:tcMar>
               <w:top w:w="100" w:type="dxa"/>
               <w:left w:w="100" w:type="dxa"/>
@@ -28584,7 +28035,6 @@
         <w:tc>
           <w:tcPr>
             <w:tcW w:w="2977" w:type="dxa"/>
-            <w:shd w:val="clear" w:color="auto" w:fill="auto"/>
             <w:tcMar>
               <w:top w:w="100" w:type="dxa"/>
               <w:left w:w="100" w:type="dxa"/>
@@ -28627,7 +28077,6 @@
         <w:tc>
           <w:tcPr>
             <w:tcW w:w="1145" w:type="dxa"/>
-            <w:shd w:val="clear" w:color="auto" w:fill="auto"/>
             <w:tcMar>
               <w:top w:w="100" w:type="dxa"/>
               <w:left w:w="100" w:type="dxa"/>
@@ -28666,7 +28115,6 @@
         <w:tc>
           <w:tcPr>
             <w:tcW w:w="2967" w:type="dxa"/>
-            <w:shd w:val="clear" w:color="auto" w:fill="auto"/>
             <w:tcMar>
               <w:top w:w="100" w:type="dxa"/>
               <w:left w:w="100" w:type="dxa"/>
@@ -28705,7 +28153,6 @@
         <w:tc>
           <w:tcPr>
             <w:tcW w:w="2977" w:type="dxa"/>
-            <w:shd w:val="clear" w:color="auto" w:fill="auto"/>
             <w:tcMar>
               <w:top w:w="100" w:type="dxa"/>
               <w:left w:w="100" w:type="dxa"/>
@@ -28746,7 +28193,6 @@
         <w:tc>
           <w:tcPr>
             <w:tcW w:w="1145" w:type="dxa"/>
-            <w:shd w:val="clear" w:color="auto" w:fill="auto"/>
             <w:tcMar>
               <w:top w:w="100" w:type="dxa"/>
               <w:left w:w="100" w:type="dxa"/>
@@ -28785,7 +28231,6 @@
         <w:tc>
           <w:tcPr>
             <w:tcW w:w="2967" w:type="dxa"/>
-            <w:shd w:val="clear" w:color="auto" w:fill="auto"/>
             <w:tcMar>
               <w:top w:w="100" w:type="dxa"/>
               <w:left w:w="100" w:type="dxa"/>
@@ -28824,7 +28269,6 @@
         <w:tc>
           <w:tcPr>
             <w:tcW w:w="2977" w:type="dxa"/>
-            <w:shd w:val="clear" w:color="auto" w:fill="auto"/>
             <w:tcMar>
               <w:top w:w="100" w:type="dxa"/>
               <w:left w:w="100" w:type="dxa"/>
@@ -28865,7 +28309,6 @@
         <w:tc>
           <w:tcPr>
             <w:tcW w:w="1145" w:type="dxa"/>
-            <w:shd w:val="clear" w:color="auto" w:fill="auto"/>
             <w:tcMar>
               <w:top w:w="100" w:type="dxa"/>
               <w:left w:w="100" w:type="dxa"/>
@@ -28904,7 +28347,6 @@
         <w:tc>
           <w:tcPr>
             <w:tcW w:w="2967" w:type="dxa"/>
-            <w:shd w:val="clear" w:color="auto" w:fill="auto"/>
             <w:tcMar>
               <w:top w:w="100" w:type="dxa"/>
               <w:left w:w="100" w:type="dxa"/>
@@ -28943,7 +28385,6 @@
         <w:tc>
           <w:tcPr>
             <w:tcW w:w="2977" w:type="dxa"/>
-            <w:shd w:val="clear" w:color="auto" w:fill="auto"/>
             <w:tcMar>
               <w:top w:w="100" w:type="dxa"/>
               <w:left w:w="100" w:type="dxa"/>
@@ -28977,7 +28418,6 @@
         <w:tc>
           <w:tcPr>
             <w:tcW w:w="1145" w:type="dxa"/>
-            <w:shd w:val="clear" w:color="auto" w:fill="auto"/>
             <w:tcMar>
               <w:top w:w="100" w:type="dxa"/>
               <w:left w:w="100" w:type="dxa"/>
@@ -29017,7 +28457,6 @@
         <w:tc>
           <w:tcPr>
             <w:tcW w:w="2967" w:type="dxa"/>
-            <w:shd w:val="clear" w:color="auto" w:fill="auto"/>
             <w:tcMar>
               <w:top w:w="100" w:type="dxa"/>
               <w:left w:w="100" w:type="dxa"/>
@@ -29056,7 +28495,6 @@
         <w:tc>
           <w:tcPr>
             <w:tcW w:w="2977" w:type="dxa"/>
-            <w:shd w:val="clear" w:color="auto" w:fill="auto"/>
             <w:tcMar>
               <w:top w:w="100" w:type="dxa"/>
               <w:left w:w="100" w:type="dxa"/>
@@ -29191,7 +28629,6 @@
                     <w:bottom w:val="single" w:sz="4" w:space="0" w:color="auto"/>
                     <w:right w:val="single" w:sz="4" w:space="0" w:color="000000"/>
                   </w:tcBorders>
-                  <w:shd w:val="clear" w:color="auto" w:fill="auto"/>
                   <w:noWrap/>
                   <w:vAlign w:val="bottom"/>
                   <w:hideMark/>
@@ -29240,7 +28677,6 @@
                     <w:bottom w:val="single" w:sz="4" w:space="0" w:color="auto"/>
                     <w:right w:val="single" w:sz="4" w:space="0" w:color="000000"/>
                   </w:tcBorders>
-                  <w:shd w:val="clear" w:color="auto" w:fill="auto"/>
                   <w:noWrap/>
                   <w:vAlign w:val="bottom"/>
                   <w:hideMark/>
@@ -29278,7 +28714,6 @@
                     <w:bottom w:val="single" w:sz="4" w:space="0" w:color="auto"/>
                     <w:right w:val="single" w:sz="4" w:space="0" w:color="000000"/>
                   </w:tcBorders>
-                  <w:shd w:val="clear" w:color="auto" w:fill="auto"/>
                   <w:noWrap/>
                   <w:vAlign w:val="bottom"/>
                   <w:hideMark/>
@@ -29320,7 +28755,6 @@
                     <w:bottom w:val="single" w:sz="4" w:space="0" w:color="auto"/>
                     <w:right w:val="single" w:sz="4" w:space="0" w:color="auto"/>
                   </w:tcBorders>
-                  <w:shd w:val="clear" w:color="auto" w:fill="auto"/>
                   <w:noWrap/>
                   <w:vAlign w:val="bottom"/>
                   <w:hideMark/>
@@ -29357,7 +28791,6 @@
                     <w:bottom w:val="single" w:sz="4" w:space="0" w:color="auto"/>
                     <w:right w:val="single" w:sz="4" w:space="0" w:color="auto"/>
                   </w:tcBorders>
-                  <w:shd w:val="clear" w:color="auto" w:fill="auto"/>
                   <w:noWrap/>
                   <w:vAlign w:val="bottom"/>
                   <w:hideMark/>
@@ -29394,7 +28827,6 @@
                     <w:bottom w:val="single" w:sz="4" w:space="0" w:color="auto"/>
                     <w:right w:val="single" w:sz="4" w:space="0" w:color="auto"/>
                   </w:tcBorders>
-                  <w:shd w:val="clear" w:color="auto" w:fill="auto"/>
                   <w:noWrap/>
                   <w:vAlign w:val="bottom"/>
                   <w:hideMark/>
@@ -29431,7 +28863,6 @@
                     <w:bottom w:val="single" w:sz="4" w:space="0" w:color="auto"/>
                     <w:right w:val="single" w:sz="4" w:space="0" w:color="auto"/>
                   </w:tcBorders>
-                  <w:shd w:val="clear" w:color="auto" w:fill="auto"/>
                   <w:noWrap/>
                   <w:vAlign w:val="bottom"/>
                   <w:hideMark/>
@@ -29468,7 +28899,6 @@
                     <w:bottom w:val="single" w:sz="4" w:space="0" w:color="auto"/>
                     <w:right w:val="single" w:sz="4" w:space="0" w:color="auto"/>
                   </w:tcBorders>
-                  <w:shd w:val="clear" w:color="auto" w:fill="auto"/>
                   <w:noWrap/>
                   <w:vAlign w:val="bottom"/>
                   <w:hideMark/>
@@ -29505,7 +28935,6 @@
                     <w:bottom w:val="single" w:sz="4" w:space="0" w:color="auto"/>
                     <w:right w:val="single" w:sz="4" w:space="0" w:color="auto"/>
                   </w:tcBorders>
-                  <w:shd w:val="clear" w:color="auto" w:fill="auto"/>
                   <w:noWrap/>
                   <w:vAlign w:val="bottom"/>
                   <w:hideMark/>
@@ -29542,7 +28971,6 @@
                     <w:bottom w:val="single" w:sz="4" w:space="0" w:color="auto"/>
                     <w:right w:val="single" w:sz="4" w:space="0" w:color="auto"/>
                   </w:tcBorders>
-                  <w:shd w:val="clear" w:color="auto" w:fill="auto"/>
                   <w:noWrap/>
                   <w:vAlign w:val="bottom"/>
                   <w:hideMark/>
@@ -29584,7 +29012,6 @@
                     <w:bottom w:val="single" w:sz="4" w:space="0" w:color="auto"/>
                     <w:right w:val="single" w:sz="4" w:space="0" w:color="auto"/>
                   </w:tcBorders>
-                  <w:shd w:val="clear" w:color="auto" w:fill="auto"/>
                   <w:noWrap/>
                   <w:vAlign w:val="bottom"/>
                   <w:hideMark/>
@@ -29621,7 +29048,6 @@
                     <w:bottom w:val="single" w:sz="4" w:space="0" w:color="auto"/>
                     <w:right w:val="single" w:sz="4" w:space="0" w:color="auto"/>
                   </w:tcBorders>
-                  <w:shd w:val="clear" w:color="auto" w:fill="auto"/>
                   <w:noWrap/>
                   <w:vAlign w:val="bottom"/>
                   <w:hideMark/>
@@ -29658,7 +29084,6 @@
                     <w:bottom w:val="single" w:sz="4" w:space="0" w:color="auto"/>
                     <w:right w:val="single" w:sz="4" w:space="0" w:color="auto"/>
                   </w:tcBorders>
-                  <w:shd w:val="clear" w:color="auto" w:fill="auto"/>
                   <w:noWrap/>
                   <w:vAlign w:val="bottom"/>
                   <w:hideMark/>
@@ -29695,7 +29120,6 @@
                     <w:bottom w:val="single" w:sz="4" w:space="0" w:color="auto"/>
                     <w:right w:val="single" w:sz="4" w:space="0" w:color="auto"/>
                   </w:tcBorders>
-                  <w:shd w:val="clear" w:color="auto" w:fill="auto"/>
                   <w:noWrap/>
                   <w:vAlign w:val="bottom"/>
                   <w:hideMark/>
@@ -29732,7 +29156,6 @@
                     <w:bottom w:val="single" w:sz="4" w:space="0" w:color="auto"/>
                     <w:right w:val="single" w:sz="4" w:space="0" w:color="auto"/>
                   </w:tcBorders>
-                  <w:shd w:val="clear" w:color="auto" w:fill="auto"/>
                   <w:noWrap/>
                   <w:vAlign w:val="bottom"/>
                   <w:hideMark/>
@@ -29769,7 +29192,6 @@
                     <w:bottom w:val="single" w:sz="4" w:space="0" w:color="auto"/>
                     <w:right w:val="single" w:sz="4" w:space="0" w:color="auto"/>
                   </w:tcBorders>
-                  <w:shd w:val="clear" w:color="auto" w:fill="auto"/>
                   <w:noWrap/>
                   <w:vAlign w:val="bottom"/>
                   <w:hideMark/>
@@ -29806,7 +29228,6 @@
                     <w:bottom w:val="single" w:sz="4" w:space="0" w:color="auto"/>
                     <w:right w:val="single" w:sz="4" w:space="0" w:color="auto"/>
                   </w:tcBorders>
-                  <w:shd w:val="clear" w:color="auto" w:fill="auto"/>
                   <w:noWrap/>
                   <w:vAlign w:val="bottom"/>
                   <w:hideMark/>
@@ -29848,7 +29269,6 @@
                     <w:bottom w:val="single" w:sz="4" w:space="0" w:color="auto"/>
                     <w:right w:val="single" w:sz="4" w:space="0" w:color="auto"/>
                   </w:tcBorders>
-                  <w:shd w:val="clear" w:color="auto" w:fill="auto"/>
                   <w:noWrap/>
                   <w:vAlign w:val="bottom"/>
                   <w:hideMark/>
@@ -29885,7 +29305,6 @@
                     <w:bottom w:val="single" w:sz="4" w:space="0" w:color="auto"/>
                     <w:right w:val="single" w:sz="4" w:space="0" w:color="auto"/>
                   </w:tcBorders>
-                  <w:shd w:val="clear" w:color="auto" w:fill="auto"/>
                   <w:noWrap/>
                   <w:vAlign w:val="bottom"/>
                   <w:hideMark/>
@@ -29922,7 +29341,6 @@
                     <w:bottom w:val="single" w:sz="4" w:space="0" w:color="auto"/>
                     <w:right w:val="single" w:sz="4" w:space="0" w:color="auto"/>
                   </w:tcBorders>
-                  <w:shd w:val="clear" w:color="auto" w:fill="auto"/>
                   <w:noWrap/>
                   <w:vAlign w:val="bottom"/>
                   <w:hideMark/>
@@ -29959,7 +29377,6 @@
                     <w:bottom w:val="single" w:sz="4" w:space="0" w:color="auto"/>
                     <w:right w:val="single" w:sz="4" w:space="0" w:color="auto"/>
                   </w:tcBorders>
-                  <w:shd w:val="clear" w:color="auto" w:fill="auto"/>
                   <w:noWrap/>
                   <w:vAlign w:val="bottom"/>
                   <w:hideMark/>
@@ -29996,7 +29413,6 @@
                     <w:bottom w:val="single" w:sz="4" w:space="0" w:color="auto"/>
                     <w:right w:val="single" w:sz="4" w:space="0" w:color="auto"/>
                   </w:tcBorders>
-                  <w:shd w:val="clear" w:color="auto" w:fill="auto"/>
                   <w:noWrap/>
                   <w:vAlign w:val="bottom"/>
                   <w:hideMark/>
@@ -30033,7 +29449,6 @@
                     <w:bottom w:val="single" w:sz="4" w:space="0" w:color="auto"/>
                     <w:right w:val="single" w:sz="4" w:space="0" w:color="auto"/>
                   </w:tcBorders>
-                  <w:shd w:val="clear" w:color="auto" w:fill="auto"/>
                   <w:noWrap/>
                   <w:vAlign w:val="bottom"/>
                   <w:hideMark/>
@@ -30070,7 +29485,6 @@
                     <w:bottom w:val="single" w:sz="4" w:space="0" w:color="auto"/>
                     <w:right w:val="single" w:sz="4" w:space="0" w:color="auto"/>
                   </w:tcBorders>
-                  <w:shd w:val="clear" w:color="auto" w:fill="auto"/>
                   <w:noWrap/>
                   <w:vAlign w:val="bottom"/>
                   <w:hideMark/>
@@ -30203,7 +29617,6 @@
                     <w:bottom w:val="single" w:sz="4" w:space="0" w:color="auto"/>
                     <w:right w:val="single" w:sz="4" w:space="0" w:color="auto"/>
                   </w:tcBorders>
-                  <w:shd w:val="clear" w:color="auto" w:fill="auto"/>
                   <w:noWrap/>
                   <w:vAlign w:val="bottom"/>
                   <w:hideMark/>
@@ -30252,7 +29665,6 @@
                     <w:bottom w:val="single" w:sz="4" w:space="0" w:color="auto"/>
                     <w:right w:val="single" w:sz="4" w:space="0" w:color="auto"/>
                   </w:tcBorders>
-                  <w:shd w:val="clear" w:color="auto" w:fill="auto"/>
                   <w:noWrap/>
                   <w:vAlign w:val="bottom"/>
                   <w:hideMark/>
@@ -30290,7 +29702,6 @@
                     <w:bottom w:val="single" w:sz="4" w:space="0" w:color="auto"/>
                     <w:right w:val="single" w:sz="4" w:space="0" w:color="auto"/>
                   </w:tcBorders>
-                  <w:shd w:val="clear" w:color="auto" w:fill="auto"/>
                   <w:noWrap/>
                   <w:vAlign w:val="bottom"/>
                   <w:hideMark/>
@@ -30333,7 +29744,6 @@
                     <w:bottom w:val="single" w:sz="4" w:space="0" w:color="auto"/>
                     <w:right w:val="single" w:sz="4" w:space="0" w:color="auto"/>
                   </w:tcBorders>
-                  <w:shd w:val="clear" w:color="auto" w:fill="auto"/>
                   <w:noWrap/>
                   <w:vAlign w:val="bottom"/>
                   <w:hideMark/>
@@ -30371,7 +29781,6 @@
                     <w:bottom w:val="single" w:sz="4" w:space="0" w:color="auto"/>
                     <w:right w:val="single" w:sz="4" w:space="0" w:color="auto"/>
                   </w:tcBorders>
-                  <w:shd w:val="clear" w:color="auto" w:fill="auto"/>
                   <w:noWrap/>
                   <w:vAlign w:val="bottom"/>
                   <w:hideMark/>
@@ -30409,7 +29818,6 @@
                     <w:bottom w:val="single" w:sz="4" w:space="0" w:color="auto"/>
                     <w:right w:val="single" w:sz="4" w:space="0" w:color="auto"/>
                   </w:tcBorders>
-                  <w:shd w:val="clear" w:color="auto" w:fill="auto"/>
                   <w:noWrap/>
                   <w:vAlign w:val="bottom"/>
                   <w:hideMark/>
@@ -30447,7 +29855,6 @@
                     <w:bottom w:val="single" w:sz="4" w:space="0" w:color="auto"/>
                     <w:right w:val="single" w:sz="4" w:space="0" w:color="auto"/>
                   </w:tcBorders>
-                  <w:shd w:val="clear" w:color="auto" w:fill="auto"/>
                   <w:noWrap/>
                   <w:vAlign w:val="bottom"/>
                   <w:hideMark/>
@@ -30485,7 +29892,6 @@
                     <w:bottom w:val="single" w:sz="4" w:space="0" w:color="auto"/>
                     <w:right w:val="single" w:sz="4" w:space="0" w:color="auto"/>
                   </w:tcBorders>
-                  <w:shd w:val="clear" w:color="auto" w:fill="auto"/>
                   <w:noWrap/>
                   <w:vAlign w:val="bottom"/>
                   <w:hideMark/>
@@ -30523,7 +29929,6 @@
                     <w:bottom w:val="single" w:sz="4" w:space="0" w:color="auto"/>
                     <w:right w:val="single" w:sz="4" w:space="0" w:color="auto"/>
                   </w:tcBorders>
-                  <w:shd w:val="clear" w:color="auto" w:fill="auto"/>
                   <w:noWrap/>
                   <w:vAlign w:val="bottom"/>
                   <w:hideMark/>
@@ -30565,7 +29970,6 @@
                     <w:bottom w:val="single" w:sz="4" w:space="0" w:color="auto"/>
                     <w:right w:val="single" w:sz="4" w:space="0" w:color="auto"/>
                   </w:tcBorders>
-                  <w:shd w:val="clear" w:color="auto" w:fill="auto"/>
                   <w:noWrap/>
                   <w:vAlign w:val="bottom"/>
                   <w:hideMark/>
@@ -30602,7 +30006,6 @@
                     <w:bottom w:val="single" w:sz="4" w:space="0" w:color="auto"/>
                     <w:right w:val="single" w:sz="4" w:space="0" w:color="auto"/>
                   </w:tcBorders>
-                  <w:shd w:val="clear" w:color="auto" w:fill="auto"/>
                   <w:noWrap/>
                   <w:vAlign w:val="bottom"/>
                   <w:hideMark/>
@@ -30639,7 +30042,6 @@
                     <w:bottom w:val="single" w:sz="4" w:space="0" w:color="auto"/>
                     <w:right w:val="single" w:sz="4" w:space="0" w:color="auto"/>
                   </w:tcBorders>
-                  <w:shd w:val="clear" w:color="auto" w:fill="auto"/>
                   <w:noWrap/>
                   <w:vAlign w:val="bottom"/>
                   <w:hideMark/>
@@ -30676,7 +30078,6 @@
                     <w:bottom w:val="single" w:sz="4" w:space="0" w:color="auto"/>
                     <w:right w:val="single" w:sz="4" w:space="0" w:color="auto"/>
                   </w:tcBorders>
-                  <w:shd w:val="clear" w:color="auto" w:fill="auto"/>
                   <w:noWrap/>
                   <w:vAlign w:val="bottom"/>
                   <w:hideMark/>
@@ -30713,7 +30114,6 @@
                     <w:bottom w:val="single" w:sz="4" w:space="0" w:color="auto"/>
                     <w:right w:val="single" w:sz="4" w:space="0" w:color="auto"/>
                   </w:tcBorders>
-                  <w:shd w:val="clear" w:color="auto" w:fill="auto"/>
                   <w:noWrap/>
                   <w:vAlign w:val="bottom"/>
                   <w:hideMark/>
@@ -30750,7 +30150,6 @@
                     <w:bottom w:val="single" w:sz="4" w:space="0" w:color="auto"/>
                     <w:right w:val="single" w:sz="4" w:space="0" w:color="auto"/>
                   </w:tcBorders>
-                  <w:shd w:val="clear" w:color="auto" w:fill="auto"/>
                   <w:noWrap/>
                   <w:vAlign w:val="bottom"/>
                   <w:hideMark/>
@@ -30787,7 +30186,6 @@
                     <w:bottom w:val="single" w:sz="4" w:space="0" w:color="auto"/>
                     <w:right w:val="single" w:sz="4" w:space="0" w:color="auto"/>
                   </w:tcBorders>
-                  <w:shd w:val="clear" w:color="auto" w:fill="auto"/>
                   <w:noWrap/>
                   <w:vAlign w:val="bottom"/>
                   <w:hideMark/>
@@ -30824,7 +30222,6 @@
                     <w:bottom w:val="single" w:sz="4" w:space="0" w:color="auto"/>
                     <w:right w:val="single" w:sz="4" w:space="0" w:color="auto"/>
                   </w:tcBorders>
-                  <w:shd w:val="clear" w:color="auto" w:fill="auto"/>
                   <w:noWrap/>
                   <w:vAlign w:val="bottom"/>
                   <w:hideMark/>
@@ -30861,7 +30258,6 @@
                     <w:bottom w:val="single" w:sz="4" w:space="0" w:color="auto"/>
                     <w:right w:val="single" w:sz="4" w:space="0" w:color="auto"/>
                   </w:tcBorders>
-                  <w:shd w:val="clear" w:color="auto" w:fill="auto"/>
                   <w:noWrap/>
                   <w:vAlign w:val="bottom"/>
                   <w:hideMark/>
@@ -30898,7 +30294,6 @@
                     <w:bottom w:val="single" w:sz="4" w:space="0" w:color="auto"/>
                     <w:right w:val="single" w:sz="4" w:space="0" w:color="auto"/>
                   </w:tcBorders>
-                  <w:shd w:val="clear" w:color="auto" w:fill="auto"/>
                   <w:noWrap/>
                   <w:vAlign w:val="bottom"/>
                   <w:hideMark/>
@@ -30935,7 +30330,6 @@
                     <w:bottom w:val="single" w:sz="4" w:space="0" w:color="auto"/>
                     <w:right w:val="single" w:sz="4" w:space="0" w:color="auto"/>
                   </w:tcBorders>
-                  <w:shd w:val="clear" w:color="auto" w:fill="auto"/>
                   <w:noWrap/>
                   <w:vAlign w:val="bottom"/>
                   <w:hideMark/>
@@ -30972,7 +30366,6 @@
                     <w:bottom w:val="single" w:sz="4" w:space="0" w:color="auto"/>
                     <w:right w:val="single" w:sz="4" w:space="0" w:color="auto"/>
                   </w:tcBorders>
-                  <w:shd w:val="clear" w:color="auto" w:fill="auto"/>
                   <w:noWrap/>
                   <w:vAlign w:val="bottom"/>
                   <w:hideMark/>
@@ -31014,7 +30407,6 @@
                     <w:bottom w:val="single" w:sz="4" w:space="0" w:color="auto"/>
                     <w:right w:val="single" w:sz="4" w:space="0" w:color="auto"/>
                   </w:tcBorders>
-                  <w:shd w:val="clear" w:color="auto" w:fill="auto"/>
                   <w:noWrap/>
                   <w:vAlign w:val="bottom"/>
                   <w:hideMark/>
@@ -31051,7 +30443,6 @@
                     <w:bottom w:val="single" w:sz="4" w:space="0" w:color="auto"/>
                     <w:right w:val="single" w:sz="4" w:space="0" w:color="auto"/>
                   </w:tcBorders>
-                  <w:shd w:val="clear" w:color="auto" w:fill="auto"/>
                   <w:noWrap/>
                   <w:vAlign w:val="bottom"/>
                   <w:hideMark/>
@@ -31088,7 +30479,6 @@
                     <w:bottom w:val="single" w:sz="4" w:space="0" w:color="auto"/>
                     <w:right w:val="single" w:sz="4" w:space="0" w:color="auto"/>
                   </w:tcBorders>
-                  <w:shd w:val="clear" w:color="auto" w:fill="auto"/>
                   <w:noWrap/>
                   <w:vAlign w:val="bottom"/>
                   <w:hideMark/>
@@ -31125,7 +30515,6 @@
                     <w:bottom w:val="single" w:sz="4" w:space="0" w:color="auto"/>
                     <w:right w:val="single" w:sz="4" w:space="0" w:color="auto"/>
                   </w:tcBorders>
-                  <w:shd w:val="clear" w:color="auto" w:fill="auto"/>
                   <w:noWrap/>
                   <w:vAlign w:val="bottom"/>
                   <w:hideMark/>
@@ -31162,7 +30551,6 @@
                     <w:bottom w:val="single" w:sz="4" w:space="0" w:color="auto"/>
                     <w:right w:val="single" w:sz="4" w:space="0" w:color="auto"/>
                   </w:tcBorders>
-                  <w:shd w:val="clear" w:color="auto" w:fill="auto"/>
                   <w:noWrap/>
                   <w:vAlign w:val="bottom"/>
                   <w:hideMark/>
@@ -31199,7 +30587,6 @@
                     <w:bottom w:val="single" w:sz="4" w:space="0" w:color="auto"/>
                     <w:right w:val="single" w:sz="4" w:space="0" w:color="auto"/>
                   </w:tcBorders>
-                  <w:shd w:val="clear" w:color="auto" w:fill="auto"/>
                   <w:noWrap/>
                   <w:vAlign w:val="bottom"/>
                   <w:hideMark/>
@@ -31236,7 +30623,6 @@
                     <w:bottom w:val="single" w:sz="4" w:space="0" w:color="auto"/>
                     <w:right w:val="single" w:sz="4" w:space="0" w:color="auto"/>
                   </w:tcBorders>
-                  <w:shd w:val="clear" w:color="auto" w:fill="auto"/>
                   <w:noWrap/>
                   <w:vAlign w:val="bottom"/>
                   <w:hideMark/>
@@ -31273,7 +30659,6 @@
                     <w:bottom w:val="single" w:sz="4" w:space="0" w:color="auto"/>
                     <w:right w:val="single" w:sz="4" w:space="0" w:color="auto"/>
                   </w:tcBorders>
-                  <w:shd w:val="clear" w:color="auto" w:fill="auto"/>
                   <w:noWrap/>
                   <w:vAlign w:val="bottom"/>
                   <w:hideMark/>
@@ -31310,7 +30695,6 @@
                     <w:bottom w:val="single" w:sz="4" w:space="0" w:color="auto"/>
                     <w:right w:val="single" w:sz="4" w:space="0" w:color="auto"/>
                   </w:tcBorders>
-                  <w:shd w:val="clear" w:color="auto" w:fill="auto"/>
                   <w:noWrap/>
                   <w:vAlign w:val="bottom"/>
                   <w:hideMark/>
@@ -31347,7 +30731,6 @@
                     <w:bottom w:val="single" w:sz="4" w:space="0" w:color="auto"/>
                     <w:right w:val="single" w:sz="4" w:space="0" w:color="auto"/>
                   </w:tcBorders>
-                  <w:shd w:val="clear" w:color="auto" w:fill="auto"/>
                   <w:noWrap/>
                   <w:vAlign w:val="bottom"/>
                   <w:hideMark/>
@@ -31384,7 +30767,6 @@
                     <w:bottom w:val="single" w:sz="4" w:space="0" w:color="auto"/>
                     <w:right w:val="single" w:sz="4" w:space="0" w:color="auto"/>
                   </w:tcBorders>
-                  <w:shd w:val="clear" w:color="auto" w:fill="auto"/>
                   <w:noWrap/>
                   <w:vAlign w:val="bottom"/>
                   <w:hideMark/>
@@ -31421,7 +30803,6 @@
                     <w:bottom w:val="single" w:sz="4" w:space="0" w:color="auto"/>
                     <w:right w:val="single" w:sz="4" w:space="0" w:color="auto"/>
                   </w:tcBorders>
-                  <w:shd w:val="clear" w:color="auto" w:fill="auto"/>
                   <w:noWrap/>
                   <w:vAlign w:val="bottom"/>
                   <w:hideMark/>
@@ -31548,7 +30929,6 @@
                     <w:bottom w:val="single" w:sz="4" w:space="0" w:color="auto"/>
                     <w:right w:val="single" w:sz="4" w:space="0" w:color="auto"/>
                   </w:tcBorders>
-                  <w:shd w:val="clear" w:color="auto" w:fill="auto"/>
                   <w:noWrap/>
                   <w:vAlign w:val="bottom"/>
                   <w:hideMark/>
@@ -31602,7 +30982,6 @@
                     <w:bottom w:val="single" w:sz="4" w:space="0" w:color="auto"/>
                     <w:right w:val="single" w:sz="4" w:space="0" w:color="auto"/>
                   </w:tcBorders>
-                  <w:shd w:val="clear" w:color="auto" w:fill="auto"/>
                   <w:noWrap/>
                   <w:vAlign w:val="bottom"/>
                   <w:hideMark/>
@@ -31640,7 +31019,6 @@
                     <w:bottom w:val="single" w:sz="4" w:space="0" w:color="auto"/>
                     <w:right w:val="single" w:sz="4" w:space="0" w:color="auto"/>
                   </w:tcBorders>
-                  <w:shd w:val="clear" w:color="auto" w:fill="auto"/>
                   <w:noWrap/>
                   <w:vAlign w:val="bottom"/>
                   <w:hideMark/>
@@ -31678,7 +31056,6 @@
                     <w:bottom w:val="single" w:sz="4" w:space="0" w:color="auto"/>
                     <w:right w:val="single" w:sz="4" w:space="0" w:color="auto"/>
                   </w:tcBorders>
-                  <w:shd w:val="clear" w:color="auto" w:fill="auto"/>
                   <w:noWrap/>
                   <w:vAlign w:val="bottom"/>
                   <w:hideMark/>
@@ -31716,7 +31093,6 @@
                     <w:bottom w:val="single" w:sz="4" w:space="0" w:color="auto"/>
                     <w:right w:val="single" w:sz="4" w:space="0" w:color="auto"/>
                   </w:tcBorders>
-                  <w:shd w:val="clear" w:color="auto" w:fill="auto"/>
                   <w:noWrap/>
                   <w:vAlign w:val="bottom"/>
                   <w:hideMark/>
@@ -31758,7 +31134,6 @@
                     <w:bottom w:val="single" w:sz="4" w:space="0" w:color="auto"/>
                     <w:right w:val="single" w:sz="4" w:space="0" w:color="auto"/>
                   </w:tcBorders>
-                  <w:shd w:val="clear" w:color="auto" w:fill="auto"/>
                   <w:noWrap/>
                   <w:vAlign w:val="bottom"/>
                   <w:hideMark/>
@@ -31795,7 +31170,6 @@
                     <w:bottom w:val="single" w:sz="4" w:space="0" w:color="auto"/>
                     <w:right w:val="single" w:sz="4" w:space="0" w:color="auto"/>
                   </w:tcBorders>
-                  <w:shd w:val="clear" w:color="auto" w:fill="auto"/>
                   <w:noWrap/>
                   <w:vAlign w:val="bottom"/>
                   <w:hideMark/>
@@ -31832,7 +31206,6 @@
                     <w:bottom w:val="single" w:sz="4" w:space="0" w:color="auto"/>
                     <w:right w:val="single" w:sz="4" w:space="0" w:color="auto"/>
                   </w:tcBorders>
-                  <w:shd w:val="clear" w:color="auto" w:fill="auto"/>
                   <w:noWrap/>
                   <w:vAlign w:val="bottom"/>
                   <w:hideMark/>
@@ -31869,7 +31242,6 @@
                     <w:bottom w:val="single" w:sz="4" w:space="0" w:color="auto"/>
                     <w:right w:val="single" w:sz="4" w:space="0" w:color="auto"/>
                   </w:tcBorders>
-                  <w:shd w:val="clear" w:color="auto" w:fill="auto"/>
                   <w:noWrap/>
                   <w:vAlign w:val="bottom"/>
                   <w:hideMark/>
@@ -31906,7 +31278,6 @@
                     <w:bottom w:val="single" w:sz="4" w:space="0" w:color="auto"/>
                     <w:right w:val="single" w:sz="4" w:space="0" w:color="auto"/>
                   </w:tcBorders>
-                  <w:shd w:val="clear" w:color="auto" w:fill="auto"/>
                   <w:noWrap/>
                   <w:vAlign w:val="bottom"/>
                   <w:hideMark/>
@@ -31943,7 +31314,6 @@
                     <w:bottom w:val="single" w:sz="4" w:space="0" w:color="auto"/>
                     <w:right w:val="single" w:sz="4" w:space="0" w:color="auto"/>
                   </w:tcBorders>
-                  <w:shd w:val="clear" w:color="auto" w:fill="auto"/>
                   <w:noWrap/>
                   <w:vAlign w:val="bottom"/>
                   <w:hideMark/>
@@ -31980,7 +31350,6 @@
                     <w:bottom w:val="single" w:sz="4" w:space="0" w:color="auto"/>
                     <w:right w:val="single" w:sz="4" w:space="0" w:color="auto"/>
                   </w:tcBorders>
-                  <w:shd w:val="clear" w:color="auto" w:fill="auto"/>
                   <w:noWrap/>
                   <w:vAlign w:val="bottom"/>
                   <w:hideMark/>
@@ -32017,7 +31386,6 @@
                     <w:bottom w:val="single" w:sz="4" w:space="0" w:color="auto"/>
                     <w:right w:val="single" w:sz="4" w:space="0" w:color="auto"/>
                   </w:tcBorders>
-                  <w:shd w:val="clear" w:color="auto" w:fill="auto"/>
                   <w:noWrap/>
                   <w:vAlign w:val="bottom"/>
                   <w:hideMark/>
@@ -32059,7 +31427,6 @@
                     <w:bottom w:val="single" w:sz="4" w:space="0" w:color="auto"/>
                     <w:right w:val="single" w:sz="4" w:space="0" w:color="auto"/>
                   </w:tcBorders>
-                  <w:shd w:val="clear" w:color="auto" w:fill="auto"/>
                   <w:noWrap/>
                   <w:vAlign w:val="bottom"/>
                   <w:hideMark/>
@@ -32096,7 +31463,6 @@
                     <w:bottom w:val="single" w:sz="4" w:space="0" w:color="auto"/>
                     <w:right w:val="single" w:sz="4" w:space="0" w:color="auto"/>
                   </w:tcBorders>
-                  <w:shd w:val="clear" w:color="auto" w:fill="auto"/>
                   <w:noWrap/>
                   <w:vAlign w:val="bottom"/>
                   <w:hideMark/>
@@ -32133,7 +31499,6 @@
                     <w:bottom w:val="single" w:sz="4" w:space="0" w:color="auto"/>
                     <w:right w:val="single" w:sz="4" w:space="0" w:color="auto"/>
                   </w:tcBorders>
-                  <w:shd w:val="clear" w:color="auto" w:fill="auto"/>
                   <w:noWrap/>
                   <w:vAlign w:val="bottom"/>
                   <w:hideMark/>
@@ -32170,7 +31535,6 @@
                     <w:bottom w:val="single" w:sz="4" w:space="0" w:color="auto"/>
                     <w:right w:val="single" w:sz="4" w:space="0" w:color="auto"/>
                   </w:tcBorders>
-                  <w:shd w:val="clear" w:color="auto" w:fill="auto"/>
                   <w:noWrap/>
                   <w:vAlign w:val="bottom"/>
                   <w:hideMark/>
@@ -32207,7 +31571,6 @@
                     <w:bottom w:val="single" w:sz="4" w:space="0" w:color="auto"/>
                     <w:right w:val="single" w:sz="4" w:space="0" w:color="auto"/>
                   </w:tcBorders>
-                  <w:shd w:val="clear" w:color="auto" w:fill="auto"/>
                   <w:noWrap/>
                   <w:vAlign w:val="bottom"/>
                   <w:hideMark/>
@@ -32244,7 +31607,6 @@
                     <w:bottom w:val="single" w:sz="4" w:space="0" w:color="auto"/>
                     <w:right w:val="single" w:sz="4" w:space="0" w:color="auto"/>
                   </w:tcBorders>
-                  <w:shd w:val="clear" w:color="auto" w:fill="auto"/>
                   <w:noWrap/>
                   <w:vAlign w:val="bottom"/>
                   <w:hideMark/>
@@ -32281,7 +31643,6 @@
                     <w:bottom w:val="single" w:sz="4" w:space="0" w:color="auto"/>
                     <w:right w:val="single" w:sz="4" w:space="0" w:color="auto"/>
                   </w:tcBorders>
-                  <w:shd w:val="clear" w:color="auto" w:fill="auto"/>
                   <w:noWrap/>
                   <w:vAlign w:val="bottom"/>
                   <w:hideMark/>
@@ -32318,7 +31679,6 @@
                     <w:bottom w:val="single" w:sz="4" w:space="0" w:color="auto"/>
                     <w:right w:val="single" w:sz="4" w:space="0" w:color="auto"/>
                   </w:tcBorders>
-                  <w:shd w:val="clear" w:color="auto" w:fill="auto"/>
                   <w:noWrap/>
                   <w:vAlign w:val="bottom"/>
                   <w:hideMark/>
@@ -32425,7 +31785,6 @@
                     <w:bottom w:val="single" w:sz="4" w:space="0" w:color="auto"/>
                     <w:right w:val="single" w:sz="4" w:space="0" w:color="auto"/>
                   </w:tcBorders>
-                  <w:shd w:val="clear" w:color="auto" w:fill="auto"/>
                   <w:noWrap/>
                   <w:vAlign w:val="bottom"/>
                   <w:hideMark/>
@@ -32468,7 +31827,6 @@
                     <w:bottom w:val="single" w:sz="4" w:space="0" w:color="auto"/>
                     <w:right w:val="single" w:sz="4" w:space="0" w:color="auto"/>
                   </w:tcBorders>
-                  <w:shd w:val="clear" w:color="auto" w:fill="auto"/>
                   <w:noWrap/>
                   <w:vAlign w:val="bottom"/>
                   <w:hideMark/>
@@ -32506,7 +31864,6 @@
                     <w:bottom w:val="single" w:sz="4" w:space="0" w:color="auto"/>
                     <w:right w:val="single" w:sz="4" w:space="0" w:color="auto"/>
                   </w:tcBorders>
-                  <w:shd w:val="clear" w:color="auto" w:fill="auto"/>
                   <w:noWrap/>
                   <w:vAlign w:val="bottom"/>
                   <w:hideMark/>
@@ -32544,7 +31901,6 @@
                     <w:bottom w:val="single" w:sz="4" w:space="0" w:color="auto"/>
                     <w:right w:val="single" w:sz="4" w:space="0" w:color="auto"/>
                   </w:tcBorders>
-                  <w:shd w:val="clear" w:color="auto" w:fill="auto"/>
                   <w:noWrap/>
                   <w:vAlign w:val="bottom"/>
                   <w:hideMark/>
@@ -32582,7 +31938,6 @@
                     <w:bottom w:val="single" w:sz="4" w:space="0" w:color="auto"/>
                     <w:right w:val="single" w:sz="4" w:space="0" w:color="auto"/>
                   </w:tcBorders>
-                  <w:shd w:val="clear" w:color="auto" w:fill="auto"/>
                   <w:noWrap/>
                   <w:vAlign w:val="bottom"/>
                   <w:hideMark/>
@@ -32624,7 +31979,6 @@
                     <w:bottom w:val="single" w:sz="4" w:space="0" w:color="auto"/>
                     <w:right w:val="single" w:sz="4" w:space="0" w:color="auto"/>
                   </w:tcBorders>
-                  <w:shd w:val="clear" w:color="auto" w:fill="auto"/>
                   <w:noWrap/>
                   <w:vAlign w:val="bottom"/>
                   <w:hideMark/>
@@ -32661,7 +32015,6 @@
                     <w:bottom w:val="single" w:sz="4" w:space="0" w:color="auto"/>
                     <w:right w:val="single" w:sz="4" w:space="0" w:color="auto"/>
                   </w:tcBorders>
-                  <w:shd w:val="clear" w:color="auto" w:fill="auto"/>
                   <w:noWrap/>
                   <w:vAlign w:val="bottom"/>
                   <w:hideMark/>
@@ -32698,7 +32051,6 @@
                     <w:bottom w:val="single" w:sz="4" w:space="0" w:color="auto"/>
                     <w:right w:val="single" w:sz="4" w:space="0" w:color="auto"/>
                   </w:tcBorders>
-                  <w:shd w:val="clear" w:color="auto" w:fill="auto"/>
                   <w:noWrap/>
                   <w:vAlign w:val="bottom"/>
                   <w:hideMark/>
@@ -32735,7 +32087,6 @@
                     <w:bottom w:val="single" w:sz="4" w:space="0" w:color="auto"/>
                     <w:right w:val="single" w:sz="4" w:space="0" w:color="auto"/>
                   </w:tcBorders>
-                  <w:shd w:val="clear" w:color="auto" w:fill="auto"/>
                   <w:noWrap/>
                   <w:vAlign w:val="bottom"/>
                   <w:hideMark/>
@@ -32772,7 +32123,6 @@
                     <w:bottom w:val="single" w:sz="4" w:space="0" w:color="auto"/>
                     <w:right w:val="single" w:sz="4" w:space="0" w:color="auto"/>
                   </w:tcBorders>
-                  <w:shd w:val="clear" w:color="auto" w:fill="auto"/>
                   <w:noWrap/>
                   <w:vAlign w:val="bottom"/>
                   <w:hideMark/>
@@ -32809,7 +32159,6 @@
                     <w:bottom w:val="single" w:sz="4" w:space="0" w:color="auto"/>
                     <w:right w:val="single" w:sz="4" w:space="0" w:color="auto"/>
                   </w:tcBorders>
-                  <w:shd w:val="clear" w:color="auto" w:fill="auto"/>
                   <w:noWrap/>
                   <w:vAlign w:val="bottom"/>
                   <w:hideMark/>
@@ -32846,7 +32195,6 @@
                     <w:bottom w:val="single" w:sz="4" w:space="0" w:color="auto"/>
                     <w:right w:val="single" w:sz="4" w:space="0" w:color="auto"/>
                   </w:tcBorders>
-                  <w:shd w:val="clear" w:color="auto" w:fill="auto"/>
                   <w:noWrap/>
                   <w:vAlign w:val="bottom"/>
                   <w:hideMark/>
@@ -32883,7 +32231,6 @@
                     <w:bottom w:val="single" w:sz="4" w:space="0" w:color="auto"/>
                     <w:right w:val="single" w:sz="4" w:space="0" w:color="auto"/>
                   </w:tcBorders>
-                  <w:shd w:val="clear" w:color="auto" w:fill="auto"/>
                   <w:noWrap/>
                   <w:vAlign w:val="bottom"/>
                   <w:hideMark/>
@@ -32925,7 +32272,6 @@
                     <w:bottom w:val="single" w:sz="4" w:space="0" w:color="auto"/>
                     <w:right w:val="single" w:sz="4" w:space="0" w:color="auto"/>
                   </w:tcBorders>
-                  <w:shd w:val="clear" w:color="auto" w:fill="auto"/>
                   <w:noWrap/>
                   <w:vAlign w:val="bottom"/>
                   <w:hideMark/>
@@ -32962,7 +32308,6 @@
                     <w:bottom w:val="single" w:sz="4" w:space="0" w:color="auto"/>
                     <w:right w:val="single" w:sz="4" w:space="0" w:color="auto"/>
                   </w:tcBorders>
-                  <w:shd w:val="clear" w:color="auto" w:fill="auto"/>
                   <w:noWrap/>
                   <w:vAlign w:val="bottom"/>
                   <w:hideMark/>
@@ -32999,7 +32344,6 @@
                     <w:bottom w:val="single" w:sz="4" w:space="0" w:color="auto"/>
                     <w:right w:val="single" w:sz="4" w:space="0" w:color="auto"/>
                   </w:tcBorders>
-                  <w:shd w:val="clear" w:color="auto" w:fill="auto"/>
                   <w:noWrap/>
                   <w:vAlign w:val="bottom"/>
                   <w:hideMark/>
@@ -33036,7 +32380,6 @@
                     <w:bottom w:val="single" w:sz="4" w:space="0" w:color="auto"/>
                     <w:right w:val="single" w:sz="4" w:space="0" w:color="auto"/>
                   </w:tcBorders>
-                  <w:shd w:val="clear" w:color="auto" w:fill="auto"/>
                   <w:noWrap/>
                   <w:vAlign w:val="bottom"/>
                   <w:hideMark/>
@@ -33073,7 +32416,6 @@
                     <w:bottom w:val="single" w:sz="4" w:space="0" w:color="auto"/>
                     <w:right w:val="single" w:sz="4" w:space="0" w:color="auto"/>
                   </w:tcBorders>
-                  <w:shd w:val="clear" w:color="auto" w:fill="auto"/>
                   <w:noWrap/>
                   <w:vAlign w:val="bottom"/>
                   <w:hideMark/>
@@ -33110,7 +32452,6 @@
                     <w:bottom w:val="single" w:sz="4" w:space="0" w:color="auto"/>
                     <w:right w:val="single" w:sz="4" w:space="0" w:color="auto"/>
                   </w:tcBorders>
-                  <w:shd w:val="clear" w:color="auto" w:fill="auto"/>
                   <w:noWrap/>
                   <w:vAlign w:val="bottom"/>
                   <w:hideMark/>
@@ -33147,7 +32488,6 @@
                     <w:bottom w:val="single" w:sz="4" w:space="0" w:color="auto"/>
                     <w:right w:val="single" w:sz="4" w:space="0" w:color="auto"/>
                   </w:tcBorders>
-                  <w:shd w:val="clear" w:color="auto" w:fill="auto"/>
                   <w:noWrap/>
                   <w:vAlign w:val="bottom"/>
                   <w:hideMark/>
@@ -33184,7 +32524,6 @@
                     <w:bottom w:val="single" w:sz="4" w:space="0" w:color="auto"/>
                     <w:right w:val="single" w:sz="4" w:space="0" w:color="auto"/>
                   </w:tcBorders>
-                  <w:shd w:val="clear" w:color="auto" w:fill="auto"/>
                   <w:noWrap/>
                   <w:vAlign w:val="bottom"/>
                   <w:hideMark/>
@@ -33290,7 +32629,6 @@
                     <w:bottom w:val="single" w:sz="4" w:space="0" w:color="auto"/>
                     <w:right w:val="single" w:sz="4" w:space="0" w:color="auto"/>
                   </w:tcBorders>
-                  <w:shd w:val="clear" w:color="auto" w:fill="auto"/>
                   <w:noWrap/>
                   <w:vAlign w:val="bottom"/>
                   <w:hideMark/>
@@ -33333,7 +32671,6 @@
                     <w:bottom w:val="single" w:sz="4" w:space="0" w:color="auto"/>
                     <w:right w:val="single" w:sz="4" w:space="0" w:color="auto"/>
                   </w:tcBorders>
-                  <w:shd w:val="clear" w:color="auto" w:fill="auto"/>
                   <w:noWrap/>
                   <w:vAlign w:val="bottom"/>
                   <w:hideMark/>
@@ -33371,7 +32708,6 @@
                     <w:bottom w:val="single" w:sz="4" w:space="0" w:color="auto"/>
                     <w:right w:val="single" w:sz="4" w:space="0" w:color="auto"/>
                   </w:tcBorders>
-                  <w:shd w:val="clear" w:color="auto" w:fill="auto"/>
                   <w:noWrap/>
                   <w:vAlign w:val="bottom"/>
                   <w:hideMark/>
@@ -33409,7 +32745,6 @@
                     <w:bottom w:val="single" w:sz="4" w:space="0" w:color="auto"/>
                     <w:right w:val="single" w:sz="4" w:space="0" w:color="auto"/>
                   </w:tcBorders>
-                  <w:shd w:val="clear" w:color="auto" w:fill="auto"/>
                   <w:noWrap/>
                   <w:vAlign w:val="bottom"/>
                   <w:hideMark/>
@@ -33447,7 +32782,6 @@
                     <w:bottom w:val="single" w:sz="4" w:space="0" w:color="auto"/>
                     <w:right w:val="single" w:sz="4" w:space="0" w:color="auto"/>
                   </w:tcBorders>
-                  <w:shd w:val="clear" w:color="auto" w:fill="auto"/>
                   <w:noWrap/>
                   <w:vAlign w:val="bottom"/>
                   <w:hideMark/>
@@ -33489,7 +32823,6 @@
                     <w:bottom w:val="single" w:sz="4" w:space="0" w:color="auto"/>
                     <w:right w:val="single" w:sz="4" w:space="0" w:color="auto"/>
                   </w:tcBorders>
-                  <w:shd w:val="clear" w:color="auto" w:fill="auto"/>
                   <w:noWrap/>
                   <w:vAlign w:val="bottom"/>
                   <w:hideMark/>
@@ -33526,7 +32859,6 @@
                     <w:bottom w:val="single" w:sz="4" w:space="0" w:color="auto"/>
                     <w:right w:val="single" w:sz="4" w:space="0" w:color="auto"/>
                   </w:tcBorders>
-                  <w:shd w:val="clear" w:color="auto" w:fill="auto"/>
                   <w:noWrap/>
                   <w:vAlign w:val="bottom"/>
                   <w:hideMark/>
@@ -33563,7 +32895,6 @@
                     <w:bottom w:val="single" w:sz="4" w:space="0" w:color="auto"/>
                     <w:right w:val="single" w:sz="4" w:space="0" w:color="auto"/>
                   </w:tcBorders>
-                  <w:shd w:val="clear" w:color="auto" w:fill="auto"/>
                   <w:noWrap/>
                   <w:vAlign w:val="bottom"/>
                   <w:hideMark/>
@@ -33600,7 +32931,6 @@
                     <w:bottom w:val="single" w:sz="4" w:space="0" w:color="auto"/>
                     <w:right w:val="single" w:sz="4" w:space="0" w:color="auto"/>
                   </w:tcBorders>
-                  <w:shd w:val="clear" w:color="auto" w:fill="auto"/>
                   <w:noWrap/>
                   <w:vAlign w:val="bottom"/>
                   <w:hideMark/>
@@ -33637,7 +32967,6 @@
                     <w:bottom w:val="single" w:sz="4" w:space="0" w:color="auto"/>
                     <w:right w:val="single" w:sz="4" w:space="0" w:color="auto"/>
                   </w:tcBorders>
-                  <w:shd w:val="clear" w:color="auto" w:fill="auto"/>
                   <w:noWrap/>
                   <w:vAlign w:val="bottom"/>
                   <w:hideMark/>
@@ -33674,7 +33003,6 @@
                     <w:bottom w:val="single" w:sz="4" w:space="0" w:color="auto"/>
                     <w:right w:val="single" w:sz="4" w:space="0" w:color="auto"/>
                   </w:tcBorders>
-                  <w:shd w:val="clear" w:color="auto" w:fill="auto"/>
                   <w:noWrap/>
                   <w:vAlign w:val="bottom"/>
                   <w:hideMark/>
@@ -33711,7 +33039,6 @@
                     <w:bottom w:val="single" w:sz="4" w:space="0" w:color="auto"/>
                     <w:right w:val="single" w:sz="4" w:space="0" w:color="auto"/>
                   </w:tcBorders>
-                  <w:shd w:val="clear" w:color="auto" w:fill="auto"/>
                   <w:noWrap/>
                   <w:vAlign w:val="bottom"/>
                   <w:hideMark/>
@@ -33748,7 +33075,6 @@
                     <w:bottom w:val="single" w:sz="4" w:space="0" w:color="auto"/>
                     <w:right w:val="single" w:sz="4" w:space="0" w:color="auto"/>
                   </w:tcBorders>
-                  <w:shd w:val="clear" w:color="auto" w:fill="auto"/>
                   <w:noWrap/>
                   <w:vAlign w:val="bottom"/>
                   <w:hideMark/>
@@ -33790,7 +33116,6 @@
                     <w:bottom w:val="single" w:sz="4" w:space="0" w:color="auto"/>
                     <w:right w:val="single" w:sz="4" w:space="0" w:color="auto"/>
                   </w:tcBorders>
-                  <w:shd w:val="clear" w:color="auto" w:fill="auto"/>
                   <w:noWrap/>
                   <w:vAlign w:val="bottom"/>
                   <w:hideMark/>
@@ -33827,7 +33152,6 @@
                     <w:bottom w:val="single" w:sz="4" w:space="0" w:color="auto"/>
                     <w:right w:val="single" w:sz="4" w:space="0" w:color="auto"/>
                   </w:tcBorders>
-                  <w:shd w:val="clear" w:color="auto" w:fill="auto"/>
                   <w:noWrap/>
                   <w:vAlign w:val="bottom"/>
                   <w:hideMark/>
@@ -33864,7 +33188,6 @@
                     <w:bottom w:val="single" w:sz="4" w:space="0" w:color="auto"/>
                     <w:right w:val="single" w:sz="4" w:space="0" w:color="auto"/>
                   </w:tcBorders>
-                  <w:shd w:val="clear" w:color="auto" w:fill="auto"/>
                   <w:noWrap/>
                   <w:vAlign w:val="bottom"/>
                   <w:hideMark/>
@@ -33901,7 +33224,6 @@
                     <w:bottom w:val="single" w:sz="4" w:space="0" w:color="auto"/>
                     <w:right w:val="single" w:sz="4" w:space="0" w:color="auto"/>
                   </w:tcBorders>
-                  <w:shd w:val="clear" w:color="auto" w:fill="auto"/>
                   <w:noWrap/>
                   <w:vAlign w:val="bottom"/>
                   <w:hideMark/>
@@ -33938,7 +33260,6 @@
                     <w:bottom w:val="single" w:sz="4" w:space="0" w:color="auto"/>
                     <w:right w:val="single" w:sz="4" w:space="0" w:color="auto"/>
                   </w:tcBorders>
-                  <w:shd w:val="clear" w:color="auto" w:fill="auto"/>
                   <w:noWrap/>
                   <w:vAlign w:val="bottom"/>
                   <w:hideMark/>
@@ -33975,7 +33296,6 @@
                     <w:bottom w:val="single" w:sz="4" w:space="0" w:color="auto"/>
                     <w:right w:val="single" w:sz="4" w:space="0" w:color="auto"/>
                   </w:tcBorders>
-                  <w:shd w:val="clear" w:color="auto" w:fill="auto"/>
                   <w:noWrap/>
                   <w:vAlign w:val="bottom"/>
                   <w:hideMark/>
@@ -34012,7 +33332,6 @@
                     <w:bottom w:val="single" w:sz="4" w:space="0" w:color="auto"/>
                     <w:right w:val="single" w:sz="4" w:space="0" w:color="auto"/>
                   </w:tcBorders>
-                  <w:shd w:val="clear" w:color="auto" w:fill="auto"/>
                   <w:noWrap/>
                   <w:vAlign w:val="bottom"/>
                   <w:hideMark/>
@@ -34049,7 +33368,6 @@
                     <w:bottom w:val="single" w:sz="4" w:space="0" w:color="auto"/>
                     <w:right w:val="single" w:sz="4" w:space="0" w:color="auto"/>
                   </w:tcBorders>
-                  <w:shd w:val="clear" w:color="auto" w:fill="auto"/>
                   <w:noWrap/>
                   <w:vAlign w:val="bottom"/>
                   <w:hideMark/>
@@ -34218,7 +33536,6 @@
         <w:docPartUnique/>
       </w:docPartObj>
     </w:sdtPr>
-    <w:sdtEndPr/>
     <w:sdtContent>
       <w:p>
         <w:pPr>

</xml_diff>